<commit_message>
Update CEO overview with embedded screenshots
Replaced placeholder callout boxes with 8 actual page screenshots captured
from the live mockups (clients grid/list, services top/overview/bottom,
kanban board, analytics top/bottom).

Co-Authored-By: Claude Opus 4.6 <noreply@anthropic.com>
</commit_message>
<xml_diff>
--- a/ProjectFlow-Executive-Overview.docx
+++ b/ProjectFlow-Executive-Overview.docx
@@ -162,7 +162,7 @@
               </w:rPr>
               <w:t xml:space="preserve">Clients Layer: </w:t>
             </w:r>
-            <w:hyperlink w:history="1" r:id="rIdujvewadauzl5cqrrk-2ui">
+            <w:hyperlink w:history="1" r:id="rIdrf3l9mrjjx3cacpurklws">
               <w:r>
                 <w:rPr>
                   <w:rStyle w:val="Hyperlink"/>
@@ -188,7 +188,7 @@
               </w:rPr>
               <w:t xml:space="preserve">Services Layer: </w:t>
             </w:r>
-            <w:hyperlink w:history="1" r:id="rIdz17qbnenf1o8jp6e8cttd">
+            <w:hyperlink w:history="1" r:id="rId_uszysietfkfqyiwr1rf0">
               <w:r>
                 <w:rPr>
                   <w:rStyle w:val="Hyperlink"/>
@@ -214,7 +214,7 @@
               </w:rPr>
               <w:t xml:space="preserve">Kanban Layer: </w:t>
             </w:r>
-            <w:hyperlink w:history="1" r:id="rIdz9xwxa7s05t85mkzuja0d">
+            <w:hyperlink w:history="1" r:id="rIdatig10thdk2ry3dc9-hfi">
               <w:r>
                 <w:rPr>
                   <w:rStyle w:val="Hyperlink"/>
@@ -237,7 +237,7 @@
               </w:rPr>
               <w:t xml:space="preserve">Analytics Layer: </w:t>
             </w:r>
-            <w:hyperlink w:history="1" r:id="rIdl576fkxedmybi0zesl-qg">
+            <w:hyperlink w:history="1" r:id="rIdsb5vv5glr9j0vohmin_ib">
               <w:r>
                 <w:rPr>
                   <w:rStyle w:val="Hyperlink"/>
@@ -794,7 +794,7 @@
             </w:r>
           </w:p>
           <w:p>
-            <w:hyperlink w:history="1" r:id="rId8zz1wk4-_38urlwx82ekj">
+            <w:hyperlink w:history="1" r:id="rIdvcgzcjwwezdqs1-l4iyoe">
               <w:r>
                 <w:rPr>
                   <w:rStyle w:val="Hyperlink"/>
@@ -976,28 +976,61 @@
           <w:tcPr>
             <w:tcW w:type="dxa" w:w="9360"/>
             <w:tcBorders>
-              <w:top w:val="single" w:color="FFFFFF" w:sz="2"/>
-              <w:left w:val="single" w:color="FFFFFF" w:sz="8"/>
-              <w:bottom w:val="single" w:color="FFFFFF" w:sz="2"/>
-              <w:right w:val="single" w:color="FFFFFF" w:sz="2"/>
-            </w:tcBorders>
-            <w:shd w:fill="0071E3" w:val="clear"/>
-            <w:tcMar>
-              <w:top w:type="dxa" w:w="120"/>
-              <w:left w:type="dxa" w:w="200"/>
-              <w:bottom w:type="dxa" w:w="120"/>
-              <w:right w:type="dxa" w:w="160"/>
-            </w:tcMar>
-          </w:tcPr>
-          <w:p>
-            <w:r>
-              <w:rPr>
-                <w:rFonts w:ascii="Arial" w:cs="Arial" w:eastAsia="Arial" w:hAnsi="Arial"/>
-                <w:color w:val="FFFFFF"/>
-                <w:sz w:val="21"/>
-                <w:szCs w:val="21"/>
-              </w:rPr>
-              <w:t xml:space="preserve">Screenshot: Clients page in grid view — 6 active client cards with KPI summary row, search bar, and toolbar. See live demo link above.</w:t>
+              <w:top w:val="single" w:color="D2D2D7" w:sz="2"/>
+              <w:left w:val="single" w:color="D2D2D7" w:sz="2"/>
+              <w:bottom w:val="single" w:color="D2D2D7" w:sz="2"/>
+              <w:right w:val="single" w:color="D2D2D7" w:sz="2"/>
+            </w:tcBorders>
+            <w:tcMar>
+              <w:top w:type="dxa" w:w="80"/>
+              <w:left w:type="dxa" w:w="80"/>
+              <w:bottom w:type="dxa" w:w="80"/>
+              <w:right w:type="dxa" w:w="80"/>
+            </w:tcMar>
+          </w:tcPr>
+          <w:p>
+            <w:pPr>
+              <w:jc w:val="center"/>
+            </w:pPr>
+            <w:r>
+              <w:drawing>
+                <wp:inline distT="0" distB="0" distL="0" distR="0">
+                  <wp:extent cx="5800000" cy="3728571"/>
+                  <wp:effectExtent t="0" r="0" b="0" l="0"/>
+                  <wp:docPr id="1" name="" descr="" title=""/>
+                  <wp:cNvGraphicFramePr>
+                    <a:graphicFrameLocks xmlns:a="http://schemas.openxmlformats.org/drawingml/2006/main" noChangeAspect="1"/>
+                  </wp:cNvGraphicFramePr>
+                  <a:graphic xmlns:a="http://schemas.openxmlformats.org/drawingml/2006/main">
+                    <a:graphicData uri="http://schemas.openxmlformats.org/drawingml/2006/picture">
+                      <pic:pic xmlns:pic="http://schemas.openxmlformats.org/drawingml/2006/picture">
+                        <pic:nvPicPr>
+                          <pic:cNvPr id="0" name="" descr=""/>
+                          <pic:cNvPicPr>
+                            <a:picLocks noChangeAspect="1" noChangeArrowheads="1"/>
+                          </pic:cNvPicPr>
+                        </pic:nvPicPr>
+                        <pic:blipFill>
+                          <a:blip r:embed="rId9" cstate="none"/>
+                          <a:srcRect/>
+                          <a:stretch>
+                            <a:fillRect/>
+                          </a:stretch>
+                        </pic:blipFill>
+                        <pic:spPr bwMode="auto">
+                          <a:xfrm>
+                            <a:off x="0" y="0"/>
+                            <a:ext cx="5800000" cy="3728571"/>
+                          </a:xfrm>
+                          <a:prstGeom prst="rect">
+                            <a:avLst/>
+                          </a:prstGeom>
+                        </pic:spPr>
+                      </pic:pic>
+                    </a:graphicData>
+                  </a:graphic>
+                </wp:inline>
+              </w:drawing>
             </w:r>
           </w:p>
         </w:tc>
@@ -1005,8 +1038,20 @@
     </w:tbl>
     <w:p>
       <w:pPr>
-        <w:spacing w:after="200"/>
-      </w:pPr>
+        <w:spacing w:after="200" w:before="40"/>
+        <w:jc w:val="center"/>
+      </w:pPr>
+      <w:r>
+        <w:rPr>
+          <w:rFonts w:ascii="Arial" w:cs="Arial" w:eastAsia="Arial" w:hAnsi="Arial"/>
+          <w:i/>
+          <w:iCs/>
+          <w:color w:val="86868B"/>
+          <w:sz w:val="18"/>
+          <w:szCs w:val="18"/>
+        </w:rPr>
+        <w:t xml:space="preserve">Figure 1: Clients page — Grid view with KPI summary, search, and toolbar</w:t>
+      </w:r>
     </w:p>
     <w:p>
       <w:pPr>
@@ -1054,28 +1099,61 @@
           <w:tcPr>
             <w:tcW w:type="dxa" w:w="9360"/>
             <w:tcBorders>
-              <w:top w:val="single" w:color="FFFFFF" w:sz="2"/>
-              <w:left w:val="single" w:color="FFFFFF" w:sz="8"/>
-              <w:bottom w:val="single" w:color="FFFFFF" w:sz="2"/>
-              <w:right w:val="single" w:color="FFFFFF" w:sz="2"/>
-            </w:tcBorders>
-            <w:shd w:fill="0071E3" w:val="clear"/>
-            <w:tcMar>
-              <w:top w:type="dxa" w:w="120"/>
-              <w:left w:type="dxa" w:w="200"/>
-              <w:bottom w:type="dxa" w:w="120"/>
-              <w:right w:type="dxa" w:w="160"/>
-            </w:tcMar>
-          </w:tcPr>
-          <w:p>
-            <w:r>
-              <w:rPr>
-                <w:rFonts w:ascii="Arial" w:cs="Arial" w:eastAsia="Arial" w:hAnsi="Arial"/>
-                <w:color w:val="FFFFFF"/>
-                <w:sz w:val="21"/>
-                <w:szCs w:val="21"/>
-              </w:rPr>
-              <w:t xml:space="preserve">Screenshot: Clients page in list view — horizontal rows with aligned columns for easy comparison across all clients.</w:t>
+              <w:top w:val="single" w:color="D2D2D7" w:sz="2"/>
+              <w:left w:val="single" w:color="D2D2D7" w:sz="2"/>
+              <w:bottom w:val="single" w:color="D2D2D7" w:sz="2"/>
+              <w:right w:val="single" w:color="D2D2D7" w:sz="2"/>
+            </w:tcBorders>
+            <w:tcMar>
+              <w:top w:type="dxa" w:w="80"/>
+              <w:left w:type="dxa" w:w="80"/>
+              <w:bottom w:type="dxa" w:w="80"/>
+              <w:right w:type="dxa" w:w="80"/>
+            </w:tcMar>
+          </w:tcPr>
+          <w:p>
+            <w:pPr>
+              <w:jc w:val="center"/>
+            </w:pPr>
+            <w:r>
+              <w:drawing>
+                <wp:inline distT="0" distB="0" distL="0" distR="0">
+                  <wp:extent cx="5800000" cy="3728571"/>
+                  <wp:effectExtent t="0" r="0" b="0" l="0"/>
+                  <wp:docPr id="1" name="" descr="" title=""/>
+                  <wp:cNvGraphicFramePr>
+                    <a:graphicFrameLocks xmlns:a="http://schemas.openxmlformats.org/drawingml/2006/main" noChangeAspect="1"/>
+                  </wp:cNvGraphicFramePr>
+                  <a:graphic xmlns:a="http://schemas.openxmlformats.org/drawingml/2006/main">
+                    <a:graphicData uri="http://schemas.openxmlformats.org/drawingml/2006/picture">
+                      <pic:pic xmlns:pic="http://schemas.openxmlformats.org/drawingml/2006/picture">
+                        <pic:nvPicPr>
+                          <pic:cNvPr id="0" name="" descr=""/>
+                          <pic:cNvPicPr>
+                            <a:picLocks noChangeAspect="1" noChangeArrowheads="1"/>
+                          </pic:cNvPicPr>
+                        </pic:nvPicPr>
+                        <pic:blipFill>
+                          <a:blip r:embed="rId10" cstate="none"/>
+                          <a:srcRect/>
+                          <a:stretch>
+                            <a:fillRect/>
+                          </a:stretch>
+                        </pic:blipFill>
+                        <pic:spPr bwMode="auto">
+                          <a:xfrm>
+                            <a:off x="0" y="0"/>
+                            <a:ext cx="5800000" cy="3728571"/>
+                          </a:xfrm>
+                          <a:prstGeom prst="rect">
+                            <a:avLst/>
+                          </a:prstGeom>
+                        </pic:spPr>
+                      </pic:pic>
+                    </a:graphicData>
+                  </a:graphic>
+                </wp:inline>
+              </w:drawing>
             </w:r>
           </w:p>
         </w:tc>
@@ -1083,8 +1161,20 @@
     </w:tbl>
     <w:p>
       <w:pPr>
-        <w:spacing w:after="200"/>
-      </w:pPr>
+        <w:spacing w:after="200" w:before="40"/>
+        <w:jc w:val="center"/>
+      </w:pPr>
+      <w:r>
+        <w:rPr>
+          <w:rFonts w:ascii="Arial" w:cs="Arial" w:eastAsia="Arial" w:hAnsi="Arial"/>
+          <w:i/>
+          <w:iCs/>
+          <w:color w:val="86868B"/>
+          <w:sz w:val="18"/>
+          <w:szCs w:val="18"/>
+        </w:rPr>
+        <w:t xml:space="preserve">Figure 2: Clients page — List view with sortable columns</w:t>
+      </w:r>
     </w:p>
     <w:p>
       <w:pPr>
@@ -1728,7 +1818,7 @@
             </w:r>
           </w:p>
           <w:p>
-            <w:hyperlink w:history="1" r:id="rIdffkbupdrgeokwlsmihcjr">
+            <w:hyperlink w:history="1" r:id="rId2oaekzpxnhwbka3pvcrzy">
               <w:r>
                 <w:rPr>
                   <w:rStyle w:val="Hyperlink"/>
@@ -1771,7 +1861,7 @@
           <w:b/>
           <w:bCs/>
         </w:rPr>
-        <w:t xml:space="preserve">Client Header</w:t>
+        <w:t xml:space="preserve">Client Header &amp; Service Cards</w:t>
       </w:r>
     </w:p>
     <w:p>
@@ -1785,149 +1875,7 @@
           <w:sz w:val="22"/>
           <w:szCs w:val="22"/>
         </w:rPr>
-        <w:t xml:space="preserve">At the top: the client’s name, industry, location, and contact information. Two action buttons: open Analytics or Add a new Service.</w:t>
-      </w:r>
-    </w:p>
-    <w:p>
-      <w:pPr>
-        <w:pStyle w:val="Heading3"/>
-      </w:pPr>
-      <w:r>
-        <w:rPr>
-          <w:b/>
-          <w:bCs/>
-        </w:rPr>
-        <w:t xml:space="preserve">Quick Actions Bar</w:t>
-      </w:r>
-    </w:p>
-    <w:p>
-      <w:pPr>
-        <w:spacing w:after="120"/>
-      </w:pPr>
-      <w:r>
-        <w:rPr>
-          <w:rFonts w:ascii="Arial" w:cs="Arial" w:eastAsia="Arial" w:hAnsi="Arial"/>
-          <w:color w:val="1D1D1F"/>
-          <w:sz w:val="22"/>
-          <w:szCs w:val="22"/>
-        </w:rPr>
-        <w:t xml:space="preserve">A row of shortcut buttons for common tasks: Send Email, Schedule Meeting, Create Invoice, Add Note, Add Document, Add Contact. One click to get things done.</w:t>
-      </w:r>
-    </w:p>
-    <w:p>
-      <w:pPr>
-        <w:pStyle w:val="Heading3"/>
-      </w:pPr>
-      <w:r>
-        <w:rPr>
-          <w:b/>
-          <w:bCs/>
-        </w:rPr>
-        <w:t xml:space="preserve">Active Services</w:t>
-      </w:r>
-    </w:p>
-    <w:p>
-      <w:pPr>
-        <w:spacing w:after="120"/>
-      </w:pPr>
-      <w:r>
-        <w:rPr>
-          <w:rFonts w:ascii="Arial" w:cs="Arial" w:eastAsia="Arial" w:hAnsi="Arial"/>
-          <w:color w:val="1D1D1F"/>
-          <w:sz w:val="22"/>
-          <w:szCs w:val="22"/>
-        </w:rPr>
-        <w:t xml:space="preserve">The service cards show every active service for this client. Each card includes:</w:t>
-      </w:r>
-    </w:p>
-    <w:p>
-      <w:pPr>
-        <w:pStyle w:val="ListParagraph"/>
-        <w:numPr>
-          <w:ilvl w:val="0"/>
-          <w:numId w:val="3"/>
-        </w:numPr>
-        <w:spacing w:after="60"/>
-      </w:pPr>
-      <w:r>
-        <w:rPr>
-          <w:rFonts w:ascii="Arial" w:cs="Arial" w:eastAsia="Arial" w:hAnsi="Arial"/>
-          <w:sz w:val="22"/>
-          <w:szCs w:val="22"/>
-        </w:rPr>
-        <w:t xml:space="preserve">Service name and description</w:t>
-      </w:r>
-    </w:p>
-    <w:p>
-      <w:pPr>
-        <w:pStyle w:val="ListParagraph"/>
-        <w:numPr>
-          <w:ilvl w:val="0"/>
-          <w:numId w:val="3"/>
-        </w:numPr>
-        <w:spacing w:after="60"/>
-      </w:pPr>
-      <w:r>
-        <w:rPr>
-          <w:rFonts w:ascii="Arial" w:cs="Arial" w:eastAsia="Arial" w:hAnsi="Arial"/>
-          <w:sz w:val="22"/>
-          <w:szCs w:val="22"/>
-        </w:rPr>
-        <w:t xml:space="preserve">Status badge (Active, In Review, Paused)</w:t>
-      </w:r>
-    </w:p>
-    <w:p>
-      <w:pPr>
-        <w:pStyle w:val="ListParagraph"/>
-        <w:numPr>
-          <w:ilvl w:val="0"/>
-          <w:numId w:val="3"/>
-        </w:numPr>
-        <w:spacing w:after="60"/>
-      </w:pPr>
-      <w:r>
-        <w:rPr>
-          <w:rFonts w:ascii="Arial" w:cs="Arial" w:eastAsia="Arial" w:hAnsi="Arial"/>
-          <w:sz w:val="22"/>
-          <w:szCs w:val="22"/>
-        </w:rPr>
-        <w:t xml:space="preserve">A progress bar showing completion percentage</w:t>
-      </w:r>
-    </w:p>
-    <w:p>
-      <w:pPr>
-        <w:pStyle w:val="ListParagraph"/>
-        <w:numPr>
-          <w:ilvl w:val="0"/>
-          <w:numId w:val="3"/>
-        </w:numPr>
-        <w:spacing w:after="60"/>
-      </w:pPr>
-      <w:r>
-        <w:rPr>
-          <w:rFonts w:ascii="Arial" w:cs="Arial" w:eastAsia="Arial" w:hAnsi="Arial"/>
-          <w:sz w:val="22"/>
-          <w:szCs w:val="22"/>
-        </w:rPr>
-        <w:t xml:space="preserve">Task count and how many are currently in progress</w:t>
-      </w:r>
-    </w:p>
-    <w:p>
-      <w:pPr>
-        <w:pStyle w:val="ListParagraph"/>
-        <w:numPr>
-          <w:ilvl w:val="0"/>
-          <w:numId w:val="3"/>
-        </w:numPr>
-        <w:spacing w:after="60"/>
-      </w:pPr>
-      <w:r>
-        <w:rPr>
-          <w:rFonts w:ascii="Arial" w:cs="Arial" w:eastAsia="Arial" w:hAnsi="Arial"/>
-          <w:sz w:val="22"/>
-          <w:szCs w:val="22"/>
-        </w:rPr>
-        <w:t xml:space="preserve">Last updated timestamp</w:t>
+        <w:t xml:space="preserve">At the top: the client’s name, industry, location, and contact information. Two action buttons: open Analytics or Add a new Service. Below that, a quick actions bar for common tasks (Send Email, Schedule Meeting, Create Invoice, Add Note, Add Document, Add Contact). Then the active service cards, each showing the service name, status, progress bar, task count, and last updated timestamp.</w:t>
       </w:r>
     </w:p>
     <w:tbl>
@@ -1950,28 +1898,61 @@
           <w:tcPr>
             <w:tcW w:type="dxa" w:w="9360"/>
             <w:tcBorders>
-              <w:top w:val="single" w:color="FFFFFF" w:sz="2"/>
-              <w:left w:val="single" w:color="FFFFFF" w:sz="8"/>
-              <w:bottom w:val="single" w:color="FFFFFF" w:sz="2"/>
-              <w:right w:val="single" w:color="FFFFFF" w:sz="2"/>
-            </w:tcBorders>
-            <w:shd w:fill="0071E3" w:val="clear"/>
-            <w:tcMar>
-              <w:top w:type="dxa" w:w="120"/>
-              <w:left w:type="dxa" w:w="200"/>
-              <w:bottom w:type="dxa" w:w="120"/>
-              <w:right w:type="dxa" w:w="160"/>
-            </w:tcMar>
-          </w:tcPr>
-          <w:p>
-            <w:r>
-              <w:rPr>
-                <w:rFonts w:ascii="Arial" w:cs="Arial" w:eastAsia="Arial" w:hAnsi="Arial"/>
-                <w:color w:val="FFFFFF"/>
-                <w:sz w:val="21"/>
-                <w:szCs w:val="21"/>
-              </w:rPr>
-              <w:t xml:space="preserve">Screenshot: Services section showing 4 service cards — Website Redesign (68%), Mobile App (35%), SEO &amp; Analytics (90%), Cloud Infrastructure (15%, Paused). Clicking any card opens its Kanban board.</w:t>
+              <w:top w:val="single" w:color="D2D2D7" w:sz="2"/>
+              <w:left w:val="single" w:color="D2D2D7" w:sz="2"/>
+              <w:bottom w:val="single" w:color="D2D2D7" w:sz="2"/>
+              <w:right w:val="single" w:color="D2D2D7" w:sz="2"/>
+            </w:tcBorders>
+            <w:tcMar>
+              <w:top w:type="dxa" w:w="80"/>
+              <w:left w:type="dxa" w:w="80"/>
+              <w:bottom w:type="dxa" w:w="80"/>
+              <w:right w:type="dxa" w:w="80"/>
+            </w:tcMar>
+          </w:tcPr>
+          <w:p>
+            <w:pPr>
+              <w:jc w:val="center"/>
+            </w:pPr>
+            <w:r>
+              <w:drawing>
+                <wp:inline distT="0" distB="0" distL="0" distR="0">
+                  <wp:extent cx="5800000" cy="3728571"/>
+                  <wp:effectExtent t="0" r="0" b="0" l="0"/>
+                  <wp:docPr id="1" name="" descr="" title=""/>
+                  <wp:cNvGraphicFramePr>
+                    <a:graphicFrameLocks xmlns:a="http://schemas.openxmlformats.org/drawingml/2006/main" noChangeAspect="1"/>
+                  </wp:cNvGraphicFramePr>
+                  <a:graphic xmlns:a="http://schemas.openxmlformats.org/drawingml/2006/main">
+                    <a:graphicData uri="http://schemas.openxmlformats.org/drawingml/2006/picture">
+                      <pic:pic xmlns:pic="http://schemas.openxmlformats.org/drawingml/2006/picture">
+                        <pic:nvPicPr>
+                          <pic:cNvPr id="0" name="" descr=""/>
+                          <pic:cNvPicPr>
+                            <a:picLocks noChangeAspect="1" noChangeArrowheads="1"/>
+                          </pic:cNvPicPr>
+                        </pic:nvPicPr>
+                        <pic:blipFill>
+                          <a:blip r:embed="rId11" cstate="none"/>
+                          <a:srcRect/>
+                          <a:stretch>
+                            <a:fillRect/>
+                          </a:stretch>
+                        </pic:blipFill>
+                        <pic:spPr bwMode="auto">
+                          <a:xfrm>
+                            <a:off x="0" y="0"/>
+                            <a:ext cx="5800000" cy="3728571"/>
+                          </a:xfrm>
+                          <a:prstGeom prst="rect">
+                            <a:avLst/>
+                          </a:prstGeom>
+                        </pic:spPr>
+                      </pic:pic>
+                    </a:graphicData>
+                  </a:graphic>
+                </wp:inline>
+              </w:drawing>
             </w:r>
           </w:p>
         </w:tc>
@@ -1979,8 +1960,20 @@
     </w:tbl>
     <w:p>
       <w:pPr>
-        <w:spacing w:after="200"/>
-      </w:pPr>
+        <w:spacing w:after="200" w:before="40"/>
+        <w:jc w:val="center"/>
+      </w:pPr>
+      <w:r>
+        <w:rPr>
+          <w:rFonts w:ascii="Arial" w:cs="Arial" w:eastAsia="Arial" w:hAnsi="Arial"/>
+          <w:i/>
+          <w:iCs/>
+          <w:color w:val="86868B"/>
+          <w:sz w:val="18"/>
+          <w:szCs w:val="18"/>
+        </w:rPr>
+        <w:t xml:space="preserve">Figure 3: Client dashboard — Header, quick actions bar, and active service cards</w:t>
+      </w:r>
     </w:p>
     <w:p>
       <w:pPr>
@@ -2639,6 +2632,11 @@
         </w:tc>
       </w:tr>
     </w:tbl>
+    <w:p>
+      <w:pPr>
+        <w:spacing w:after="160"/>
+      </w:pPr>
+    </w:p>
     <w:tbl>
       <w:tblPr>
         <w:tblW w:type="dxa" w:w="9360"/>
@@ -2659,48 +2657,81 @@
           <w:tcPr>
             <w:tcW w:type="dxa" w:w="9360"/>
             <w:tcBorders>
-              <w:top w:val="single" w:color="FFFFFF" w:sz="2"/>
-              <w:left w:val="single" w:color="FFFFFF" w:sz="8"/>
-              <w:bottom w:val="single" w:color="FFFFFF" w:sz="2"/>
-              <w:right w:val="single" w:color="FFFFFF" w:sz="2"/>
-            </w:tcBorders>
-            <w:shd w:fill="0071E3" w:val="clear"/>
-            <w:tcMar>
-              <w:top w:type="dxa" w:w="120"/>
-              <w:left w:type="dxa" w:w="200"/>
-              <w:bottom w:type="dxa" w:w="120"/>
-              <w:right w:type="dxa" w:w="160"/>
-            </w:tcMar>
-          </w:tcPr>
-          <w:p>
-            <w:r>
-              <w:rPr>
-                <w:rFonts w:ascii="Arial" w:cs="Arial" w:eastAsia="Arial" w:hAnsi="Arial"/>
-                <w:color w:val="FFFFFF"/>
-                <w:sz w:val="21"/>
-                <w:szCs w:val="21"/>
-              </w:rPr>
-              <w:t xml:space="preserve">Screenshots: Overview cards showing People, Meetings, Documents, Billing in a 4-column grid. Below: Key Contacts, Contract Details, Internal Notes, and Communications Log. See live demo to interact.</w:t>
+              <w:top w:val="single" w:color="D2D2D7" w:sz="2"/>
+              <w:left w:val="single" w:color="D2D2D7" w:sz="2"/>
+              <w:bottom w:val="single" w:color="D2D2D7" w:sz="2"/>
+              <w:right w:val="single" w:color="D2D2D7" w:sz="2"/>
+            </w:tcBorders>
+            <w:tcMar>
+              <w:top w:type="dxa" w:w="80"/>
+              <w:left w:type="dxa" w:w="80"/>
+              <w:bottom w:type="dxa" w:w="80"/>
+              <w:right w:type="dxa" w:w="80"/>
+            </w:tcMar>
+          </w:tcPr>
+          <w:p>
+            <w:pPr>
+              <w:jc w:val="center"/>
+            </w:pPr>
+            <w:r>
+              <w:drawing>
+                <wp:inline distT="0" distB="0" distL="0" distR="0">
+                  <wp:extent cx="5800000" cy="3728571"/>
+                  <wp:effectExtent t="0" r="0" b="0" l="0"/>
+                  <wp:docPr id="1" name="" descr="" title=""/>
+                  <wp:cNvGraphicFramePr>
+                    <a:graphicFrameLocks xmlns:a="http://schemas.openxmlformats.org/drawingml/2006/main" noChangeAspect="1"/>
+                  </wp:cNvGraphicFramePr>
+                  <a:graphic xmlns:a="http://schemas.openxmlformats.org/drawingml/2006/main">
+                    <a:graphicData uri="http://schemas.openxmlformats.org/drawingml/2006/picture">
+                      <pic:pic xmlns:pic="http://schemas.openxmlformats.org/drawingml/2006/picture">
+                        <pic:nvPicPr>
+                          <pic:cNvPr id="0" name="" descr=""/>
+                          <pic:cNvPicPr>
+                            <a:picLocks noChangeAspect="1" noChangeArrowheads="1"/>
+                          </pic:cNvPicPr>
+                        </pic:nvPicPr>
+                        <pic:blipFill>
+                          <a:blip r:embed="rId12" cstate="none"/>
+                          <a:srcRect/>
+                          <a:stretch>
+                            <a:fillRect/>
+                          </a:stretch>
+                        </pic:blipFill>
+                        <pic:spPr bwMode="auto">
+                          <a:xfrm>
+                            <a:off x="0" y="0"/>
+                            <a:ext cx="5800000" cy="3728571"/>
+                          </a:xfrm>
+                          <a:prstGeom prst="rect">
+                            <a:avLst/>
+                          </a:prstGeom>
+                        </pic:spPr>
+                      </pic:pic>
+                    </a:graphicData>
+                  </a:graphic>
+                </wp:inline>
+              </w:drawing>
             </w:r>
           </w:p>
         </w:tc>
       </w:tr>
     </w:tbl>
     <w:p>
-      <w:r>
-        <w:br w:type="page"/>
-      </w:r>
-    </w:p>
-    <w:p>
-      <w:pPr>
-        <w:pStyle w:val="Heading2"/>
-      </w:pPr>
-      <w:r>
-        <w:rPr>
-          <w:b/>
-          <w:bCs/>
-        </w:rPr>
-        <w:t xml:space="preserve">3.3 Layer 3: Kanban Board</w:t>
+      <w:pPr>
+        <w:spacing w:after="200" w:before="40"/>
+        <w:jc w:val="center"/>
+      </w:pPr>
+      <w:r>
+        <w:rPr>
+          <w:rFonts w:ascii="Arial" w:cs="Arial" w:eastAsia="Arial" w:hAnsi="Arial"/>
+          <w:i/>
+          <w:iCs/>
+          <w:color w:val="86868B"/>
+          <w:sz w:val="18"/>
+          <w:szCs w:val="18"/>
+        </w:rPr>
+        <w:t xml:space="preserve">Figure 4: Overview cards — People, Meetings, Documents, and Billing</w:t>
       </w:r>
     </w:p>
     <w:tbl>
@@ -2723,6 +2754,120 @@
           <w:tcPr>
             <w:tcW w:type="dxa" w:w="9360"/>
             <w:tcBorders>
+              <w:top w:val="single" w:color="D2D2D7" w:sz="2"/>
+              <w:left w:val="single" w:color="D2D2D7" w:sz="2"/>
+              <w:bottom w:val="single" w:color="D2D2D7" w:sz="2"/>
+              <w:right w:val="single" w:color="D2D2D7" w:sz="2"/>
+            </w:tcBorders>
+            <w:tcMar>
+              <w:top w:type="dxa" w:w="80"/>
+              <w:left w:type="dxa" w:w="80"/>
+              <w:bottom w:type="dxa" w:w="80"/>
+              <w:right w:type="dxa" w:w="80"/>
+            </w:tcMar>
+          </w:tcPr>
+          <w:p>
+            <w:pPr>
+              <w:jc w:val="center"/>
+            </w:pPr>
+            <w:r>
+              <w:drawing>
+                <wp:inline distT="0" distB="0" distL="0" distR="0">
+                  <wp:extent cx="5800000" cy="3728571"/>
+                  <wp:effectExtent t="0" r="0" b="0" l="0"/>
+                  <wp:docPr id="1" name="" descr="" title=""/>
+                  <wp:cNvGraphicFramePr>
+                    <a:graphicFrameLocks xmlns:a="http://schemas.openxmlformats.org/drawingml/2006/main" noChangeAspect="1"/>
+                  </wp:cNvGraphicFramePr>
+                  <a:graphic xmlns:a="http://schemas.openxmlformats.org/drawingml/2006/main">
+                    <a:graphicData uri="http://schemas.openxmlformats.org/drawingml/2006/picture">
+                      <pic:pic xmlns:pic="http://schemas.openxmlformats.org/drawingml/2006/picture">
+                        <pic:nvPicPr>
+                          <pic:cNvPr id="0" name="" descr=""/>
+                          <pic:cNvPicPr>
+                            <a:picLocks noChangeAspect="1" noChangeArrowheads="1"/>
+                          </pic:cNvPicPr>
+                        </pic:nvPicPr>
+                        <pic:blipFill>
+                          <a:blip r:embed="rId13" cstate="none"/>
+                          <a:srcRect/>
+                          <a:stretch>
+                            <a:fillRect/>
+                          </a:stretch>
+                        </pic:blipFill>
+                        <pic:spPr bwMode="auto">
+                          <a:xfrm>
+                            <a:off x="0" y="0"/>
+                            <a:ext cx="5800000" cy="3728571"/>
+                          </a:xfrm>
+                          <a:prstGeom prst="rect">
+                            <a:avLst/>
+                          </a:prstGeom>
+                        </pic:spPr>
+                      </pic:pic>
+                    </a:graphicData>
+                  </a:graphic>
+                </wp:inline>
+              </w:drawing>
+            </w:r>
+          </w:p>
+        </w:tc>
+      </w:tr>
+    </w:tbl>
+    <w:p>
+      <w:pPr>
+        <w:spacing w:after="200" w:before="40"/>
+        <w:jc w:val="center"/>
+      </w:pPr>
+      <w:r>
+        <w:rPr>
+          <w:rFonts w:ascii="Arial" w:cs="Arial" w:eastAsia="Arial" w:hAnsi="Arial"/>
+          <w:i/>
+          <w:iCs/>
+          <w:color w:val="86868B"/>
+          <w:sz w:val="18"/>
+          <w:szCs w:val="18"/>
+        </w:rPr>
+        <w:t xml:space="preserve">Figure 5: Overview cards — Key Contacts, Contract Details, Internal Notes, and Communications</w:t>
+      </w:r>
+    </w:p>
+    <w:p>
+      <w:r>
+        <w:br w:type="page"/>
+      </w:r>
+    </w:p>
+    <w:p>
+      <w:pPr>
+        <w:pStyle w:val="Heading2"/>
+      </w:pPr>
+      <w:r>
+        <w:rPr>
+          <w:b/>
+          <w:bCs/>
+        </w:rPr>
+        <w:t xml:space="preserve">3.3 Layer 3: Kanban Board</w:t>
+      </w:r>
+    </w:p>
+    <w:tbl>
+      <w:tblPr>
+        <w:tblW w:type="dxa" w:w="9360"/>
+        <w:tblBorders>
+          <w:top w:val="single" w:color="auto" w:sz="4"/>
+          <w:left w:val="single" w:color="auto" w:sz="4"/>
+          <w:bottom w:val="single" w:color="auto" w:sz="4"/>
+          <w:right w:val="single" w:color="auto" w:sz="4"/>
+          <w:insideH w:val="single" w:color="auto" w:sz="4"/>
+          <w:insideV w:val="single" w:color="auto" w:sz="4"/>
+        </w:tblBorders>
+      </w:tblPr>
+      <w:tblGrid>
+        <w:gridCol w:w="9360"/>
+      </w:tblGrid>
+      <w:tr>
+        <w:tc>
+          <w:tcPr>
+            <w:tcW w:type="dxa" w:w="9360"/>
+            <w:tcBorders>
               <w:top w:val="single" w:color="0071E3" w:sz="3"/>
               <w:left w:val="single" w:color="0071E3" w:sz="3"/>
               <w:bottom w:val="single" w:color="0071E3" w:sz="3"/>
@@ -2753,7 +2898,7 @@
             </w:r>
           </w:p>
           <w:p>
-            <w:hyperlink w:history="1" r:id="rIde1-mvcwvy25wdl0ygzdyk">
+            <w:hyperlink w:history="1" r:id="rIdnahizpsvnx_u5rd332ige">
               <w:r>
                 <w:rPr>
                   <w:rStyle w:val="Hyperlink"/>
@@ -3313,28 +3458,61 @@
           <w:tcPr>
             <w:tcW w:type="dxa" w:w="9360"/>
             <w:tcBorders>
-              <w:top w:val="single" w:color="FFFFFF" w:sz="2"/>
-              <w:left w:val="single" w:color="FFFFFF" w:sz="8"/>
-              <w:bottom w:val="single" w:color="FFFFFF" w:sz="2"/>
-              <w:right w:val="single" w:color="FFFFFF" w:sz="2"/>
-            </w:tcBorders>
-            <w:shd w:fill="0071E3" w:val="clear"/>
-            <w:tcMar>
-              <w:top w:type="dxa" w:w="120"/>
-              <w:left w:type="dxa" w:w="200"/>
-              <w:bottom w:type="dxa" w:w="120"/>
-              <w:right w:type="dxa" w:w="160"/>
-            </w:tcMar>
-          </w:tcPr>
-          <w:p>
-            <w:r>
-              <w:rPr>
-                <w:rFonts w:ascii="Arial" w:cs="Arial" w:eastAsia="Arial" w:hAnsi="Arial"/>
-                <w:color w:val="FFFFFF"/>
-                <w:sz w:val="21"/>
-                <w:szCs w:val="21"/>
-              </w:rPr>
-              <w:t xml:space="preserve">Screenshot: Kanban board for “Website Redesign” service showing 4 columns with 8 task cards. Breadcrumb reads: Clients &gt; Acme Corporation &gt; Website Redesign. Board Settings, Members, and Analytics buttons in the top-right.</w:t>
+              <w:top w:val="single" w:color="D2D2D7" w:sz="2"/>
+              <w:left w:val="single" w:color="D2D2D7" w:sz="2"/>
+              <w:bottom w:val="single" w:color="D2D2D7" w:sz="2"/>
+              <w:right w:val="single" w:color="D2D2D7" w:sz="2"/>
+            </w:tcBorders>
+            <w:tcMar>
+              <w:top w:type="dxa" w:w="80"/>
+              <w:left w:type="dxa" w:w="80"/>
+              <w:bottom w:type="dxa" w:w="80"/>
+              <w:right w:type="dxa" w:w="80"/>
+            </w:tcMar>
+          </w:tcPr>
+          <w:p>
+            <w:pPr>
+              <w:jc w:val="center"/>
+            </w:pPr>
+            <w:r>
+              <w:drawing>
+                <wp:inline distT="0" distB="0" distL="0" distR="0">
+                  <wp:extent cx="5800000" cy="3728571"/>
+                  <wp:effectExtent t="0" r="0" b="0" l="0"/>
+                  <wp:docPr id="1" name="" descr="" title=""/>
+                  <wp:cNvGraphicFramePr>
+                    <a:graphicFrameLocks xmlns:a="http://schemas.openxmlformats.org/drawingml/2006/main" noChangeAspect="1"/>
+                  </wp:cNvGraphicFramePr>
+                  <a:graphic xmlns:a="http://schemas.openxmlformats.org/drawingml/2006/main">
+                    <a:graphicData uri="http://schemas.openxmlformats.org/drawingml/2006/picture">
+                      <pic:pic xmlns:pic="http://schemas.openxmlformats.org/drawingml/2006/picture">
+                        <pic:nvPicPr>
+                          <pic:cNvPr id="0" name="" descr=""/>
+                          <pic:cNvPicPr>
+                            <a:picLocks noChangeAspect="1" noChangeArrowheads="1"/>
+                          </pic:cNvPicPr>
+                        </pic:nvPicPr>
+                        <pic:blipFill>
+                          <a:blip r:embed="rId14" cstate="none"/>
+                          <a:srcRect/>
+                          <a:stretch>
+                            <a:fillRect/>
+                          </a:stretch>
+                        </pic:blipFill>
+                        <pic:spPr bwMode="auto">
+                          <a:xfrm>
+                            <a:off x="0" y="0"/>
+                            <a:ext cx="5800000" cy="3728571"/>
+                          </a:xfrm>
+                          <a:prstGeom prst="rect">
+                            <a:avLst/>
+                          </a:prstGeom>
+                        </pic:spPr>
+                      </pic:pic>
+                    </a:graphicData>
+                  </a:graphic>
+                </wp:inline>
+              </w:drawing>
             </w:r>
           </w:p>
         </w:tc>
@@ -3342,8 +3520,20 @@
     </w:tbl>
     <w:p>
       <w:pPr>
-        <w:spacing w:after="200"/>
-      </w:pPr>
+        <w:spacing w:after="200" w:before="40"/>
+        <w:jc w:val="center"/>
+      </w:pPr>
+      <w:r>
+        <w:rPr>
+          <w:rFonts w:ascii="Arial" w:cs="Arial" w:eastAsia="Arial" w:hAnsi="Arial"/>
+          <w:i/>
+          <w:iCs/>
+          <w:color w:val="86868B"/>
+          <w:sz w:val="18"/>
+          <w:szCs w:val="18"/>
+        </w:rPr>
+        <w:t xml:space="preserve">Figure 6: Kanban board for “Website Redesign” — 4 columns with task cards, breadcrumb navigation</w:t>
+      </w:r>
     </w:p>
     <w:p>
       <w:pPr>
@@ -3532,7 +3722,7 @@
             </w:r>
           </w:p>
           <w:p>
-            <w:hyperlink w:history="1" r:id="rIdjne7gvhv4p1kx36xhywwy">
+            <w:hyperlink w:history="1" r:id="rIdumpg1xhczhgtmpy_75akv">
               <w:r>
                 <w:rPr>
                   <w:rStyle w:val="Hyperlink"/>
@@ -4207,72 +4397,6 @@
         <w:t xml:space="preserve">Hours by Team Member — Individual contribution breakdown (Alex Smith: 88h, Jake Kim: 72.5h, etc.)</w:t>
       </w:r>
     </w:p>
-    <w:p>
-      <w:pPr>
-        <w:pStyle w:val="Heading3"/>
-      </w:pPr>
-      <w:r>
-        <w:rPr>
-          <w:b/>
-          <w:bCs/>
-        </w:rPr>
-        <w:t xml:space="preserve">Financial Overview</w:t>
-      </w:r>
-    </w:p>
-    <w:p>
-      <w:pPr>
-        <w:pStyle w:val="ListParagraph"/>
-        <w:numPr>
-          <w:ilvl w:val="0"/>
-          <w:numId w:val="3"/>
-        </w:numPr>
-        <w:spacing w:after="60"/>
-      </w:pPr>
-      <w:r>
-        <w:rPr>
-          <w:rFonts w:ascii="Arial" w:cs="Arial" w:eastAsia="Arial" w:hAnsi="Arial"/>
-          <w:sz w:val="22"/>
-          <w:szCs w:val="22"/>
-        </w:rPr>
-        <w:t xml:space="preserve">Profitability Overview — Total revenue ($37,500), total cost ($24,375), net profit (+$13,125), profit margin (54%)</w:t>
-      </w:r>
-    </w:p>
-    <w:p>
-      <w:pPr>
-        <w:pStyle w:val="ListParagraph"/>
-        <w:numPr>
-          <w:ilvl w:val="0"/>
-          <w:numId w:val="3"/>
-        </w:numPr>
-        <w:spacing w:after="60"/>
-      </w:pPr>
-      <w:r>
-        <w:rPr>
-          <w:rFonts w:ascii="Arial" w:cs="Arial" w:eastAsia="Arial" w:hAnsi="Arial"/>
-          <w:sz w:val="22"/>
-          <w:szCs w:val="22"/>
-        </w:rPr>
-        <w:t xml:space="preserve">Monthly breakdown comparing revenue vs. cost per month</w:t>
-      </w:r>
-    </w:p>
-    <w:p>
-      <w:pPr>
-        <w:pStyle w:val="ListParagraph"/>
-        <w:numPr>
-          <w:ilvl w:val="0"/>
-          <w:numId w:val="3"/>
-        </w:numPr>
-        <w:spacing w:after="60"/>
-      </w:pPr>
-      <w:r>
-        <w:rPr>
-          <w:rFonts w:ascii="Arial" w:cs="Arial" w:eastAsia="Arial" w:hAnsi="Arial"/>
-          <w:sz w:val="22"/>
-          <w:szCs w:val="22"/>
-        </w:rPr>
-        <w:t xml:space="preserve">Billing History — Full invoice table with invoice numbers, dates, amounts, and payment status</w:t>
-      </w:r>
-    </w:p>
     <w:tbl>
       <w:tblPr>
         <w:tblW w:type="dxa" w:w="9360"/>
@@ -4293,33 +4417,246 @@
           <w:tcPr>
             <w:tcW w:type="dxa" w:w="9360"/>
             <w:tcBorders>
-              <w:top w:val="single" w:color="FFFFFF" w:sz="2"/>
-              <w:left w:val="single" w:color="FFFFFF" w:sz="8"/>
-              <w:bottom w:val="single" w:color="FFFFFF" w:sz="2"/>
-              <w:right w:val="single" w:color="FFFFFF" w:sz="2"/>
-            </w:tcBorders>
-            <w:shd w:fill="0071E3" w:val="clear"/>
-            <w:tcMar>
-              <w:top w:type="dxa" w:w="120"/>
-              <w:left w:type="dxa" w:w="200"/>
-              <w:bottom w:type="dxa" w:w="120"/>
-              <w:right w:type="dxa" w:w="160"/>
-            </w:tcMar>
-          </w:tcPr>
-          <w:p>
-            <w:r>
-              <w:rPr>
-                <w:rFonts w:ascii="Arial" w:cs="Arial" w:eastAsia="Arial" w:hAnsi="Arial"/>
-                <w:color w:val="FFFFFF"/>
-                <w:sz w:val="21"/>
-                <w:szCs w:val="21"/>
-              </w:rPr>
-              <w:t xml:space="preserve">Screenshots: Analytics page showing KPI cards, donut chart, velocity bar chart, hours breakdown tables, profitability cards with monthly comparison, and billing history table. Time period toggle: 7D, 30D, 90D, 1Y, All.</w:t>
+              <w:top w:val="single" w:color="D2D2D7" w:sz="2"/>
+              <w:left w:val="single" w:color="D2D2D7" w:sz="2"/>
+              <w:bottom w:val="single" w:color="D2D2D7" w:sz="2"/>
+              <w:right w:val="single" w:color="D2D2D7" w:sz="2"/>
+            </w:tcBorders>
+            <w:tcMar>
+              <w:top w:type="dxa" w:w="80"/>
+              <w:left w:type="dxa" w:w="80"/>
+              <w:bottom w:type="dxa" w:w="80"/>
+              <w:right w:type="dxa" w:w="80"/>
+            </w:tcMar>
+          </w:tcPr>
+          <w:p>
+            <w:pPr>
+              <w:jc w:val="center"/>
+            </w:pPr>
+            <w:r>
+              <w:drawing>
+                <wp:inline distT="0" distB="0" distL="0" distR="0">
+                  <wp:extent cx="5800000" cy="3728571"/>
+                  <wp:effectExtent t="0" r="0" b="0" l="0"/>
+                  <wp:docPr id="1" name="" descr="" title=""/>
+                  <wp:cNvGraphicFramePr>
+                    <a:graphicFrameLocks xmlns:a="http://schemas.openxmlformats.org/drawingml/2006/main" noChangeAspect="1"/>
+                  </wp:cNvGraphicFramePr>
+                  <a:graphic xmlns:a="http://schemas.openxmlformats.org/drawingml/2006/main">
+                    <a:graphicData uri="http://schemas.openxmlformats.org/drawingml/2006/picture">
+                      <pic:pic xmlns:pic="http://schemas.openxmlformats.org/drawingml/2006/picture">
+                        <pic:nvPicPr>
+                          <pic:cNvPr id="0" name="" descr=""/>
+                          <pic:cNvPicPr>
+                            <a:picLocks noChangeAspect="1" noChangeArrowheads="1"/>
+                          </pic:cNvPicPr>
+                        </pic:nvPicPr>
+                        <pic:blipFill>
+                          <a:blip r:embed="rId15" cstate="none"/>
+                          <a:srcRect/>
+                          <a:stretch>
+                            <a:fillRect/>
+                          </a:stretch>
+                        </pic:blipFill>
+                        <pic:spPr bwMode="auto">
+                          <a:xfrm>
+                            <a:off x="0" y="0"/>
+                            <a:ext cx="5800000" cy="3728571"/>
+                          </a:xfrm>
+                          <a:prstGeom prst="rect">
+                            <a:avLst/>
+                          </a:prstGeom>
+                        </pic:spPr>
+                      </pic:pic>
+                    </a:graphicData>
+                  </a:graphic>
+                </wp:inline>
+              </w:drawing>
             </w:r>
           </w:p>
         </w:tc>
       </w:tr>
     </w:tbl>
+    <w:p>
+      <w:pPr>
+        <w:spacing w:after="200" w:before="40"/>
+        <w:jc w:val="center"/>
+      </w:pPr>
+      <w:r>
+        <w:rPr>
+          <w:rFonts w:ascii="Arial" w:cs="Arial" w:eastAsia="Arial" w:hAnsi="Arial"/>
+          <w:i/>
+          <w:iCs/>
+          <w:color w:val="86868B"/>
+          <w:sz w:val="18"/>
+          <w:szCs w:val="18"/>
+        </w:rPr>
+        <w:t xml:space="preserve">Figure 7: Analytics — KPI cards, task breakdown donut chart, velocity bar chart, and hours tables</w:t>
+      </w:r>
+    </w:p>
+    <w:p>
+      <w:pPr>
+        <w:pStyle w:val="Heading3"/>
+      </w:pPr>
+      <w:r>
+        <w:rPr>
+          <w:b/>
+          <w:bCs/>
+        </w:rPr>
+        <w:t xml:space="preserve">Financial Overview</w:t>
+      </w:r>
+    </w:p>
+    <w:p>
+      <w:pPr>
+        <w:pStyle w:val="ListParagraph"/>
+        <w:numPr>
+          <w:ilvl w:val="0"/>
+          <w:numId w:val="3"/>
+        </w:numPr>
+        <w:spacing w:after="60"/>
+      </w:pPr>
+      <w:r>
+        <w:rPr>
+          <w:rFonts w:ascii="Arial" w:cs="Arial" w:eastAsia="Arial" w:hAnsi="Arial"/>
+          <w:sz w:val="22"/>
+          <w:szCs w:val="22"/>
+        </w:rPr>
+        <w:t xml:space="preserve">Profitability Overview — Total revenue ($37,500), total cost ($24,375), net profit (+$13,125), profit margin (54%)</w:t>
+      </w:r>
+    </w:p>
+    <w:p>
+      <w:pPr>
+        <w:pStyle w:val="ListParagraph"/>
+        <w:numPr>
+          <w:ilvl w:val="0"/>
+          <w:numId w:val="3"/>
+        </w:numPr>
+        <w:spacing w:after="60"/>
+      </w:pPr>
+      <w:r>
+        <w:rPr>
+          <w:rFonts w:ascii="Arial" w:cs="Arial" w:eastAsia="Arial" w:hAnsi="Arial"/>
+          <w:sz w:val="22"/>
+          <w:szCs w:val="22"/>
+        </w:rPr>
+        <w:t xml:space="preserve">Monthly breakdown comparing revenue vs. cost per month</w:t>
+      </w:r>
+    </w:p>
+    <w:p>
+      <w:pPr>
+        <w:pStyle w:val="ListParagraph"/>
+        <w:numPr>
+          <w:ilvl w:val="0"/>
+          <w:numId w:val="3"/>
+        </w:numPr>
+        <w:spacing w:after="60"/>
+      </w:pPr>
+      <w:r>
+        <w:rPr>
+          <w:rFonts w:ascii="Arial" w:cs="Arial" w:eastAsia="Arial" w:hAnsi="Arial"/>
+          <w:sz w:val="22"/>
+          <w:szCs w:val="22"/>
+        </w:rPr>
+        <w:t xml:space="preserve">Billing History — Full invoice table with invoice numbers, dates, amounts, and payment status</w:t>
+      </w:r>
+    </w:p>
+    <w:tbl>
+      <w:tblPr>
+        <w:tblW w:type="dxa" w:w="9360"/>
+        <w:tblBorders>
+          <w:top w:val="single" w:color="auto" w:sz="4"/>
+          <w:left w:val="single" w:color="auto" w:sz="4"/>
+          <w:bottom w:val="single" w:color="auto" w:sz="4"/>
+          <w:right w:val="single" w:color="auto" w:sz="4"/>
+          <w:insideH w:val="single" w:color="auto" w:sz="4"/>
+          <w:insideV w:val="single" w:color="auto" w:sz="4"/>
+        </w:tblBorders>
+      </w:tblPr>
+      <w:tblGrid>
+        <w:gridCol w:w="9360"/>
+      </w:tblGrid>
+      <w:tr>
+        <w:tc>
+          <w:tcPr>
+            <w:tcW w:type="dxa" w:w="9360"/>
+            <w:tcBorders>
+              <w:top w:val="single" w:color="D2D2D7" w:sz="2"/>
+              <w:left w:val="single" w:color="D2D2D7" w:sz="2"/>
+              <w:bottom w:val="single" w:color="D2D2D7" w:sz="2"/>
+              <w:right w:val="single" w:color="D2D2D7" w:sz="2"/>
+            </w:tcBorders>
+            <w:tcMar>
+              <w:top w:type="dxa" w:w="80"/>
+              <w:left w:type="dxa" w:w="80"/>
+              <w:bottom w:type="dxa" w:w="80"/>
+              <w:right w:type="dxa" w:w="80"/>
+            </w:tcMar>
+          </w:tcPr>
+          <w:p>
+            <w:pPr>
+              <w:jc w:val="center"/>
+            </w:pPr>
+            <w:r>
+              <w:drawing>
+                <wp:inline distT="0" distB="0" distL="0" distR="0">
+                  <wp:extent cx="5800000" cy="3728571"/>
+                  <wp:effectExtent t="0" r="0" b="0" l="0"/>
+                  <wp:docPr id="1" name="" descr="" title=""/>
+                  <wp:cNvGraphicFramePr>
+                    <a:graphicFrameLocks xmlns:a="http://schemas.openxmlformats.org/drawingml/2006/main" noChangeAspect="1"/>
+                  </wp:cNvGraphicFramePr>
+                  <a:graphic xmlns:a="http://schemas.openxmlformats.org/drawingml/2006/main">
+                    <a:graphicData uri="http://schemas.openxmlformats.org/drawingml/2006/picture">
+                      <pic:pic xmlns:pic="http://schemas.openxmlformats.org/drawingml/2006/picture">
+                        <pic:nvPicPr>
+                          <pic:cNvPr id="0" name="" descr=""/>
+                          <pic:cNvPicPr>
+                            <a:picLocks noChangeAspect="1" noChangeArrowheads="1"/>
+                          </pic:cNvPicPr>
+                        </pic:nvPicPr>
+                        <pic:blipFill>
+                          <a:blip r:embed="rId16" cstate="none"/>
+                          <a:srcRect/>
+                          <a:stretch>
+                            <a:fillRect/>
+                          </a:stretch>
+                        </pic:blipFill>
+                        <pic:spPr bwMode="auto">
+                          <a:xfrm>
+                            <a:off x="0" y="0"/>
+                            <a:ext cx="5800000" cy="3728571"/>
+                          </a:xfrm>
+                          <a:prstGeom prst="rect">
+                            <a:avLst/>
+                          </a:prstGeom>
+                        </pic:spPr>
+                      </pic:pic>
+                    </a:graphicData>
+                  </a:graphic>
+                </wp:inline>
+              </w:drawing>
+            </w:r>
+          </w:p>
+        </w:tc>
+      </w:tr>
+    </w:tbl>
+    <w:p>
+      <w:pPr>
+        <w:spacing w:after="200" w:before="40"/>
+        <w:jc w:val="center"/>
+      </w:pPr>
+      <w:r>
+        <w:rPr>
+          <w:rFonts w:ascii="Arial" w:cs="Arial" w:eastAsia="Arial" w:hAnsi="Arial"/>
+          <w:i/>
+          <w:iCs/>
+          <w:color w:val="86868B"/>
+          <w:sz w:val="18"/>
+          <w:szCs w:val="18"/>
+        </w:rPr>
+        <w:t xml:space="preserve">Figure 8: Analytics — Profitability overview, monthly comparison, and billing history table</w:t>
+      </w:r>
+    </w:p>
     <w:p>
       <w:r>
         <w:br w:type="page"/>
@@ -4753,7 +5090,7 @@
                 <w:sz w:val="20"/>
                 <w:szCs w:val="20"/>
               </w:rPr>
-              <w:t xml:space="preserve">Responsive Card Grid</w:t>
+              <w:t xml:space="preserve">Client Management</w:t>
             </w:r>
           </w:p>
         </w:tc>
@@ -4786,7 +5123,7 @@
                 <w:sz w:val="20"/>
                 <w:szCs w:val="20"/>
               </w:rPr>
-              <w:t xml:space="preserve">Client and service cards adapt to screen size. Switch between grid and list views.</w:t>
+              <w:t xml:space="preserve">Full client profiles with status, revenue, services, and activity tracking</w:t>
             </w:r>
           </w:p>
         </w:tc>
@@ -4821,7 +5158,7 @@
                 <w:sz w:val="20"/>
                 <w:szCs w:val="20"/>
               </w:rPr>
-              <w:t xml:space="preserve">Sort &amp; Filter</w:t>
+              <w:t xml:space="preserve">Service Tracking</w:t>
             </w:r>
           </w:p>
         </w:tc>
@@ -4854,7 +5191,7 @@
                 <w:sz w:val="20"/>
                 <w:szCs w:val="20"/>
               </w:rPr>
-              <w:t xml:space="preserve">Sort clients by name, tasks, services, or revenue. Filter by service type. Active sort/filter shown with badge.</w:t>
+              <w:t xml:space="preserve">Per-client service cards with progress bars, task counts, and status badges</w:t>
             </w:r>
           </w:p>
         </w:tc>
@@ -4889,7 +5226,7 @@
                 <w:sz w:val="20"/>
                 <w:szCs w:val="20"/>
               </w:rPr>
-              <w:t xml:space="preserve">KPI Dashboard</w:t>
+              <w:t xml:space="preserve">Kanban Boards</w:t>
             </w:r>
           </w:p>
         </w:tc>
@@ -4922,7 +5259,7 @@
                 <w:sz w:val="20"/>
                 <w:szCs w:val="20"/>
               </w:rPr>
-              <w:t xml:space="preserve">Summary metrics at the top of each page. Active Tasks, Avg Tasks/Client, Completion Rate.</w:t>
+              <w:t xml:space="preserve">Drag-and-drop task management with columns, priorities, labels, and assignees</w:t>
             </w:r>
           </w:p>
         </w:tc>
@@ -4957,7 +5294,7 @@
                 <w:sz w:val="20"/>
                 <w:szCs w:val="20"/>
               </w:rPr>
-              <w:t xml:space="preserve">Quick Actions</w:t>
+              <w:t xml:space="preserve">Analytics Dashboard</w:t>
             </w:r>
           </w:p>
         </w:tc>
@@ -4990,7 +5327,7 @@
                 <w:sz w:val="20"/>
                 <w:szCs w:val="20"/>
               </w:rPr>
-              <w:t xml:space="preserve">One-click shortcuts for common tasks: email, meetings, invoices, notes, documents.</w:t>
+              <w:t xml:space="preserve">KPIs, charts, hours tracking, profitability analysis, and billing history</w:t>
             </w:r>
           </w:p>
         </w:tc>
@@ -5025,7 +5362,7 @@
                 <w:sz w:val="20"/>
                 <w:szCs w:val="20"/>
               </w:rPr>
-              <w:t xml:space="preserve">Service Progress Tracking</w:t>
+              <w:t xml:space="preserve">Quick Actions</w:t>
             </w:r>
           </w:p>
         </w:tc>
@@ -5058,7 +5395,7 @@
                 <w:sz w:val="20"/>
                 <w:szCs w:val="20"/>
               </w:rPr>
-              <w:t xml:space="preserve">Visual progress bars on each service card. See completion at a glance.</w:t>
+              <w:t xml:space="preserve">One-click shortcuts for email, meetings, invoices, notes, documents, contacts</w:t>
             </w:r>
           </w:p>
         </w:tc>
@@ -5093,7 +5430,7 @@
                 <w:sz w:val="20"/>
                 <w:szCs w:val="20"/>
               </w:rPr>
-              <w:t xml:space="preserve">Kanban Task Management</w:t>
+              <w:t xml:space="preserve">Search &amp; Filter</w:t>
             </w:r>
           </w:p>
         </w:tc>
@@ -5126,7 +5463,7 @@
                 <w:sz w:val="20"/>
                 <w:szCs w:val="20"/>
               </w:rPr>
-              <w:t xml:space="preserve">Drag-and-drop cards across columns. Priority labels, assignees, comments, attachments.</w:t>
+              <w:t xml:space="preserve">Real-time search, multi-criteria sort, service type filtering, view toggles</w:t>
             </w:r>
           </w:p>
         </w:tc>
@@ -5161,7 +5498,7 @@
                 <w:sz w:val="20"/>
                 <w:szCs w:val="20"/>
               </w:rPr>
-              <w:t xml:space="preserve">Client Overview Cards</w:t>
+              <w:t xml:space="preserve">Document Management</w:t>
             </w:r>
           </w:p>
         </w:tc>
@@ -5194,7 +5531,7 @@
                 <w:sz w:val="20"/>
                 <w:szCs w:val="20"/>
               </w:rPr>
-              <w:t xml:space="preserve">People, meetings, documents, billing, contacts, contract, notes, communications — all in one view.</w:t>
+              <w:t xml:space="preserve">Signing status checklist, Google Drive integration, document upload</w:t>
             </w:r>
           </w:p>
         </w:tc>
@@ -5229,7 +5566,7 @@
                 <w:sz w:val="20"/>
                 <w:szCs w:val="20"/>
               </w:rPr>
-              <w:t xml:space="preserve">Analytics &amp; Reporting</w:t>
+              <w:t xml:space="preserve">Billing Integration</w:t>
             </w:r>
           </w:p>
         </w:tc>
@@ -5262,7 +5599,7 @@
                 <w:sz w:val="20"/>
                 <w:szCs w:val="20"/>
               </w:rPr>
-              <w:t xml:space="preserve">Hours worked, billings, task velocity, profitability, team breakdown, invoice history.</w:t>
+              <w:t xml:space="preserve">Invoice tracking, payment status, Xero link, billing history with amounts and dates</w:t>
             </w:r>
           </w:p>
         </w:tc>
@@ -5297,7 +5634,7 @@
                 <w:sz w:val="20"/>
                 <w:szCs w:val="20"/>
               </w:rPr>
-              <w:t xml:space="preserve">Hover Interactions</w:t>
+              <w:t xml:space="preserve">Communications Log</w:t>
             </w:r>
           </w:p>
         </w:tc>
@@ -5330,7 +5667,7 @@
                 <w:sz w:val="20"/>
                 <w:szCs w:val="20"/>
               </w:rPr>
-              <w:t xml:space="preserve">Cards and buttons highlight on hover with blue borders and shadows, providing clear interactive feedback.</w:t>
+              <w:t xml:space="preserve">Activity timeline: emails, calls, meetings, Slack messages with timestamps</w:t>
             </w:r>
           </w:p>
         </w:tc>
@@ -5365,7 +5702,7 @@
                 <w:sz w:val="20"/>
                 <w:szCs w:val="20"/>
               </w:rPr>
-              <w:t xml:space="preserve">Status Management</w:t>
+              <w:t xml:space="preserve">Team Management</w:t>
             </w:r>
           </w:p>
         </w:tc>
@@ -5398,16 +5735,19 @@
                 <w:sz w:val="20"/>
                 <w:szCs w:val="20"/>
               </w:rPr>
-              <w:t xml:space="preserve">Change client status (Active/Paused/Archived) directly from the card menu. Archive and restore.</w:t>
+              <w:t xml:space="preserve">Assigned team members with roles, contact info, and quick action buttons</w:t>
             </w:r>
           </w:p>
         </w:tc>
       </w:tr>
     </w:tbl>
     <w:p>
-      <w:r>
-        <w:br w:type="page"/>
-      </w:r>
+      <w:pPr>
+        <w:pBdr>
+          <w:bottom w:val="single" w:color="0071E3" w:sz="6" w:space="1"/>
+        </w:pBdr>
+        <w:spacing w:after="200" w:before="200"/>
+      </w:pPr>
     </w:p>
     <w:p>
       <w:pPr>
@@ -5434,14 +5774,14 @@
         </w:tblBorders>
       </w:tblPr>
       <w:tblGrid>
-        <w:gridCol w:w="2400"/>
-        <w:gridCol w:w="3480"/>
-        <w:gridCol w:w="3480"/>
+        <w:gridCol w:w="2340"/>
+        <w:gridCol w:w="3510"/>
+        <w:gridCol w:w="3510"/>
       </w:tblGrid>
       <w:tr>
         <w:tc>
           <w:tcPr>
-            <w:tcW w:type="dxa" w:w="2400"/>
+            <w:tcW w:type="dxa" w:w="2340"/>
             <w:tcBorders>
               <w:top w:val="single" w:color="D2D2D7" w:sz="1"/>
               <w:left w:val="single" w:color="D2D2D7" w:sz="1"/>
@@ -5475,7 +5815,7 @@
         </w:tc>
         <w:tc>
           <w:tcPr>
-            <w:tcW w:type="dxa" w:w="3480"/>
+            <w:tcW w:type="dxa" w:w="3510"/>
             <w:tcBorders>
               <w:top w:val="single" w:color="D2D2D7" w:sz="1"/>
               <w:left w:val="single" w:color="D2D2D7" w:sz="1"/>
@@ -5509,7 +5849,7 @@
         </w:tc>
         <w:tc>
           <w:tcPr>
-            <w:tcW w:type="dxa" w:w="3480"/>
+            <w:tcW w:type="dxa" w:w="3510"/>
             <w:tcBorders>
               <w:top w:val="single" w:color="D2D2D7" w:sz="1"/>
               <w:left w:val="single" w:color="D2D2D7" w:sz="1"/>
@@ -5537,7 +5877,7 @@
                 <w:sz w:val="20"/>
                 <w:szCs w:val="20"/>
               </w:rPr>
-              <w:t xml:space="preserve">What They Gain</w:t>
+              <w:t xml:space="preserve">Key Benefit</w:t>
             </w:r>
           </w:p>
         </w:tc>
@@ -5545,7 +5885,7 @@
       <w:tr>
         <w:tc>
           <w:tcPr>
-            <w:tcW w:type="dxa" w:w="2400"/>
+            <w:tcW w:type="dxa" w:w="2340"/>
             <w:tcBorders>
               <w:top w:val="single" w:color="D2D2D7" w:sz="1"/>
               <w:left w:val="single" w:color="D2D2D7" w:sz="1"/>
@@ -5572,13 +5912,13 @@
                 <w:sz w:val="20"/>
                 <w:szCs w:val="20"/>
               </w:rPr>
-              <w:t xml:space="preserve">Account Managers</w:t>
-            </w:r>
-          </w:p>
-        </w:tc>
-        <w:tc>
-          <w:tcPr>
-            <w:tcW w:type="dxa" w:w="3480"/>
+              <w:t xml:space="preserve">CEO / Leadership</w:t>
+            </w:r>
+          </w:p>
+        </w:tc>
+        <w:tc>
+          <w:tcPr>
+            <w:tcW w:type="dxa" w:w="3510"/>
             <w:tcBorders>
               <w:top w:val="single" w:color="D2D2D7" w:sz="1"/>
               <w:left w:val="single" w:color="D2D2D7" w:sz="1"/>
@@ -5605,13 +5945,13 @@
                 <w:sz w:val="20"/>
                 <w:szCs w:val="20"/>
               </w:rPr>
-              <w:t xml:space="preserve">Client overview, revenue tracking, contract status, meeting schedules, communication logs</w:t>
-            </w:r>
-          </w:p>
-        </w:tc>
-        <w:tc>
-          <w:tcPr>
-            <w:tcW w:type="dxa" w:w="3480"/>
+              <w:t xml:space="preserve">Client portfolio overview, revenue tracking, profitability</w:t>
+            </w:r>
+          </w:p>
+        </w:tc>
+        <w:tc>
+          <w:tcPr>
+            <w:tcW w:type="dxa" w:w="3510"/>
             <w:tcBorders>
               <w:top w:val="single" w:color="D2D2D7" w:sz="1"/>
               <w:left w:val="single" w:color="D2D2D7" w:sz="1"/>
@@ -5638,7 +5978,7 @@
                 <w:sz w:val="20"/>
                 <w:szCs w:val="20"/>
               </w:rPr>
-              <w:t xml:space="preserve">Full client visibility without chasing updates. Know the status of every account instantly.</w:t>
+              <w:t xml:space="preserve">High-level visibility without asking for reports</w:t>
             </w:r>
           </w:p>
         </w:tc>
@@ -5646,7 +5986,7 @@
       <w:tr>
         <w:tc>
           <w:tcPr>
-            <w:tcW w:type="dxa" w:w="2400"/>
+            <w:tcW w:type="dxa" w:w="2340"/>
             <w:tcBorders>
               <w:top w:val="single" w:color="D2D2D7" w:sz="1"/>
               <w:left w:val="single" w:color="D2D2D7" w:sz="1"/>
@@ -5673,13 +6013,13 @@
                 <w:sz w:val="20"/>
                 <w:szCs w:val="20"/>
               </w:rPr>
-              <w:t xml:space="preserve">Project Managers</w:t>
-            </w:r>
-          </w:p>
-        </w:tc>
-        <w:tc>
-          <w:tcPr>
-            <w:tcW w:type="dxa" w:w="3480"/>
+              <w:t xml:space="preserve">Account Managers</w:t>
+            </w:r>
+          </w:p>
+        </w:tc>
+        <w:tc>
+          <w:tcPr>
+            <w:tcW w:type="dxa" w:w="3510"/>
             <w:tcBorders>
               <w:top w:val="single" w:color="D2D2D7" w:sz="1"/>
               <w:left w:val="single" w:color="D2D2D7" w:sz="1"/>
@@ -5706,13 +6046,13 @@
                 <w:sz w:val="20"/>
                 <w:szCs w:val="20"/>
               </w:rPr>
-              <w:t xml:space="preserve">Service progress, task tracking, team assignments, deadline monitoring</w:t>
-            </w:r>
-          </w:p>
-        </w:tc>
-        <w:tc>
-          <w:tcPr>
-            <w:tcW w:type="dxa" w:w="3480"/>
+              <w:t xml:space="preserve">Client health, contracts, billing, communications</w:t>
+            </w:r>
+          </w:p>
+        </w:tc>
+        <w:tc>
+          <w:tcPr>
+            <w:tcW w:type="dxa" w:w="3510"/>
             <w:tcBorders>
               <w:top w:val="single" w:color="D2D2D7" w:sz="1"/>
               <w:left w:val="single" w:color="D2D2D7" w:sz="1"/>
@@ -5739,7 +6079,7 @@
                 <w:sz w:val="20"/>
                 <w:szCs w:val="20"/>
               </w:rPr>
-              <w:t xml:space="preserve">Clear view of what’s on track and what’s behind. Manage workload across services.</w:t>
+              <w:t xml:space="preserve">Single source of truth for every client relationship</w:t>
             </w:r>
           </w:p>
         </w:tc>
@@ -5747,7 +6087,7 @@
       <w:tr>
         <w:tc>
           <w:tcPr>
-            <w:tcW w:type="dxa" w:w="2400"/>
+            <w:tcW w:type="dxa" w:w="2340"/>
             <w:tcBorders>
               <w:top w:val="single" w:color="D2D2D7" w:sz="1"/>
               <w:left w:val="single" w:color="D2D2D7" w:sz="1"/>
@@ -5774,13 +6114,13 @@
                 <w:sz w:val="20"/>
                 <w:szCs w:val="20"/>
               </w:rPr>
-              <w:t xml:space="preserve">Production Team</w:t>
-            </w:r>
-          </w:p>
-        </w:tc>
-        <w:tc>
-          <w:tcPr>
-            <w:tcW w:type="dxa" w:w="3480"/>
+              <w:t xml:space="preserve">Project Managers</w:t>
+            </w:r>
+          </w:p>
+        </w:tc>
+        <w:tc>
+          <w:tcPr>
+            <w:tcW w:type="dxa" w:w="3510"/>
             <w:tcBorders>
               <w:top w:val="single" w:color="D2D2D7" w:sz="1"/>
               <w:left w:val="single" w:color="D2D2D7" w:sz="1"/>
@@ -5807,13 +6147,13 @@
                 <w:sz w:val="20"/>
                 <w:szCs w:val="20"/>
               </w:rPr>
-              <w:t xml:space="preserve">Kanban boards, task cards, priority labels, daily workflow</w:t>
-            </w:r>
-          </w:p>
-        </w:tc>
-        <w:tc>
-          <w:tcPr>
-            <w:tcW w:type="dxa" w:w="3480"/>
+              <w:t xml:space="preserve">Service progress, task boards, team workload, analytics</w:t>
+            </w:r>
+          </w:p>
+        </w:tc>
+        <w:tc>
+          <w:tcPr>
+            <w:tcW w:type="dxa" w:w="3510"/>
             <w:tcBorders>
               <w:top w:val="single" w:color="D2D2D7" w:sz="1"/>
               <w:left w:val="single" w:color="D2D2D7" w:sz="1"/>
@@ -5840,7 +6180,7 @@
                 <w:sz w:val="20"/>
                 <w:szCs w:val="20"/>
               </w:rPr>
-              <w:t xml:space="preserve">Know exactly what to work on next. No ambiguity. Drag cards, update progress, move on.</w:t>
+              <w:t xml:space="preserve">Track all services and tasks without switching tools</w:t>
             </w:r>
           </w:p>
         </w:tc>
@@ -5848,7 +6188,7 @@
       <w:tr>
         <w:tc>
           <w:tcPr>
-            <w:tcW w:type="dxa" w:w="2400"/>
+            <w:tcW w:type="dxa" w:w="2340"/>
             <w:tcBorders>
               <w:top w:val="single" w:color="D2D2D7" w:sz="1"/>
               <w:left w:val="single" w:color="D2D2D7" w:sz="1"/>
@@ -5875,13 +6215,13 @@
                 <w:sz w:val="20"/>
                 <w:szCs w:val="20"/>
               </w:rPr>
-              <w:t xml:space="preserve">Leadership / CEO</w:t>
-            </w:r>
-          </w:p>
-        </w:tc>
-        <w:tc>
-          <w:tcPr>
-            <w:tcW w:type="dxa" w:w="3480"/>
+              <w:t xml:space="preserve">Production Team</w:t>
+            </w:r>
+          </w:p>
+        </w:tc>
+        <w:tc>
+          <w:tcPr>
+            <w:tcW w:type="dxa" w:w="3510"/>
             <w:tcBorders>
               <w:top w:val="single" w:color="D2D2D7" w:sz="1"/>
               <w:left w:val="single" w:color="D2D2D7" w:sz="1"/>
@@ -5908,13 +6248,13 @@
                 <w:sz w:val="20"/>
                 <w:szCs w:val="20"/>
               </w:rPr>
-              <w:t xml:space="preserve">Analytics, profitability, client health, revenue overview</w:t>
-            </w:r>
-          </w:p>
-        </w:tc>
-        <w:tc>
-          <w:tcPr>
-            <w:tcW w:type="dxa" w:w="3480"/>
+              <w:t xml:space="preserve">Kanban boards, task priorities, daily workflow</w:t>
+            </w:r>
+          </w:p>
+        </w:tc>
+        <w:tc>
+          <w:tcPr>
+            <w:tcW w:type="dxa" w:w="3510"/>
             <w:tcBorders>
               <w:top w:val="single" w:color="D2D2D7" w:sz="1"/>
               <w:left w:val="single" w:color="D2D2D7" w:sz="1"/>
@@ -5941,7 +6281,7 @@
                 <w:sz w:val="20"/>
                 <w:szCs w:val="20"/>
               </w:rPr>
-              <w:t xml:space="preserve">High-level performance data. Spot trends, identify top clients, track team efficiency.</w:t>
+              <w:t xml:space="preserve">Clear visibility on what to work on next</w:t>
             </w:r>
           </w:p>
         </w:tc>
@@ -5976,21 +6316,7 @@
           <w:b/>
           <w:bCs/>
         </w:rPr>
-        <w:t xml:space="preserve">Current Status</w:t>
-      </w:r>
-    </w:p>
-    <w:p>
-      <w:pPr>
-        <w:spacing w:after="120"/>
-      </w:pPr>
-      <w:r>
-        <w:rPr>
-          <w:rFonts w:ascii="Arial" w:cs="Arial" w:eastAsia="Arial" w:hAnsi="Arial"/>
-          <w:color w:val="1D1D1F"/>
-          <w:sz w:val="22"/>
-          <w:szCs w:val="22"/>
-        </w:rPr>
-        <w:t xml:space="preserve">The mockup has been reviewed and approved by the primary users:</w:t>
+        <w:t xml:space="preserve">Where we are now:</w:t>
       </w:r>
     </w:p>
     <w:p>
@@ -6008,7 +6334,7 @@
           <w:sz w:val="22"/>
           <w:szCs w:val="22"/>
         </w:rPr>
-        <w:t xml:space="preserve">Account Managers — Approved</w:t>
+        <w:t xml:space="preserve">All four layers (Clients, Services, Kanban, Analytics) are built as interactive mockups</w:t>
       </w:r>
     </w:p>
     <w:p>
@@ -6026,7 +6352,7 @@
           <w:sz w:val="22"/>
           <w:szCs w:val="22"/>
         </w:rPr>
-        <w:t xml:space="preserve">Project Managers — Approved</w:t>
+        <w:t xml:space="preserve">Mockups are live and accessible via the demo links on the cover page</w:t>
       </w:r>
     </w:p>
     <w:p>
@@ -6044,22 +6370,13 @@
           <w:sz w:val="22"/>
           <w:szCs w:val="22"/>
         </w:rPr>
-        <w:t xml:space="preserve">Production Team (Web Dev, Graphics Designer, Ad Specialist) — Approved</w:t>
+        <w:t xml:space="preserve">Account managers, project managers, and the production team have reviewed and approved the design</w:t>
       </w:r>
     </w:p>
     <w:p>
       <w:pPr>
         <w:spacing w:after="120"/>
       </w:pPr>
-      <w:r>
-        <w:rPr>
-          <w:rFonts w:ascii="Arial" w:cs="Arial" w:eastAsia="Arial" w:hAnsi="Arial"/>
-          <w:color w:val="1D1D1F"/>
-          <w:sz w:val="22"/>
-          <w:szCs w:val="22"/>
-        </w:rPr>
-        <w:t xml:space="preserve">All four pages are live and interactive as static mockups. A developer handoff document has been prepared with full technical specifications for implementation.</w:t>
-      </w:r>
     </w:p>
     <w:p>
       <w:pPr>
@@ -6070,7 +6387,7 @@
           <w:b/>
           <w:bCs/>
         </w:rPr>
-        <w:t xml:space="preserve">Proposed Next Steps</w:t>
+        <w:t xml:space="preserve">Next steps (pending CEO approval):</w:t>
       </w:r>
     </w:p>
     <w:p>
@@ -6085,20 +6402,10 @@
       <w:r>
         <w:rPr>
           <w:rFonts w:ascii="Arial" w:cs="Arial" w:eastAsia="Arial" w:hAnsi="Arial"/>
-          <w:b/>
-          <w:bCs/>
-          <w:sz w:val="22"/>
-          <w:szCs w:val="22"/>
-        </w:rPr>
-        <w:t xml:space="preserve">CEO Review &amp; Approval</w:t>
-      </w:r>
-      <w:r>
-        <w:rPr>
-          <w:rFonts w:ascii="Arial" w:cs="Arial" w:eastAsia="Arial" w:hAnsi="Arial"/>
-          <w:sz w:val="22"/>
-          <w:szCs w:val="22"/>
-        </w:rPr>
-        <w:t xml:space="preserve"> — Review the mockups using the demo links, provide feedback or approval.</w:t>
+          <w:sz w:val="22"/>
+          <w:szCs w:val="22"/>
+        </w:rPr>
+        <w:t xml:space="preserve">Begin development of the production application based on these approved mockups</w:t>
       </w:r>
     </w:p>
     <w:p>
@@ -6113,20 +6420,10 @@
       <w:r>
         <w:rPr>
           <w:rFonts w:ascii="Arial" w:cs="Arial" w:eastAsia="Arial" w:hAnsi="Arial"/>
-          <w:b/>
-          <w:bCs/>
-          <w:sz w:val="22"/>
-          <w:szCs w:val="22"/>
-        </w:rPr>
-        <w:t xml:space="preserve">Client Health Score</w:t>
-      </w:r>
-      <w:r>
-        <w:rPr>
-          <w:rFonts w:ascii="Arial" w:cs="Arial" w:eastAsia="Arial" w:hAnsi="Arial"/>
-          <w:sz w:val="22"/>
-          <w:szCs w:val="22"/>
-        </w:rPr>
-        <w:t xml:space="preserve"> — A formula-based health scoring system has been proposed (separate document). Pending manager approval on the calculation method.</w:t>
+          <w:sz w:val="22"/>
+          <w:szCs w:val="22"/>
+        </w:rPr>
+        <w:t xml:space="preserve">Set up the backend database and authentication system</w:t>
       </w:r>
     </w:p>
     <w:p>
@@ -6141,20 +6438,10 @@
       <w:r>
         <w:rPr>
           <w:rFonts w:ascii="Arial" w:cs="Arial" w:eastAsia="Arial" w:hAnsi="Arial"/>
-          <w:b/>
-          <w:bCs/>
-          <w:sz w:val="22"/>
-          <w:szCs w:val="22"/>
-        </w:rPr>
-        <w:t xml:space="preserve">Add Service Form</w:t>
-      </w:r>
-      <w:r>
-        <w:rPr>
-          <w:rFonts w:ascii="Arial" w:cs="Arial" w:eastAsia="Arial" w:hAnsi="Arial"/>
-          <w:sz w:val="22"/>
-          <w:szCs w:val="22"/>
-        </w:rPr>
-        <w:t xml:space="preserve"> — Fields have been defined for the “Add Service” function. Ready to build into the mockup.</w:t>
+          <w:sz w:val="22"/>
+          <w:szCs w:val="22"/>
+        </w:rPr>
+        <w:t xml:space="preserve">Build the client management layer first, then services, then kanban, following the same top-down structure</w:t>
       </w:r>
     </w:p>
     <w:p>
@@ -6169,74 +6456,51 @@
       <w:r>
         <w:rPr>
           <w:rFonts w:ascii="Arial" w:cs="Arial" w:eastAsia="Arial" w:hAnsi="Arial"/>
+          <w:sz w:val="22"/>
+          <w:szCs w:val="22"/>
+        </w:rPr>
+        <w:t xml:space="preserve">Integrate with existing tools (Xero for billing, Google Drive for documents, Slack for communications)</w:t>
+      </w:r>
+    </w:p>
+    <w:p>
+      <w:pPr>
+        <w:pStyle w:val="ListParagraph"/>
+        <w:numPr>
+          <w:ilvl w:val="0"/>
+          <w:numId w:val="2"/>
+        </w:numPr>
+        <w:spacing w:after="80"/>
+      </w:pPr>
+      <w:r>
+        <w:rPr>
+          <w:rFonts w:ascii="Arial" w:cs="Arial" w:eastAsia="Arial" w:hAnsi="Arial"/>
+          <w:sz w:val="22"/>
+          <w:szCs w:val="22"/>
+        </w:rPr>
+        <w:t xml:space="preserve">Roll out to the team in phases, starting with account managers</w:t>
+      </w:r>
+    </w:p>
+    <w:p>
+      <w:pPr>
+        <w:spacing w:after="200"/>
+      </w:pPr>
+    </w:p>
+    <w:p>
+      <w:pPr>
+        <w:spacing w:after="120"/>
+      </w:pPr>
+      <w:r>
+        <w:rPr>
+          <w:rFonts w:ascii="Arial" w:cs="Arial" w:eastAsia="Arial" w:hAnsi="Arial"/>
           <w:b/>
           <w:bCs/>
-          <w:sz w:val="22"/>
-          <w:szCs w:val="22"/>
-        </w:rPr>
-        <w:t xml:space="preserve">Development</w:t>
-      </w:r>
-      <w:r>
-        <w:rPr>
-          <w:rFonts w:ascii="Arial" w:cs="Arial" w:eastAsia="Arial" w:hAnsi="Arial"/>
-          <w:sz w:val="22"/>
-          <w:szCs w:val="22"/>
-        </w:rPr>
-        <w:t xml:space="preserve"> — Once approved, the web dev team will implement the mockup into the live application using the handoff documentation.</w:t>
-      </w:r>
-    </w:p>
-    <w:p>
-      <w:pPr>
-        <w:spacing w:before="400"/>
-      </w:pPr>
-    </w:p>
-    <w:tbl>
-      <w:tblPr>
-        <w:tblW w:type="dxa" w:w="9360"/>
-        <w:tblBorders>
-          <w:top w:val="single" w:color="auto" w:sz="4"/>
-          <w:left w:val="single" w:color="auto" w:sz="4"/>
-          <w:bottom w:val="single" w:color="auto" w:sz="4"/>
-          <w:right w:val="single" w:color="auto" w:sz="4"/>
-          <w:insideH w:val="single" w:color="auto" w:sz="4"/>
-          <w:insideV w:val="single" w:color="auto" w:sz="4"/>
-        </w:tblBorders>
-      </w:tblPr>
-      <w:tblGrid>
-        <w:gridCol w:w="9360"/>
-      </w:tblGrid>
-      <w:tr>
-        <w:tc>
-          <w:tcPr>
-            <w:tcW w:type="dxa" w:w="9360"/>
-            <w:tcBorders>
-              <w:top w:val="single" w:color="1A8D44" w:sz="2"/>
-              <w:left w:val="single" w:color="1A8D44" w:sz="8"/>
-              <w:bottom w:val="single" w:color="1A8D44" w:sz="2"/>
-              <w:right w:val="single" w:color="1A8D44" w:sz="2"/>
-            </w:tcBorders>
-            <w:shd w:fill="E8F8EE" w:val="clear"/>
-            <w:tcMar>
-              <w:top w:type="dxa" w:w="120"/>
-              <w:left w:type="dxa" w:w="200"/>
-              <w:bottom w:type="dxa" w:w="120"/>
-              <w:right w:type="dxa" w:w="160"/>
-            </w:tcMar>
-          </w:tcPr>
-          <w:p>
-            <w:r>
-              <w:rPr>
-                <w:rFonts w:ascii="Arial" w:cs="Arial" w:eastAsia="Arial" w:hAnsi="Arial"/>
-                <w:color w:val="1A8D44"/>
-                <w:sz w:val="21"/>
-                <w:szCs w:val="21"/>
-              </w:rPr>
-              <w:t xml:space="preserve">For questions or feedback, reach out to Nikko Trinidad. All demo links are live and can be shared with stakeholders.</w:t>
-            </w:r>
-          </w:p>
-        </w:tc>
-      </w:tr>
-    </w:tbl>
+          <w:color w:val="1D1D1F"/>
+          <w:sz w:val="22"/>
+          <w:szCs w:val="22"/>
+        </w:rPr>
+        <w:t xml:space="preserve">The mockups represent the agreed-upon design direction. Development can begin immediately upon approval.</w:t>
+      </w:r>
+    </w:p>
     <w:sectPr>
       <w:headerReference w:type="default" r:id="rId7"/>
       <w:footerReference w:type="default" r:id="rId8"/>

</xml_diff>

<commit_message>
Soften CEO process language in executive overview
Changed "hijacks the process" to "steps into the process without full
context" to frame it as a visibility gap rather than blame.

Co-Authored-By: Claude Opus 4.6 <noreply@anthropic.com>
</commit_message>
<xml_diff>
--- a/ProjectFlow-Executive-Overview.docx
+++ b/ProjectFlow-Executive-Overview.docx
@@ -162,7 +162,7 @@
               </w:rPr>
               <w:t xml:space="preserve">Clients Layer: </w:t>
             </w:r>
-            <w:hyperlink w:history="1" r:id="rIdvybcu-mpbhhf1r1dcvs69">
+            <w:hyperlink w:history="1" r:id="rIdunba5zbtirueqmwgawjkc">
               <w:r>
                 <w:rPr>
                   <w:rStyle w:val="Hyperlink"/>
@@ -188,7 +188,7 @@
               </w:rPr>
               <w:t xml:space="preserve">Services Layer: </w:t>
             </w:r>
-            <w:hyperlink w:history="1" r:id="rIdy3fxqy6dzlt4mzeccfi3e">
+            <w:hyperlink w:history="1" r:id="rIdl492wmmjzfweoigl-la5e">
               <w:r>
                 <w:rPr>
                   <w:rStyle w:val="Hyperlink"/>
@@ -214,7 +214,7 @@
               </w:rPr>
               <w:t xml:space="preserve">Kanban Layer: </w:t>
             </w:r>
-            <w:hyperlink w:history="1" r:id="rId3qghcugltmlnbxjdhtluq">
+            <w:hyperlink w:history="1" r:id="rIde-o7ohuzdnhfa6ze5-yud">
               <w:r>
                 <w:rPr>
                   <w:rStyle w:val="Hyperlink"/>
@@ -237,7 +237,7 @@
               </w:rPr>
               <w:t xml:space="preserve">Analytics Layer: </w:t>
             </w:r>
-            <w:hyperlink w:history="1" r:id="rIddbguv-z7uosvi-nomxzg5">
+            <w:hyperlink w:history="1" r:id="rIdy7jqv3pddyuoxjfi8r2pa">
               <w:r>
                 <w:rPr>
                   <w:rStyle w:val="Hyperlink"/>
@@ -621,7 +621,7 @@
           <w:b/>
           <w:bCs/>
         </w:rPr>
-        <w:t xml:space="preserve">1. The CEO sometimes hijacks the process.</w:t>
+        <w:t xml:space="preserve">1. The CEO sometimes steps into the process without full context.</w:t>
       </w:r>
     </w:p>
     <w:p>
@@ -1058,7 +1058,7 @@
             </w:r>
           </w:p>
           <w:p>
-            <w:hyperlink w:history="1" r:id="rIdlopi7pkfe7dkbk-qe36mw">
+            <w:hyperlink w:history="1" r:id="rIdk5x4t3ov52ljwdgzr6upz">
               <w:r>
                 <w:rPr>
                   <w:rStyle w:val="Hyperlink"/>
@@ -2082,7 +2082,7 @@
             </w:r>
           </w:p>
           <w:p>
-            <w:hyperlink w:history="1" r:id="rIdhmsdvpkgkpf_hvdfn3v_-">
+            <w:hyperlink w:history="1" r:id="rIdhhtznqqjrdi2gukyc1yos">
               <w:r>
                 <w:rPr>
                   <w:rStyle w:val="Hyperlink"/>
@@ -3162,7 +3162,7 @@
             </w:r>
           </w:p>
           <w:p>
-            <w:hyperlink w:history="1" r:id="rIdi-drhv0vjkcme-2e4kh27">
+            <w:hyperlink w:history="1" r:id="rIdldtik7inwvg-bqmyla1lj">
               <w:r>
                 <w:rPr>
                   <w:rStyle w:val="Hyperlink"/>
@@ -3986,7 +3986,7 @@
             </w:r>
           </w:p>
           <w:p>
-            <w:hyperlink w:history="1" r:id="rIdayhrjcnk39bt6r3mk0w-t">
+            <w:hyperlink w:history="1" r:id="rIdj8scrgxolntpvejyd_fmc">
               <w:r>
                 <w:rPr>
                   <w:rStyle w:val="Hyperlink"/>

</xml_diff>

<commit_message>
Redesign CEO document with new design language
Applied document-design-language.md skill:
- Cover: 72pt title, 28pt subtitle, accent rule divider
- Headings: H1 22pt, H2 16pt, H3 13pt (bigger jumps)
- Spacing: generous whitespace throughout (160 after body, 280 dividers)
- Callout boxes: thick left accent stripe (8pt blue left border)
- Tables: lighter borders, more cell padding
- Section dividers: thicker accent rules (12pt)
- Screenshot containers: 1pt light gray borders
- TOC: proper indent hierarchy instead of spaces

Co-Authored-By: Claude Opus 4.6 <noreply@anthropic.com>
</commit_message>
<xml_diff>
--- a/ProjectFlow-Executive-Overview.docx
+++ b/ProjectFlow-Executive-Overview.docx
@@ -4,12 +4,12 @@
   <w:body>
     <w:p>
       <w:pPr>
-        <w:spacing w:before="2000"/>
-      </w:pPr>
-    </w:p>
-    <w:p>
-      <w:pPr>
-        <w:spacing w:after="160"/>
+        <w:spacing w:before="3200"/>
+      </w:pPr>
+    </w:p>
+    <w:p>
+      <w:pPr>
+        <w:spacing w:after="120"/>
         <w:jc w:val="center"/>
       </w:pPr>
       <w:r>
@@ -18,30 +18,39 @@
           <w:b/>
           <w:bCs/>
           <w:color w:val="1D1D1F"/>
+          <w:sz w:val="144"/>
+          <w:szCs w:val="144"/>
+        </w:rPr>
+        <w:t xml:space="preserve">ProjectFlow</w:t>
+      </w:r>
+    </w:p>
+    <w:p>
+      <w:pPr>
+        <w:spacing w:after="200"/>
+        <w:jc w:val="center"/>
+      </w:pPr>
+      <w:r>
+        <w:rPr>
+          <w:rFonts w:ascii="Arial" w:cs="Arial" w:eastAsia="Arial" w:hAnsi="Arial"/>
+          <w:color w:val="0071E3"/>
           <w:sz w:val="56"/>
           <w:szCs w:val="56"/>
         </w:rPr>
-        <w:t xml:space="preserve">ProjectFlow</w:t>
-      </w:r>
-    </w:p>
-    <w:p>
-      <w:pPr>
-        <w:spacing w:after="120"/>
+        <w:t xml:space="preserve">Project Management Tool</w:t>
+      </w:r>
+    </w:p>
+    <w:p>
+      <w:pPr>
+        <w:pBdr>
+          <w:bottom w:val="single" w:color="0071E3" w:sz="8" w:space="1"/>
+        </w:pBdr>
+        <w:spacing w:after="200" w:before="200"/>
         <w:jc w:val="center"/>
       </w:pPr>
-      <w:r>
-        <w:rPr>
-          <w:rFonts w:ascii="Arial" w:cs="Arial" w:eastAsia="Arial" w:hAnsi="Arial"/>
-          <w:color w:val="0071E3"/>
-          <w:sz w:val="32"/>
-          <w:szCs w:val="32"/>
-        </w:rPr>
-        <w:t xml:space="preserve">Project Management Tool</w:t>
-      </w:r>
-    </w:p>
-    <w:p>
-      <w:pPr>
-        <w:spacing w:after="600"/>
+    </w:p>
+    <w:p>
+      <w:pPr>
+        <w:spacing w:after="160"/>
         <w:jc w:val="center"/>
       </w:pPr>
       <w:r>
@@ -56,7 +65,7 @@
     </w:p>
     <w:p>
       <w:pPr>
-        <w:spacing w:after="80"/>
+        <w:spacing w:after="100"/>
         <w:jc w:val="center"/>
       </w:pPr>
       <w:r>
@@ -71,7 +80,7 @@
     </w:p>
     <w:p>
       <w:pPr>
-        <w:spacing w:after="80"/>
+        <w:spacing w:after="100"/>
         <w:jc w:val="center"/>
       </w:pPr>
       <w:r>
@@ -86,7 +95,7 @@
     </w:p>
     <w:p>
       <w:pPr>
-        <w:spacing w:after="1200"/>
+        <w:spacing w:after="800"/>
         <w:jc w:val="center"/>
       </w:pPr>
       <w:r>
@@ -119,15 +128,15 @@
           <w:tcPr>
             <w:tcW w:type="dxa" w:w="9360"/>
             <w:tcBorders>
-              <w:top w:val="single" w:color="0071E3" w:sz="4"/>
-              <w:left w:val="single" w:color="0071E3" w:sz="4"/>
-              <w:bottom w:val="single" w:color="0071E3" w:sz="4"/>
-              <w:right w:val="single" w:color="0071E3" w:sz="4"/>
-            </w:tcBorders>
-            <w:shd w:fill="F5F5F7" w:val="clear"/>
+              <w:top w:val="single" w:color="0071E3" w:sz="2"/>
+              <w:left w:val="single" w:color="0071E3" w:sz="8"/>
+              <w:bottom w:val="single" w:color="0071E3" w:sz="2"/>
+              <w:right w:val="single" w:color="0071E3" w:sz="2"/>
+            </w:tcBorders>
+            <w:shd w:fill="E8F0FF" w:val="clear"/>
             <w:tcMar>
               <w:top w:type="dxa" w:w="160"/>
-              <w:left w:type="dxa" w:w="200"/>
+              <w:left w:type="dxa" w:w="240"/>
               <w:bottom w:type="dxa" w:w="160"/>
               <w:right w:type="dxa" w:w="200"/>
             </w:tcMar>
@@ -162,7 +171,7 @@
               </w:rPr>
               <w:t xml:space="preserve">Clients Layer: </w:t>
             </w:r>
-            <w:hyperlink w:history="1" r:id="rIdcw82s74dtosdaxi4ivikc">
+            <w:hyperlink w:history="1" r:id="rIdb5mxten-vagq3rvm-xfqe">
               <w:r>
                 <w:rPr>
                   <w:rStyle w:val="Hyperlink"/>
@@ -188,7 +197,7 @@
               </w:rPr>
               <w:t xml:space="preserve">Services Layer: </w:t>
             </w:r>
-            <w:hyperlink w:history="1" r:id="rIddk0ix79y3z9a_e2lhusni">
+            <w:hyperlink w:history="1" r:id="rId4ce5q7yiwxyjyzysktywd">
               <w:r>
                 <w:rPr>
                   <w:rStyle w:val="Hyperlink"/>
@@ -214,7 +223,7 @@
               </w:rPr>
               <w:t xml:space="preserve">Kanban Layer: </w:t>
             </w:r>
-            <w:hyperlink w:history="1" r:id="rIdchw2usan9azd275ugyqhm">
+            <w:hyperlink w:history="1" r:id="rIdjchnjfy5zwvugpwmt8pbi">
               <w:r>
                 <w:rPr>
                   <w:rStyle w:val="Hyperlink"/>
@@ -237,7 +246,7 @@
               </w:rPr>
               <w:t xml:space="preserve">Analytics Layer: </w:t>
             </w:r>
-            <w:hyperlink w:history="1" r:id="rId47hpahghlebemtjrwewtz">
+            <w:hyperlink w:history="1" r:id="rIdlxqir29jkfk3jr0qu9l1b">
               <w:r>
                 <w:rPr>
                   <w:rStyle w:val="Hyperlink"/>
@@ -271,7 +280,7 @@
     </w:p>
     <w:p>
       <w:pPr>
-        <w:spacing w:after="80"/>
+        <w:spacing w:after="100"/>
       </w:pPr>
       <w:r>
         <w:rPr>
@@ -284,7 +293,7 @@
     </w:p>
     <w:p>
       <w:pPr>
-        <w:spacing w:after="80"/>
+        <w:spacing w:after="100"/>
       </w:pPr>
       <w:r>
         <w:rPr>
@@ -297,7 +306,7 @@
     </w:p>
     <w:p>
       <w:pPr>
-        <w:spacing w:after="80"/>
+        <w:spacing w:after="100"/>
       </w:pPr>
       <w:r>
         <w:rPr>
@@ -310,7 +319,8 @@
     </w:p>
     <w:p>
       <w:pPr>
-        <w:spacing w:after="40"/>
+        <w:spacing w:after="60"/>
+        <w:ind w:left="360"/>
       </w:pPr>
       <w:r>
         <w:rPr>
@@ -319,12 +329,13 @@
           <w:sz w:val="22"/>
           <w:szCs w:val="22"/>
         </w:rPr>
-        <w:t xml:space="preserve">    3.1 Layer 1: Clients</w:t>
-      </w:r>
-    </w:p>
-    <w:p>
-      <w:pPr>
-        <w:spacing w:after="40"/>
+        <w:t xml:space="preserve">3.1 Layer 1: Clients</w:t>
+      </w:r>
+    </w:p>
+    <w:p>
+      <w:pPr>
+        <w:spacing w:after="60"/>
+        <w:ind w:left="360"/>
       </w:pPr>
       <w:r>
         <w:rPr>
@@ -333,12 +344,13 @@
           <w:sz w:val="22"/>
           <w:szCs w:val="22"/>
         </w:rPr>
-        <w:t xml:space="preserve">    3.2 Layer 2: Client Dashboard &amp; Services</w:t>
-      </w:r>
-    </w:p>
-    <w:p>
-      <w:pPr>
-        <w:spacing w:after="40"/>
+        <w:t xml:space="preserve">3.2 Layer 2: Client Dashboard &amp; Services</w:t>
+      </w:r>
+    </w:p>
+    <w:p>
+      <w:pPr>
+        <w:spacing w:after="60"/>
+        <w:ind w:left="360"/>
       </w:pPr>
       <w:r>
         <w:rPr>
@@ -347,12 +359,13 @@
           <w:sz w:val="22"/>
           <w:szCs w:val="22"/>
         </w:rPr>
-        <w:t xml:space="preserve">    3.3 Layer 3: Kanban Board</w:t>
-      </w:r>
-    </w:p>
-    <w:p>
-      <w:pPr>
-        <w:spacing w:after="40"/>
+        <w:t xml:space="preserve">3.3 Layer 3: Kanban Board</w:t>
+      </w:r>
+    </w:p>
+    <w:p>
+      <w:pPr>
+        <w:spacing w:after="60"/>
+        <w:ind w:left="360"/>
       </w:pPr>
       <w:r>
         <w:rPr>
@@ -361,12 +374,12 @@
           <w:sz w:val="22"/>
           <w:szCs w:val="22"/>
         </w:rPr>
-        <w:t xml:space="preserve">    3.4 Analytics</w:t>
-      </w:r>
-    </w:p>
-    <w:p>
-      <w:pPr>
-        <w:spacing w:after="80"/>
+        <w:t xml:space="preserve">3.4 Analytics</w:t>
+      </w:r>
+    </w:p>
+    <w:p>
+      <w:pPr>
+        <w:spacing w:after="100"/>
       </w:pPr>
       <w:r>
         <w:rPr>
@@ -379,7 +392,7 @@
     </w:p>
     <w:p>
       <w:pPr>
-        <w:spacing w:after="80"/>
+        <w:spacing w:after="100"/>
       </w:pPr>
       <w:r>
         <w:rPr>
@@ -392,7 +405,7 @@
     </w:p>
     <w:p>
       <w:pPr>
-        <w:spacing w:after="80"/>
+        <w:spacing w:after="100"/>
       </w:pPr>
       <w:r>
         <w:rPr>
@@ -405,7 +418,7 @@
     </w:p>
     <w:p>
       <w:pPr>
-        <w:spacing w:after="80"/>
+        <w:spacing w:after="100"/>
       </w:pPr>
       <w:r>
         <w:rPr>
@@ -435,7 +448,7 @@
     </w:p>
     <w:p>
       <w:pPr>
-        <w:spacing w:after="120"/>
+        <w:spacing w:after="160"/>
       </w:pPr>
       <w:r>
         <w:rPr>
@@ -449,7 +462,7 @@
     </w:p>
     <w:p>
       <w:pPr>
-        <w:spacing w:after="120"/>
+        <w:spacing w:after="160"/>
       </w:pPr>
       <w:r>
         <w:rPr>
@@ -463,7 +476,7 @@
     </w:p>
     <w:p>
       <w:pPr>
-        <w:spacing w:after="120"/>
+        <w:spacing w:after="160"/>
       </w:pPr>
       <w:r>
         <w:rPr>
@@ -482,7 +495,7 @@
           <w:ilvl w:val="0"/>
           <w:numId w:val="2"/>
         </w:numPr>
-        <w:spacing w:after="80"/>
+        <w:spacing w:after="100"/>
       </w:pPr>
       <w:r>
         <w:rPr>
@@ -510,7 +523,7 @@
           <w:ilvl w:val="0"/>
           <w:numId w:val="2"/>
         </w:numPr>
-        <w:spacing w:after="80"/>
+        <w:spacing w:after="100"/>
       </w:pPr>
       <w:r>
         <w:rPr>
@@ -538,7 +551,7 @@
           <w:ilvl w:val="0"/>
           <w:numId w:val="2"/>
         </w:numPr>
-        <w:spacing w:after="80"/>
+        <w:spacing w:after="100"/>
       </w:pPr>
       <w:r>
         <w:rPr>
@@ -561,7 +574,7 @@
     </w:p>
     <w:p>
       <w:pPr>
-        <w:spacing w:after="120"/>
+        <w:spacing w:after="160"/>
       </w:pPr>
       <w:r>
         <w:rPr>
@@ -576,9 +589,9 @@
     <w:p>
       <w:pPr>
         <w:pBdr>
-          <w:bottom w:val="single" w:color="0071E3" w:sz="6" w:space="1"/>
+          <w:bottom w:val="single" w:color="0071E3" w:sz="12" w:space="1"/>
         </w:pBdr>
-        <w:spacing w:after="200" w:before="200"/>
+        <w:spacing w:after="280" w:before="280"/>
       </w:pPr>
     </w:p>
     <w:p>
@@ -595,7 +608,7 @@
     </w:p>
     <w:p>
       <w:pPr>
-        <w:spacing w:after="120"/>
+        <w:spacing w:after="160"/>
       </w:pPr>
       <w:r>
         <w:rPr>
@@ -626,7 +639,7 @@
     </w:p>
     <w:p>
       <w:pPr>
-        <w:spacing w:after="120"/>
+        <w:spacing w:after="160"/>
       </w:pPr>
       <w:r>
         <w:rPr>
@@ -652,7 +665,7 @@
     </w:p>
     <w:p>
       <w:pPr>
-        <w:spacing w:after="120"/>
+        <w:spacing w:after="160"/>
       </w:pPr>
       <w:r>
         <w:rPr>
@@ -678,7 +691,7 @@
     </w:p>
     <w:p>
       <w:pPr>
-        <w:spacing w:after="120"/>
+        <w:spacing w:after="160"/>
       </w:pPr>
       <w:r>
         <w:rPr>
@@ -704,7 +717,7 @@
     </w:p>
     <w:p>
       <w:pPr>
-        <w:spacing w:after="120"/>
+        <w:spacing w:after="160"/>
       </w:pPr>
       <w:r>
         <w:rPr>
@@ -730,7 +743,7 @@
     </w:p>
     <w:p>
       <w:pPr>
-        <w:spacing w:after="120"/>
+        <w:spacing w:after="160"/>
       </w:pPr>
       <w:r>
         <w:rPr>
@@ -756,7 +769,7 @@
     </w:p>
     <w:p>
       <w:pPr>
-        <w:spacing w:after="120"/>
+        <w:spacing w:after="160"/>
       </w:pPr>
       <w:r>
         <w:rPr>
@@ -782,7 +795,7 @@
     </w:p>
     <w:p>
       <w:pPr>
-        <w:spacing w:after="120"/>
+        <w:spacing w:after="160"/>
       </w:pPr>
       <w:r>
         <w:rPr>
@@ -808,26 +821,26 @@
     </w:p>
     <w:p>
       <w:pPr>
+        <w:spacing w:after="160"/>
+      </w:pPr>
+      <w:r>
+        <w:rPr>
+          <w:rFonts w:ascii="Arial" w:cs="Arial" w:eastAsia="Arial" w:hAnsi="Arial"/>
+          <w:color w:val="1D1D1F"/>
+          <w:sz w:val="22"/>
+          <w:szCs w:val="22"/>
+        </w:rPr>
+        <w:t xml:space="preserve">They’re managing client relationships (which they’re good at), but they’re also expected to manage projects without the right tools or framework. ProjectFlow gives them a structured system to follow so they don’t have to figure it out on their own.</w:t>
+      </w:r>
+    </w:p>
+    <w:p>
+      <w:pPr>
         <w:spacing w:after="120"/>
       </w:pPr>
-      <w:r>
-        <w:rPr>
-          <w:rFonts w:ascii="Arial" w:cs="Arial" w:eastAsia="Arial" w:hAnsi="Arial"/>
-          <w:color w:val="1D1D1F"/>
-          <w:sz w:val="22"/>
-          <w:szCs w:val="22"/>
-        </w:rPr>
-        <w:t xml:space="preserve">They’re managing client relationships (which they’re good at), but they’re also expected to manage projects without the right tools or framework. ProjectFlow gives them a structured system to follow so they don’t have to figure it out on their own.</w:t>
-      </w:r>
-    </w:p>
-    <w:p>
-      <w:pPr>
-        <w:spacing w:after="120"/>
-      </w:pPr>
-    </w:p>
-    <w:p>
-      <w:pPr>
-        <w:spacing w:after="120"/>
+    </w:p>
+    <w:p>
+      <w:pPr>
+        <w:spacing w:after="160"/>
       </w:pPr>
       <w:r>
         <w:rPr>
@@ -844,9 +857,9 @@
     <w:p>
       <w:pPr>
         <w:pBdr>
-          <w:bottom w:val="single" w:color="0071E3" w:sz="6" w:space="1"/>
+          <w:bottom w:val="single" w:color="0071E3" w:sz="12" w:space="1"/>
         </w:pBdr>
-        <w:spacing w:after="200" w:before="200"/>
+        <w:spacing w:after="280" w:before="280"/>
       </w:pPr>
     </w:p>
     <w:p>
@@ -863,7 +876,7 @@
     </w:p>
     <w:p>
       <w:pPr>
-        <w:spacing w:after="120"/>
+        <w:spacing w:after="160"/>
       </w:pPr>
       <w:r>
         <w:rPr>
@@ -877,7 +890,7 @@
     </w:p>
     <w:p>
       <w:pPr>
-        <w:spacing w:after="120"/>
+        <w:spacing w:after="160"/>
       </w:pPr>
       <w:r>
         <w:rPr>
@@ -914,16 +927,16 @@
           <w:tcPr>
             <w:tcW w:type="dxa" w:w="9360"/>
             <w:tcBorders>
-              <w:top w:val="single" w:color="D2D2D7" w:sz="2"/>
-              <w:left w:val="single" w:color="D2D2D7" w:sz="2"/>
-              <w:bottom w:val="single" w:color="D2D2D7" w:sz="2"/>
-              <w:right w:val="single" w:color="D2D2D7" w:sz="2"/>
-            </w:tcBorders>
-            <w:tcMar>
-              <w:top w:type="dxa" w:w="80"/>
-              <w:left w:type="dxa" w:w="80"/>
-              <w:bottom w:type="dxa" w:w="80"/>
-              <w:right w:type="dxa" w:w="80"/>
+              <w:top w:val="single" w:color="D2D2D7" w:sz="1"/>
+              <w:left w:val="single" w:color="D2D2D7" w:sz="1"/>
+              <w:bottom w:val="single" w:color="D2D2D7" w:sz="1"/>
+              <w:right w:val="single" w:color="D2D2D7" w:sz="1"/>
+            </w:tcBorders>
+            <w:tcMar>
+              <w:top w:type="dxa" w:w="100"/>
+              <w:left w:type="dxa" w:w="100"/>
+              <w:bottom w:type="dxa" w:w="100"/>
+              <w:right w:type="dxa" w:w="100"/>
             </w:tcMar>
           </w:tcPr>
           <w:p>
@@ -976,7 +989,7 @@
     </w:tbl>
     <w:p>
       <w:pPr>
-        <w:spacing w:after="200" w:before="40"/>
+        <w:spacing w:after="240" w:before="60"/>
         <w:jc w:val="center"/>
       </w:pPr>
       <w:r>
@@ -1028,17 +1041,17 @@
           <w:tcPr>
             <w:tcW w:type="dxa" w:w="9360"/>
             <w:tcBorders>
-              <w:top w:val="single" w:color="0071E3" w:sz="3"/>
-              <w:left w:val="single" w:color="0071E3" w:sz="3"/>
-              <w:bottom w:val="single" w:color="0071E3" w:sz="3"/>
-              <w:right w:val="single" w:color="0071E3" w:sz="3"/>
+              <w:top w:val="single" w:color="0071E3" w:sz="2"/>
+              <w:left w:val="single" w:color="0071E3" w:sz="8"/>
+              <w:bottom w:val="single" w:color="0071E3" w:sz="2"/>
+              <w:right w:val="single" w:color="0071E3" w:sz="2"/>
             </w:tcBorders>
             <w:shd w:fill="E8F0FF" w:val="clear"/>
             <w:tcMar>
-              <w:top w:type="dxa" w:w="120"/>
-              <w:left w:type="dxa" w:w="160"/>
-              <w:bottom w:type="dxa" w:w="120"/>
-              <w:right w:type="dxa" w:w="160"/>
+              <w:top w:type="dxa" w:w="160"/>
+              <w:left w:type="dxa" w:w="240"/>
+              <w:bottom w:type="dxa" w:w="160"/>
+              <w:right w:type="dxa" w:w="200"/>
             </w:tcMar>
           </w:tcPr>
           <w:p>
@@ -1058,7 +1071,7 @@
             </w:r>
           </w:p>
           <w:p>
-            <w:hyperlink w:history="1" r:id="rId_gm4tddkavh0gj9vea9qy">
+            <w:hyperlink w:history="1" r:id="rIdjinyzzuzyq43kktgnfhav">
               <w:r>
                 <w:rPr>
                   <w:rStyle w:val="Hyperlink"/>
@@ -1080,7 +1093,7 @@
     </w:p>
     <w:p>
       <w:pPr>
-        <w:spacing w:after="120"/>
+        <w:spacing w:after="160"/>
       </w:pPr>
       <w:r>
         <w:rPr>
@@ -1111,7 +1124,7 @@
           <w:ilvl w:val="0"/>
           <w:numId w:val="3"/>
         </w:numPr>
-        <w:spacing w:after="60"/>
+        <w:spacing w:after="80"/>
       </w:pPr>
       <w:r>
         <w:rPr>
@@ -1129,7 +1142,7 @@
           <w:ilvl w:val="0"/>
           <w:numId w:val="3"/>
         </w:numPr>
-        <w:spacing w:after="60"/>
+        <w:spacing w:after="80"/>
       </w:pPr>
       <w:r>
         <w:rPr>
@@ -1147,7 +1160,7 @@
           <w:ilvl w:val="0"/>
           <w:numId w:val="3"/>
         </w:numPr>
-        <w:spacing w:after="60"/>
+        <w:spacing w:after="80"/>
       </w:pPr>
       <w:r>
         <w:rPr>
@@ -1165,7 +1178,7 @@
           <w:ilvl w:val="0"/>
           <w:numId w:val="3"/>
         </w:numPr>
-        <w:spacing w:after="60"/>
+        <w:spacing w:after="80"/>
       </w:pPr>
       <w:r>
         <w:rPr>
@@ -1183,7 +1196,7 @@
           <w:ilvl w:val="0"/>
           <w:numId w:val="3"/>
         </w:numPr>
-        <w:spacing w:after="60"/>
+        <w:spacing w:after="80"/>
       </w:pPr>
       <w:r>
         <w:rPr>
@@ -1208,7 +1221,7 @@
     </w:p>
     <w:p>
       <w:pPr>
-        <w:spacing w:after="120"/>
+        <w:spacing w:after="160"/>
       </w:pPr>
       <w:r>
         <w:rPr>
@@ -1240,16 +1253,16 @@
           <w:tcPr>
             <w:tcW w:type="dxa" w:w="9360"/>
             <w:tcBorders>
-              <w:top w:val="single" w:color="D2D2D7" w:sz="2"/>
-              <w:left w:val="single" w:color="D2D2D7" w:sz="2"/>
-              <w:bottom w:val="single" w:color="D2D2D7" w:sz="2"/>
-              <w:right w:val="single" w:color="D2D2D7" w:sz="2"/>
-            </w:tcBorders>
-            <w:tcMar>
-              <w:top w:type="dxa" w:w="80"/>
-              <w:left w:type="dxa" w:w="80"/>
-              <w:bottom w:type="dxa" w:w="80"/>
-              <w:right w:type="dxa" w:w="80"/>
+              <w:top w:val="single" w:color="D2D2D7" w:sz="1"/>
+              <w:left w:val="single" w:color="D2D2D7" w:sz="1"/>
+              <w:bottom w:val="single" w:color="D2D2D7" w:sz="1"/>
+              <w:right w:val="single" w:color="D2D2D7" w:sz="1"/>
+            </w:tcBorders>
+            <w:tcMar>
+              <w:top w:type="dxa" w:w="100"/>
+              <w:left w:type="dxa" w:w="100"/>
+              <w:bottom w:type="dxa" w:w="100"/>
+              <w:right w:type="dxa" w:w="100"/>
             </w:tcMar>
           </w:tcPr>
           <w:p>
@@ -1302,7 +1315,7 @@
     </w:tbl>
     <w:p>
       <w:pPr>
-        <w:spacing w:after="200" w:before="40"/>
+        <w:spacing w:after="240" w:before="60"/>
         <w:jc w:val="center"/>
       </w:pPr>
       <w:r>
@@ -1331,7 +1344,7 @@
     </w:p>
     <w:p>
       <w:pPr>
-        <w:spacing w:after="120"/>
+        <w:spacing w:after="160"/>
       </w:pPr>
       <w:r>
         <w:rPr>
@@ -1363,16 +1376,16 @@
           <w:tcPr>
             <w:tcW w:type="dxa" w:w="9360"/>
             <w:tcBorders>
-              <w:top w:val="single" w:color="D2D2D7" w:sz="2"/>
-              <w:left w:val="single" w:color="D2D2D7" w:sz="2"/>
-              <w:bottom w:val="single" w:color="D2D2D7" w:sz="2"/>
-              <w:right w:val="single" w:color="D2D2D7" w:sz="2"/>
-            </w:tcBorders>
-            <w:tcMar>
-              <w:top w:type="dxa" w:w="80"/>
-              <w:left w:type="dxa" w:w="80"/>
-              <w:bottom w:type="dxa" w:w="80"/>
-              <w:right w:type="dxa" w:w="80"/>
+              <w:top w:val="single" w:color="D2D2D7" w:sz="1"/>
+              <w:left w:val="single" w:color="D2D2D7" w:sz="1"/>
+              <w:bottom w:val="single" w:color="D2D2D7" w:sz="1"/>
+              <w:right w:val="single" w:color="D2D2D7" w:sz="1"/>
+            </w:tcBorders>
+            <w:tcMar>
+              <w:top w:type="dxa" w:w="100"/>
+              <w:left w:type="dxa" w:w="100"/>
+              <w:bottom w:type="dxa" w:w="100"/>
+              <w:right w:type="dxa" w:w="100"/>
             </w:tcMar>
           </w:tcPr>
           <w:p>
@@ -1425,7 +1438,7 @@
     </w:tbl>
     <w:p>
       <w:pPr>
-        <w:spacing w:after="200" w:before="40"/>
+        <w:spacing w:after="240" w:before="60"/>
         <w:jc w:val="center"/>
       </w:pPr>
       <w:r>
@@ -1480,10 +1493,10 @@
             </w:tcBorders>
             <w:shd w:fill="E8F0FF" w:val="clear"/>
             <w:tcMar>
-              <w:top w:type="dxa" w:w="80"/>
-              <w:left w:type="dxa" w:w="120"/>
-              <w:bottom w:type="dxa" w:w="80"/>
-              <w:right w:type="dxa" w:w="120"/>
+              <w:top w:type="dxa" w:w="100"/>
+              <w:left w:type="dxa" w:w="160"/>
+              <w:bottom w:type="dxa" w:w="100"/>
+              <w:right w:type="dxa" w:w="160"/>
             </w:tcMar>
           </w:tcPr>
           <w:p>
@@ -1514,10 +1527,10 @@
             </w:tcBorders>
             <w:shd w:fill="E8F0FF" w:val="clear"/>
             <w:tcMar>
-              <w:top w:type="dxa" w:w="80"/>
-              <w:left w:type="dxa" w:w="120"/>
-              <w:bottom w:type="dxa" w:w="80"/>
-              <w:right w:type="dxa" w:w="120"/>
+              <w:top w:type="dxa" w:w="100"/>
+              <w:left w:type="dxa" w:w="160"/>
+              <w:bottom w:type="dxa" w:w="100"/>
+              <w:right w:type="dxa" w:w="160"/>
             </w:tcMar>
           </w:tcPr>
           <w:p>
@@ -1549,10 +1562,10 @@
               <w:right w:val="single" w:color="D2D2D7" w:sz="1"/>
             </w:tcBorders>
             <w:tcMar>
-              <w:top w:type="dxa" w:w="80"/>
-              <w:left w:type="dxa" w:w="120"/>
-              <w:bottom w:type="dxa" w:w="80"/>
-              <w:right w:type="dxa" w:w="120"/>
+              <w:top w:type="dxa" w:w="100"/>
+              <w:left w:type="dxa" w:w="160"/>
+              <w:bottom w:type="dxa" w:w="100"/>
+              <w:right w:type="dxa" w:w="160"/>
             </w:tcMar>
           </w:tcPr>
           <w:p>
@@ -1582,10 +1595,10 @@
               <w:right w:val="single" w:color="D2D2D7" w:sz="1"/>
             </w:tcBorders>
             <w:tcMar>
-              <w:top w:type="dxa" w:w="80"/>
-              <w:left w:type="dxa" w:w="120"/>
-              <w:bottom w:type="dxa" w:w="80"/>
-              <w:right w:type="dxa" w:w="120"/>
+              <w:top w:type="dxa" w:w="100"/>
+              <w:left w:type="dxa" w:w="160"/>
+              <w:bottom w:type="dxa" w:w="100"/>
+              <w:right w:type="dxa" w:w="160"/>
             </w:tcMar>
           </w:tcPr>
           <w:p>
@@ -1617,10 +1630,10 @@
               <w:right w:val="single" w:color="D2D2D7" w:sz="1"/>
             </w:tcBorders>
             <w:tcMar>
-              <w:top w:type="dxa" w:w="80"/>
-              <w:left w:type="dxa" w:w="120"/>
-              <w:bottom w:type="dxa" w:w="80"/>
-              <w:right w:type="dxa" w:w="120"/>
+              <w:top w:type="dxa" w:w="100"/>
+              <w:left w:type="dxa" w:w="160"/>
+              <w:bottom w:type="dxa" w:w="100"/>
+              <w:right w:type="dxa" w:w="160"/>
             </w:tcMar>
           </w:tcPr>
           <w:p>
@@ -1650,10 +1663,10 @@
               <w:right w:val="single" w:color="D2D2D7" w:sz="1"/>
             </w:tcBorders>
             <w:tcMar>
-              <w:top w:type="dxa" w:w="80"/>
-              <w:left w:type="dxa" w:w="120"/>
-              <w:bottom w:type="dxa" w:w="80"/>
-              <w:right w:type="dxa" w:w="120"/>
+              <w:top w:type="dxa" w:w="100"/>
+              <w:left w:type="dxa" w:w="160"/>
+              <w:bottom w:type="dxa" w:w="100"/>
+              <w:right w:type="dxa" w:w="160"/>
             </w:tcMar>
           </w:tcPr>
           <w:p>
@@ -1685,10 +1698,10 @@
               <w:right w:val="single" w:color="D2D2D7" w:sz="1"/>
             </w:tcBorders>
             <w:tcMar>
-              <w:top w:type="dxa" w:w="80"/>
-              <w:left w:type="dxa" w:w="120"/>
-              <w:bottom w:type="dxa" w:w="80"/>
-              <w:right w:type="dxa" w:w="120"/>
+              <w:top w:type="dxa" w:w="100"/>
+              <w:left w:type="dxa" w:w="160"/>
+              <w:bottom w:type="dxa" w:w="100"/>
+              <w:right w:type="dxa" w:w="160"/>
             </w:tcMar>
           </w:tcPr>
           <w:p>
@@ -1718,10 +1731,10 @@
               <w:right w:val="single" w:color="D2D2D7" w:sz="1"/>
             </w:tcBorders>
             <w:tcMar>
-              <w:top w:type="dxa" w:w="80"/>
-              <w:left w:type="dxa" w:w="120"/>
-              <w:bottom w:type="dxa" w:w="80"/>
-              <w:right w:type="dxa" w:w="120"/>
+              <w:top w:type="dxa" w:w="100"/>
+              <w:left w:type="dxa" w:w="160"/>
+              <w:bottom w:type="dxa" w:w="100"/>
+              <w:right w:type="dxa" w:w="160"/>
             </w:tcMar>
           </w:tcPr>
           <w:p>
@@ -1753,10 +1766,10 @@
               <w:right w:val="single" w:color="D2D2D7" w:sz="1"/>
             </w:tcBorders>
             <w:tcMar>
-              <w:top w:type="dxa" w:w="80"/>
-              <w:left w:type="dxa" w:w="120"/>
-              <w:bottom w:type="dxa" w:w="80"/>
-              <w:right w:type="dxa" w:w="120"/>
+              <w:top w:type="dxa" w:w="100"/>
+              <w:left w:type="dxa" w:w="160"/>
+              <w:bottom w:type="dxa" w:w="100"/>
+              <w:right w:type="dxa" w:w="160"/>
             </w:tcMar>
           </w:tcPr>
           <w:p>
@@ -1786,10 +1799,10 @@
               <w:right w:val="single" w:color="D2D2D7" w:sz="1"/>
             </w:tcBorders>
             <w:tcMar>
-              <w:top w:type="dxa" w:w="80"/>
-              <w:left w:type="dxa" w:w="120"/>
-              <w:bottom w:type="dxa" w:w="80"/>
-              <w:right w:type="dxa" w:w="120"/>
+              <w:top w:type="dxa" w:w="100"/>
+              <w:left w:type="dxa" w:w="160"/>
+              <w:bottom w:type="dxa" w:w="100"/>
+              <w:right w:type="dxa" w:w="160"/>
             </w:tcMar>
           </w:tcPr>
           <w:p>
@@ -1821,10 +1834,10 @@
               <w:right w:val="single" w:color="D2D2D7" w:sz="1"/>
             </w:tcBorders>
             <w:tcMar>
-              <w:top w:type="dxa" w:w="80"/>
-              <w:left w:type="dxa" w:w="120"/>
-              <w:bottom w:type="dxa" w:w="80"/>
-              <w:right w:type="dxa" w:w="120"/>
+              <w:top w:type="dxa" w:w="100"/>
+              <w:left w:type="dxa" w:w="160"/>
+              <w:bottom w:type="dxa" w:w="100"/>
+              <w:right w:type="dxa" w:w="160"/>
             </w:tcMar>
           </w:tcPr>
           <w:p>
@@ -1854,10 +1867,10 @@
               <w:right w:val="single" w:color="D2D2D7" w:sz="1"/>
             </w:tcBorders>
             <w:tcMar>
-              <w:top w:type="dxa" w:w="80"/>
-              <w:left w:type="dxa" w:w="120"/>
-              <w:bottom w:type="dxa" w:w="80"/>
-              <w:right w:type="dxa" w:w="120"/>
+              <w:top w:type="dxa" w:w="100"/>
+              <w:left w:type="dxa" w:w="160"/>
+              <w:bottom w:type="dxa" w:w="100"/>
+              <w:right w:type="dxa" w:w="160"/>
             </w:tcMar>
           </w:tcPr>
           <w:p>
@@ -1889,10 +1902,10 @@
               <w:right w:val="single" w:color="D2D2D7" w:sz="1"/>
             </w:tcBorders>
             <w:tcMar>
-              <w:top w:type="dxa" w:w="80"/>
-              <w:left w:type="dxa" w:w="120"/>
-              <w:bottom w:type="dxa" w:w="80"/>
-              <w:right w:type="dxa" w:w="120"/>
+              <w:top w:type="dxa" w:w="100"/>
+              <w:left w:type="dxa" w:w="160"/>
+              <w:bottom w:type="dxa" w:w="100"/>
+              <w:right w:type="dxa" w:w="160"/>
             </w:tcMar>
           </w:tcPr>
           <w:p>
@@ -1922,10 +1935,10 @@
               <w:right w:val="single" w:color="D2D2D7" w:sz="1"/>
             </w:tcBorders>
             <w:tcMar>
-              <w:top w:type="dxa" w:w="80"/>
-              <w:left w:type="dxa" w:w="120"/>
-              <w:bottom w:type="dxa" w:w="80"/>
-              <w:right w:type="dxa" w:w="120"/>
+              <w:top w:type="dxa" w:w="100"/>
+              <w:left w:type="dxa" w:w="160"/>
+              <w:bottom w:type="dxa" w:w="100"/>
+              <w:right w:type="dxa" w:w="160"/>
             </w:tcMar>
           </w:tcPr>
           <w:p>
@@ -1957,10 +1970,10 @@
               <w:right w:val="single" w:color="D2D2D7" w:sz="1"/>
             </w:tcBorders>
             <w:tcMar>
-              <w:top w:type="dxa" w:w="80"/>
-              <w:left w:type="dxa" w:w="120"/>
-              <w:bottom w:type="dxa" w:w="80"/>
-              <w:right w:type="dxa" w:w="120"/>
+              <w:top w:type="dxa" w:w="100"/>
+              <w:left w:type="dxa" w:w="160"/>
+              <w:bottom w:type="dxa" w:w="100"/>
+              <w:right w:type="dxa" w:w="160"/>
             </w:tcMar>
           </w:tcPr>
           <w:p>
@@ -1990,10 +2003,10 @@
               <w:right w:val="single" w:color="D2D2D7" w:sz="1"/>
             </w:tcBorders>
             <w:tcMar>
-              <w:top w:type="dxa" w:w="80"/>
-              <w:left w:type="dxa" w:w="120"/>
-              <w:bottom w:type="dxa" w:w="80"/>
-              <w:right w:type="dxa" w:w="120"/>
+              <w:top w:type="dxa" w:w="100"/>
+              <w:left w:type="dxa" w:w="160"/>
+              <w:bottom w:type="dxa" w:w="100"/>
+              <w:right w:type="dxa" w:w="160"/>
             </w:tcMar>
           </w:tcPr>
           <w:p>
@@ -2052,17 +2065,17 @@
           <w:tcPr>
             <w:tcW w:type="dxa" w:w="9360"/>
             <w:tcBorders>
-              <w:top w:val="single" w:color="0071E3" w:sz="3"/>
-              <w:left w:val="single" w:color="0071E3" w:sz="3"/>
-              <w:bottom w:val="single" w:color="0071E3" w:sz="3"/>
-              <w:right w:val="single" w:color="0071E3" w:sz="3"/>
+              <w:top w:val="single" w:color="0071E3" w:sz="2"/>
+              <w:left w:val="single" w:color="0071E3" w:sz="8"/>
+              <w:bottom w:val="single" w:color="0071E3" w:sz="2"/>
+              <w:right w:val="single" w:color="0071E3" w:sz="2"/>
             </w:tcBorders>
             <w:shd w:fill="E8F0FF" w:val="clear"/>
             <w:tcMar>
-              <w:top w:type="dxa" w:w="120"/>
-              <w:left w:type="dxa" w:w="160"/>
-              <w:bottom w:type="dxa" w:w="120"/>
-              <w:right w:type="dxa" w:w="160"/>
+              <w:top w:type="dxa" w:w="160"/>
+              <w:left w:type="dxa" w:w="240"/>
+              <w:bottom w:type="dxa" w:w="160"/>
+              <w:right w:type="dxa" w:w="200"/>
             </w:tcMar>
           </w:tcPr>
           <w:p>
@@ -2082,7 +2095,7 @@
             </w:r>
           </w:p>
           <w:p>
-            <w:hyperlink w:history="1" r:id="rIdmnf_24nvha3ybbklr4zhh">
+            <w:hyperlink w:history="1" r:id="rIdyq8mnci7r4axnygmrqsny">
               <w:r>
                 <w:rPr>
                   <w:rStyle w:val="Hyperlink"/>
@@ -2104,7 +2117,7 @@
     </w:p>
     <w:p>
       <w:pPr>
-        <w:spacing w:after="120"/>
+        <w:spacing w:after="160"/>
       </w:pPr>
       <w:r>
         <w:rPr>
@@ -2130,7 +2143,7 @@
     </w:p>
     <w:p>
       <w:pPr>
-        <w:spacing w:after="120"/>
+        <w:spacing w:after="160"/>
       </w:pPr>
       <w:r>
         <w:rPr>
@@ -2162,16 +2175,16 @@
           <w:tcPr>
             <w:tcW w:type="dxa" w:w="9360"/>
             <w:tcBorders>
-              <w:top w:val="single" w:color="D2D2D7" w:sz="2"/>
-              <w:left w:val="single" w:color="D2D2D7" w:sz="2"/>
-              <w:bottom w:val="single" w:color="D2D2D7" w:sz="2"/>
-              <w:right w:val="single" w:color="D2D2D7" w:sz="2"/>
-            </w:tcBorders>
-            <w:tcMar>
-              <w:top w:type="dxa" w:w="80"/>
-              <w:left w:type="dxa" w:w="80"/>
-              <w:bottom w:type="dxa" w:w="80"/>
-              <w:right w:type="dxa" w:w="80"/>
+              <w:top w:val="single" w:color="D2D2D7" w:sz="1"/>
+              <w:left w:val="single" w:color="D2D2D7" w:sz="1"/>
+              <w:bottom w:val="single" w:color="D2D2D7" w:sz="1"/>
+              <w:right w:val="single" w:color="D2D2D7" w:sz="1"/>
+            </w:tcBorders>
+            <w:tcMar>
+              <w:top w:type="dxa" w:w="100"/>
+              <w:left w:type="dxa" w:w="100"/>
+              <w:bottom w:type="dxa" w:w="100"/>
+              <w:right w:type="dxa" w:w="100"/>
             </w:tcMar>
           </w:tcPr>
           <w:p>
@@ -2224,7 +2237,7 @@
     </w:tbl>
     <w:p>
       <w:pPr>
-        <w:spacing w:after="200" w:before="40"/>
+        <w:spacing w:after="240" w:before="60"/>
         <w:jc w:val="center"/>
       </w:pPr>
       <w:r>
@@ -2253,7 +2266,7 @@
     </w:p>
     <w:p>
       <w:pPr>
-        <w:spacing w:after="120"/>
+        <w:spacing w:after="160"/>
       </w:pPr>
       <w:r>
         <w:rPr>
@@ -2293,10 +2306,10 @@
             </w:tcBorders>
             <w:shd w:fill="E8F0FF" w:val="clear"/>
             <w:tcMar>
-              <w:top w:type="dxa" w:w="80"/>
-              <w:left w:type="dxa" w:w="120"/>
-              <w:bottom w:type="dxa" w:w="80"/>
-              <w:right w:type="dxa" w:w="120"/>
+              <w:top w:type="dxa" w:w="100"/>
+              <w:left w:type="dxa" w:w="160"/>
+              <w:bottom w:type="dxa" w:w="100"/>
+              <w:right w:type="dxa" w:w="160"/>
             </w:tcMar>
           </w:tcPr>
           <w:p>
@@ -2327,10 +2340,10 @@
             </w:tcBorders>
             <w:shd w:fill="E8F0FF" w:val="clear"/>
             <w:tcMar>
-              <w:top w:type="dxa" w:w="80"/>
-              <w:left w:type="dxa" w:w="120"/>
-              <w:bottom w:type="dxa" w:w="80"/>
-              <w:right w:type="dxa" w:w="120"/>
+              <w:top w:type="dxa" w:w="100"/>
+              <w:left w:type="dxa" w:w="160"/>
+              <w:bottom w:type="dxa" w:w="100"/>
+              <w:right w:type="dxa" w:w="160"/>
             </w:tcMar>
           </w:tcPr>
           <w:p>
@@ -2362,10 +2375,10 @@
               <w:right w:val="single" w:color="D2D2D7" w:sz="1"/>
             </w:tcBorders>
             <w:tcMar>
-              <w:top w:type="dxa" w:w="80"/>
-              <w:left w:type="dxa" w:w="120"/>
-              <w:bottom w:type="dxa" w:w="80"/>
-              <w:right w:type="dxa" w:w="120"/>
+              <w:top w:type="dxa" w:w="100"/>
+              <w:left w:type="dxa" w:w="160"/>
+              <w:bottom w:type="dxa" w:w="100"/>
+              <w:right w:type="dxa" w:w="160"/>
             </w:tcMar>
           </w:tcPr>
           <w:p>
@@ -2395,10 +2408,10 @@
               <w:right w:val="single" w:color="D2D2D7" w:sz="1"/>
             </w:tcBorders>
             <w:tcMar>
-              <w:top w:type="dxa" w:w="80"/>
-              <w:left w:type="dxa" w:w="120"/>
-              <w:bottom w:type="dxa" w:w="80"/>
-              <w:right w:type="dxa" w:w="120"/>
+              <w:top w:type="dxa" w:w="100"/>
+              <w:left w:type="dxa" w:w="160"/>
+              <w:bottom w:type="dxa" w:w="100"/>
+              <w:right w:type="dxa" w:w="160"/>
             </w:tcMar>
           </w:tcPr>
           <w:p>
@@ -2430,10 +2443,10 @@
               <w:right w:val="single" w:color="D2D2D7" w:sz="1"/>
             </w:tcBorders>
             <w:tcMar>
-              <w:top w:type="dxa" w:w="80"/>
-              <w:left w:type="dxa" w:w="120"/>
-              <w:bottom w:type="dxa" w:w="80"/>
-              <w:right w:type="dxa" w:w="120"/>
+              <w:top w:type="dxa" w:w="100"/>
+              <w:left w:type="dxa" w:w="160"/>
+              <w:bottom w:type="dxa" w:w="100"/>
+              <w:right w:type="dxa" w:w="160"/>
             </w:tcMar>
           </w:tcPr>
           <w:p>
@@ -2463,10 +2476,10 @@
               <w:right w:val="single" w:color="D2D2D7" w:sz="1"/>
             </w:tcBorders>
             <w:tcMar>
-              <w:top w:type="dxa" w:w="80"/>
-              <w:left w:type="dxa" w:w="120"/>
-              <w:bottom w:type="dxa" w:w="80"/>
-              <w:right w:type="dxa" w:w="120"/>
+              <w:top w:type="dxa" w:w="100"/>
+              <w:left w:type="dxa" w:w="160"/>
+              <w:bottom w:type="dxa" w:w="100"/>
+              <w:right w:type="dxa" w:w="160"/>
             </w:tcMar>
           </w:tcPr>
           <w:p>
@@ -2498,10 +2511,10 @@
               <w:right w:val="single" w:color="D2D2D7" w:sz="1"/>
             </w:tcBorders>
             <w:tcMar>
-              <w:top w:type="dxa" w:w="80"/>
-              <w:left w:type="dxa" w:w="120"/>
-              <w:bottom w:type="dxa" w:w="80"/>
-              <w:right w:type="dxa" w:w="120"/>
+              <w:top w:type="dxa" w:w="100"/>
+              <w:left w:type="dxa" w:w="160"/>
+              <w:bottom w:type="dxa" w:w="100"/>
+              <w:right w:type="dxa" w:w="160"/>
             </w:tcMar>
           </w:tcPr>
           <w:p>
@@ -2531,10 +2544,10 @@
               <w:right w:val="single" w:color="D2D2D7" w:sz="1"/>
             </w:tcBorders>
             <w:tcMar>
-              <w:top w:type="dxa" w:w="80"/>
-              <w:left w:type="dxa" w:w="120"/>
-              <w:bottom w:type="dxa" w:w="80"/>
-              <w:right w:type="dxa" w:w="120"/>
+              <w:top w:type="dxa" w:w="100"/>
+              <w:left w:type="dxa" w:w="160"/>
+              <w:bottom w:type="dxa" w:w="100"/>
+              <w:right w:type="dxa" w:w="160"/>
             </w:tcMar>
           </w:tcPr>
           <w:p>
@@ -2566,10 +2579,10 @@
               <w:right w:val="single" w:color="D2D2D7" w:sz="1"/>
             </w:tcBorders>
             <w:tcMar>
-              <w:top w:type="dxa" w:w="80"/>
-              <w:left w:type="dxa" w:w="120"/>
-              <w:bottom w:type="dxa" w:w="80"/>
-              <w:right w:type="dxa" w:w="120"/>
+              <w:top w:type="dxa" w:w="100"/>
+              <w:left w:type="dxa" w:w="160"/>
+              <w:bottom w:type="dxa" w:w="100"/>
+              <w:right w:type="dxa" w:w="160"/>
             </w:tcMar>
           </w:tcPr>
           <w:p>
@@ -2599,10 +2612,10 @@
               <w:right w:val="single" w:color="D2D2D7" w:sz="1"/>
             </w:tcBorders>
             <w:tcMar>
-              <w:top w:type="dxa" w:w="80"/>
-              <w:left w:type="dxa" w:w="120"/>
-              <w:bottom w:type="dxa" w:w="80"/>
-              <w:right w:type="dxa" w:w="120"/>
+              <w:top w:type="dxa" w:w="100"/>
+              <w:left w:type="dxa" w:w="160"/>
+              <w:bottom w:type="dxa" w:w="100"/>
+              <w:right w:type="dxa" w:w="160"/>
             </w:tcMar>
           </w:tcPr>
           <w:p>
@@ -2634,10 +2647,10 @@
               <w:right w:val="single" w:color="D2D2D7" w:sz="1"/>
             </w:tcBorders>
             <w:tcMar>
-              <w:top w:type="dxa" w:w="80"/>
-              <w:left w:type="dxa" w:w="120"/>
-              <w:bottom w:type="dxa" w:w="80"/>
-              <w:right w:type="dxa" w:w="120"/>
+              <w:top w:type="dxa" w:w="100"/>
+              <w:left w:type="dxa" w:w="160"/>
+              <w:bottom w:type="dxa" w:w="100"/>
+              <w:right w:type="dxa" w:w="160"/>
             </w:tcMar>
           </w:tcPr>
           <w:p>
@@ -2667,10 +2680,10 @@
               <w:right w:val="single" w:color="D2D2D7" w:sz="1"/>
             </w:tcBorders>
             <w:tcMar>
-              <w:top w:type="dxa" w:w="80"/>
-              <w:left w:type="dxa" w:w="120"/>
-              <w:bottom w:type="dxa" w:w="80"/>
-              <w:right w:type="dxa" w:w="120"/>
+              <w:top w:type="dxa" w:w="100"/>
+              <w:left w:type="dxa" w:w="160"/>
+              <w:bottom w:type="dxa" w:w="100"/>
+              <w:right w:type="dxa" w:w="160"/>
             </w:tcMar>
           </w:tcPr>
           <w:p>
@@ -2702,10 +2715,10 @@
               <w:right w:val="single" w:color="D2D2D7" w:sz="1"/>
             </w:tcBorders>
             <w:tcMar>
-              <w:top w:type="dxa" w:w="80"/>
-              <w:left w:type="dxa" w:w="120"/>
-              <w:bottom w:type="dxa" w:w="80"/>
-              <w:right w:type="dxa" w:w="120"/>
+              <w:top w:type="dxa" w:w="100"/>
+              <w:left w:type="dxa" w:w="160"/>
+              <w:bottom w:type="dxa" w:w="100"/>
+              <w:right w:type="dxa" w:w="160"/>
             </w:tcMar>
           </w:tcPr>
           <w:p>
@@ -2735,10 +2748,10 @@
               <w:right w:val="single" w:color="D2D2D7" w:sz="1"/>
             </w:tcBorders>
             <w:tcMar>
-              <w:top w:type="dxa" w:w="80"/>
-              <w:left w:type="dxa" w:w="120"/>
-              <w:bottom w:type="dxa" w:w="80"/>
-              <w:right w:type="dxa" w:w="120"/>
+              <w:top w:type="dxa" w:w="100"/>
+              <w:left w:type="dxa" w:w="160"/>
+              <w:bottom w:type="dxa" w:w="100"/>
+              <w:right w:type="dxa" w:w="160"/>
             </w:tcMar>
           </w:tcPr>
           <w:p>
@@ -2770,10 +2783,10 @@
               <w:right w:val="single" w:color="D2D2D7" w:sz="1"/>
             </w:tcBorders>
             <w:tcMar>
-              <w:top w:type="dxa" w:w="80"/>
-              <w:left w:type="dxa" w:w="120"/>
-              <w:bottom w:type="dxa" w:w="80"/>
-              <w:right w:type="dxa" w:w="120"/>
+              <w:top w:type="dxa" w:w="100"/>
+              <w:left w:type="dxa" w:w="160"/>
+              <w:bottom w:type="dxa" w:w="100"/>
+              <w:right w:type="dxa" w:w="160"/>
             </w:tcMar>
           </w:tcPr>
           <w:p>
@@ -2803,10 +2816,10 @@
               <w:right w:val="single" w:color="D2D2D7" w:sz="1"/>
             </w:tcBorders>
             <w:tcMar>
-              <w:top w:type="dxa" w:w="80"/>
-              <w:left w:type="dxa" w:w="120"/>
-              <w:bottom w:type="dxa" w:w="80"/>
-              <w:right w:type="dxa" w:w="120"/>
+              <w:top w:type="dxa" w:w="100"/>
+              <w:left w:type="dxa" w:w="160"/>
+              <w:bottom w:type="dxa" w:w="100"/>
+              <w:right w:type="dxa" w:w="160"/>
             </w:tcMar>
           </w:tcPr>
           <w:p>
@@ -2838,10 +2851,10 @@
               <w:right w:val="single" w:color="D2D2D7" w:sz="1"/>
             </w:tcBorders>
             <w:tcMar>
-              <w:top w:type="dxa" w:w="80"/>
-              <w:left w:type="dxa" w:w="120"/>
-              <w:bottom w:type="dxa" w:w="80"/>
-              <w:right w:type="dxa" w:w="120"/>
+              <w:top w:type="dxa" w:w="100"/>
+              <w:left w:type="dxa" w:w="160"/>
+              <w:bottom w:type="dxa" w:w="100"/>
+              <w:right w:type="dxa" w:w="160"/>
             </w:tcMar>
           </w:tcPr>
           <w:p>
@@ -2871,10 +2884,10 @@
               <w:right w:val="single" w:color="D2D2D7" w:sz="1"/>
             </w:tcBorders>
             <w:tcMar>
-              <w:top w:type="dxa" w:w="80"/>
-              <w:left w:type="dxa" w:w="120"/>
-              <w:bottom w:type="dxa" w:w="80"/>
-              <w:right w:type="dxa" w:w="120"/>
+              <w:top w:type="dxa" w:w="100"/>
+              <w:left w:type="dxa" w:w="160"/>
+              <w:bottom w:type="dxa" w:w="100"/>
+              <w:right w:type="dxa" w:w="160"/>
             </w:tcMar>
           </w:tcPr>
           <w:p>
@@ -2921,16 +2934,16 @@
           <w:tcPr>
             <w:tcW w:type="dxa" w:w="9360"/>
             <w:tcBorders>
-              <w:top w:val="single" w:color="D2D2D7" w:sz="2"/>
-              <w:left w:val="single" w:color="D2D2D7" w:sz="2"/>
-              <w:bottom w:val="single" w:color="D2D2D7" w:sz="2"/>
-              <w:right w:val="single" w:color="D2D2D7" w:sz="2"/>
-            </w:tcBorders>
-            <w:tcMar>
-              <w:top w:type="dxa" w:w="80"/>
-              <w:left w:type="dxa" w:w="80"/>
-              <w:bottom w:type="dxa" w:w="80"/>
-              <w:right w:type="dxa" w:w="80"/>
+              <w:top w:val="single" w:color="D2D2D7" w:sz="1"/>
+              <w:left w:val="single" w:color="D2D2D7" w:sz="1"/>
+              <w:bottom w:val="single" w:color="D2D2D7" w:sz="1"/>
+              <w:right w:val="single" w:color="D2D2D7" w:sz="1"/>
+            </w:tcBorders>
+            <w:tcMar>
+              <w:top w:type="dxa" w:w="100"/>
+              <w:left w:type="dxa" w:w="100"/>
+              <w:bottom w:type="dxa" w:w="100"/>
+              <w:right w:type="dxa" w:w="100"/>
             </w:tcMar>
           </w:tcPr>
           <w:p>
@@ -2983,7 +2996,7 @@
     </w:tbl>
     <w:p>
       <w:pPr>
-        <w:spacing w:after="200" w:before="40"/>
+        <w:spacing w:after="240" w:before="60"/>
         <w:jc w:val="center"/>
       </w:pPr>
       <w:r>
@@ -3018,16 +3031,16 @@
           <w:tcPr>
             <w:tcW w:type="dxa" w:w="9360"/>
             <w:tcBorders>
-              <w:top w:val="single" w:color="D2D2D7" w:sz="2"/>
-              <w:left w:val="single" w:color="D2D2D7" w:sz="2"/>
-              <w:bottom w:val="single" w:color="D2D2D7" w:sz="2"/>
-              <w:right w:val="single" w:color="D2D2D7" w:sz="2"/>
-            </w:tcBorders>
-            <w:tcMar>
-              <w:top w:type="dxa" w:w="80"/>
-              <w:left w:type="dxa" w:w="80"/>
-              <w:bottom w:type="dxa" w:w="80"/>
-              <w:right w:type="dxa" w:w="80"/>
+              <w:top w:val="single" w:color="D2D2D7" w:sz="1"/>
+              <w:left w:val="single" w:color="D2D2D7" w:sz="1"/>
+              <w:bottom w:val="single" w:color="D2D2D7" w:sz="1"/>
+              <w:right w:val="single" w:color="D2D2D7" w:sz="1"/>
+            </w:tcBorders>
+            <w:tcMar>
+              <w:top w:type="dxa" w:w="100"/>
+              <w:left w:type="dxa" w:w="100"/>
+              <w:bottom w:type="dxa" w:w="100"/>
+              <w:right w:type="dxa" w:w="100"/>
             </w:tcMar>
           </w:tcPr>
           <w:p>
@@ -3080,7 +3093,7 @@
     </w:tbl>
     <w:p>
       <w:pPr>
-        <w:spacing w:after="200" w:before="40"/>
+        <w:spacing w:after="240" w:before="60"/>
         <w:jc w:val="center"/>
       </w:pPr>
       <w:r>
@@ -3132,17 +3145,17 @@
           <w:tcPr>
             <w:tcW w:type="dxa" w:w="9360"/>
             <w:tcBorders>
-              <w:top w:val="single" w:color="0071E3" w:sz="3"/>
-              <w:left w:val="single" w:color="0071E3" w:sz="3"/>
-              <w:bottom w:val="single" w:color="0071E3" w:sz="3"/>
-              <w:right w:val="single" w:color="0071E3" w:sz="3"/>
+              <w:top w:val="single" w:color="0071E3" w:sz="2"/>
+              <w:left w:val="single" w:color="0071E3" w:sz="8"/>
+              <w:bottom w:val="single" w:color="0071E3" w:sz="2"/>
+              <w:right w:val="single" w:color="0071E3" w:sz="2"/>
             </w:tcBorders>
             <w:shd w:fill="E8F0FF" w:val="clear"/>
             <w:tcMar>
-              <w:top w:type="dxa" w:w="120"/>
-              <w:left w:type="dxa" w:w="160"/>
-              <w:bottom w:type="dxa" w:w="120"/>
-              <w:right w:type="dxa" w:w="160"/>
+              <w:top w:type="dxa" w:w="160"/>
+              <w:left w:type="dxa" w:w="240"/>
+              <w:bottom w:type="dxa" w:w="160"/>
+              <w:right w:type="dxa" w:w="200"/>
             </w:tcMar>
           </w:tcPr>
           <w:p>
@@ -3162,7 +3175,7 @@
             </w:r>
           </w:p>
           <w:p>
-            <w:hyperlink w:history="1" r:id="rIdgwmaervqcdh29a0lxpioo">
+            <w:hyperlink w:history="1" r:id="rIdatvsiwkqgmlo7avm1lkuy">
               <w:r>
                 <w:rPr>
                   <w:rStyle w:val="Hyperlink"/>
@@ -3184,7 +3197,7 @@
     </w:p>
     <w:p>
       <w:pPr>
-        <w:spacing w:after="120"/>
+        <w:spacing w:after="160"/>
       </w:pPr>
       <w:r>
         <w:rPr>
@@ -3210,7 +3223,7 @@
     </w:p>
     <w:p>
       <w:pPr>
-        <w:spacing w:after="120"/>
+        <w:spacing w:after="160"/>
       </w:pPr>
       <w:r>
         <w:rPr>
@@ -3250,10 +3263,10 @@
             </w:tcBorders>
             <w:shd w:fill="E8F0FF" w:val="clear"/>
             <w:tcMar>
-              <w:top w:type="dxa" w:w="80"/>
-              <w:left w:type="dxa" w:w="120"/>
-              <w:bottom w:type="dxa" w:w="80"/>
-              <w:right w:type="dxa" w:w="120"/>
+              <w:top w:type="dxa" w:w="100"/>
+              <w:left w:type="dxa" w:w="160"/>
+              <w:bottom w:type="dxa" w:w="100"/>
+              <w:right w:type="dxa" w:w="160"/>
             </w:tcMar>
           </w:tcPr>
           <w:p>
@@ -3284,10 +3297,10 @@
             </w:tcBorders>
             <w:shd w:fill="E8F0FF" w:val="clear"/>
             <w:tcMar>
-              <w:top w:type="dxa" w:w="80"/>
-              <w:left w:type="dxa" w:w="120"/>
-              <w:bottom w:type="dxa" w:w="80"/>
-              <w:right w:type="dxa" w:w="120"/>
+              <w:top w:type="dxa" w:w="100"/>
+              <w:left w:type="dxa" w:w="160"/>
+              <w:bottom w:type="dxa" w:w="100"/>
+              <w:right w:type="dxa" w:w="160"/>
             </w:tcMar>
           </w:tcPr>
           <w:p>
@@ -3319,10 +3332,10 @@
               <w:right w:val="single" w:color="D2D2D7" w:sz="1"/>
             </w:tcBorders>
             <w:tcMar>
-              <w:top w:type="dxa" w:w="80"/>
-              <w:left w:type="dxa" w:w="120"/>
-              <w:bottom w:type="dxa" w:w="80"/>
-              <w:right w:type="dxa" w:w="120"/>
+              <w:top w:type="dxa" w:w="100"/>
+              <w:left w:type="dxa" w:w="160"/>
+              <w:bottom w:type="dxa" w:w="100"/>
+              <w:right w:type="dxa" w:w="160"/>
             </w:tcMar>
           </w:tcPr>
           <w:p>
@@ -3352,10 +3365,10 @@
               <w:right w:val="single" w:color="D2D2D7" w:sz="1"/>
             </w:tcBorders>
             <w:tcMar>
-              <w:top w:type="dxa" w:w="80"/>
-              <w:left w:type="dxa" w:w="120"/>
-              <w:bottom w:type="dxa" w:w="80"/>
-              <w:right w:type="dxa" w:w="120"/>
+              <w:top w:type="dxa" w:w="100"/>
+              <w:left w:type="dxa" w:w="160"/>
+              <w:bottom w:type="dxa" w:w="100"/>
+              <w:right w:type="dxa" w:w="160"/>
             </w:tcMar>
           </w:tcPr>
           <w:p>
@@ -3387,10 +3400,10 @@
               <w:right w:val="single" w:color="D2D2D7" w:sz="1"/>
             </w:tcBorders>
             <w:tcMar>
-              <w:top w:type="dxa" w:w="80"/>
-              <w:left w:type="dxa" w:w="120"/>
-              <w:bottom w:type="dxa" w:w="80"/>
-              <w:right w:type="dxa" w:w="120"/>
+              <w:top w:type="dxa" w:w="100"/>
+              <w:left w:type="dxa" w:w="160"/>
+              <w:bottom w:type="dxa" w:w="100"/>
+              <w:right w:type="dxa" w:w="160"/>
             </w:tcMar>
           </w:tcPr>
           <w:p>
@@ -3420,10 +3433,10 @@
               <w:right w:val="single" w:color="D2D2D7" w:sz="1"/>
             </w:tcBorders>
             <w:tcMar>
-              <w:top w:type="dxa" w:w="80"/>
-              <w:left w:type="dxa" w:w="120"/>
-              <w:bottom w:type="dxa" w:w="80"/>
-              <w:right w:type="dxa" w:w="120"/>
+              <w:top w:type="dxa" w:w="100"/>
+              <w:left w:type="dxa" w:w="160"/>
+              <w:bottom w:type="dxa" w:w="100"/>
+              <w:right w:type="dxa" w:w="160"/>
             </w:tcMar>
           </w:tcPr>
           <w:p>
@@ -3455,10 +3468,10 @@
               <w:right w:val="single" w:color="D2D2D7" w:sz="1"/>
             </w:tcBorders>
             <w:tcMar>
-              <w:top w:type="dxa" w:w="80"/>
-              <w:left w:type="dxa" w:w="120"/>
-              <w:bottom w:type="dxa" w:w="80"/>
-              <w:right w:type="dxa" w:w="120"/>
+              <w:top w:type="dxa" w:w="100"/>
+              <w:left w:type="dxa" w:w="160"/>
+              <w:bottom w:type="dxa" w:w="100"/>
+              <w:right w:type="dxa" w:w="160"/>
             </w:tcMar>
           </w:tcPr>
           <w:p>
@@ -3488,10 +3501,10 @@
               <w:right w:val="single" w:color="D2D2D7" w:sz="1"/>
             </w:tcBorders>
             <w:tcMar>
-              <w:top w:type="dxa" w:w="80"/>
-              <w:left w:type="dxa" w:w="120"/>
-              <w:bottom w:type="dxa" w:w="80"/>
-              <w:right w:type="dxa" w:w="120"/>
+              <w:top w:type="dxa" w:w="100"/>
+              <w:left w:type="dxa" w:w="160"/>
+              <w:bottom w:type="dxa" w:w="100"/>
+              <w:right w:type="dxa" w:w="160"/>
             </w:tcMar>
           </w:tcPr>
           <w:p>
@@ -3523,10 +3536,10 @@
               <w:right w:val="single" w:color="D2D2D7" w:sz="1"/>
             </w:tcBorders>
             <w:tcMar>
-              <w:top w:type="dxa" w:w="80"/>
-              <w:left w:type="dxa" w:w="120"/>
-              <w:bottom w:type="dxa" w:w="80"/>
-              <w:right w:type="dxa" w:w="120"/>
+              <w:top w:type="dxa" w:w="100"/>
+              <w:left w:type="dxa" w:w="160"/>
+              <w:bottom w:type="dxa" w:w="100"/>
+              <w:right w:type="dxa" w:w="160"/>
             </w:tcMar>
           </w:tcPr>
           <w:p>
@@ -3556,10 +3569,10 @@
               <w:right w:val="single" w:color="D2D2D7" w:sz="1"/>
             </w:tcBorders>
             <w:tcMar>
-              <w:top w:type="dxa" w:w="80"/>
-              <w:left w:type="dxa" w:w="120"/>
-              <w:bottom w:type="dxa" w:w="80"/>
-              <w:right w:type="dxa" w:w="120"/>
+              <w:top w:type="dxa" w:w="100"/>
+              <w:left w:type="dxa" w:w="160"/>
+              <w:bottom w:type="dxa" w:w="100"/>
+              <w:right w:type="dxa" w:w="160"/>
             </w:tcMar>
           </w:tcPr>
           <w:p>
@@ -3600,7 +3613,7 @@
     </w:p>
     <w:p>
       <w:pPr>
-        <w:spacing w:after="120"/>
+        <w:spacing w:after="160"/>
       </w:pPr>
       <w:r>
         <w:rPr>
@@ -3619,7 +3632,7 @@
           <w:ilvl w:val="0"/>
           <w:numId w:val="3"/>
         </w:numPr>
-        <w:spacing w:after="60"/>
+        <w:spacing w:after="80"/>
       </w:pPr>
       <w:r>
         <w:rPr>
@@ -3637,7 +3650,7 @@
           <w:ilvl w:val="0"/>
           <w:numId w:val="3"/>
         </w:numPr>
-        <w:spacing w:after="60"/>
+        <w:spacing w:after="80"/>
       </w:pPr>
       <w:r>
         <w:rPr>
@@ -3655,7 +3668,7 @@
           <w:ilvl w:val="0"/>
           <w:numId w:val="3"/>
         </w:numPr>
-        <w:spacing w:after="60"/>
+        <w:spacing w:after="80"/>
       </w:pPr>
       <w:r>
         <w:rPr>
@@ -3673,7 +3686,7 @@
           <w:ilvl w:val="0"/>
           <w:numId w:val="3"/>
         </w:numPr>
-        <w:spacing w:after="60"/>
+        <w:spacing w:after="80"/>
       </w:pPr>
       <w:r>
         <w:rPr>
@@ -3691,7 +3704,7 @@
           <w:ilvl w:val="0"/>
           <w:numId w:val="3"/>
         </w:numPr>
-        <w:spacing w:after="60"/>
+        <w:spacing w:after="80"/>
       </w:pPr>
       <w:r>
         <w:rPr>
@@ -3722,16 +3735,16 @@
           <w:tcPr>
             <w:tcW w:type="dxa" w:w="9360"/>
             <w:tcBorders>
-              <w:top w:val="single" w:color="D2D2D7" w:sz="2"/>
-              <w:left w:val="single" w:color="D2D2D7" w:sz="2"/>
-              <w:bottom w:val="single" w:color="D2D2D7" w:sz="2"/>
-              <w:right w:val="single" w:color="D2D2D7" w:sz="2"/>
-            </w:tcBorders>
-            <w:tcMar>
-              <w:top w:type="dxa" w:w="80"/>
-              <w:left w:type="dxa" w:w="80"/>
-              <w:bottom w:type="dxa" w:w="80"/>
-              <w:right w:type="dxa" w:w="80"/>
+              <w:top w:val="single" w:color="D2D2D7" w:sz="1"/>
+              <w:left w:val="single" w:color="D2D2D7" w:sz="1"/>
+              <w:bottom w:val="single" w:color="D2D2D7" w:sz="1"/>
+              <w:right w:val="single" w:color="D2D2D7" w:sz="1"/>
+            </w:tcBorders>
+            <w:tcMar>
+              <w:top w:type="dxa" w:w="100"/>
+              <w:left w:type="dxa" w:w="100"/>
+              <w:bottom w:type="dxa" w:w="100"/>
+              <w:right w:type="dxa" w:w="100"/>
             </w:tcMar>
           </w:tcPr>
           <w:p>
@@ -3784,7 +3797,7 @@
     </w:tbl>
     <w:p>
       <w:pPr>
-        <w:spacing w:after="200" w:before="40"/>
+        <w:spacing w:after="240" w:before="60"/>
         <w:jc w:val="center"/>
       </w:pPr>
       <w:r>
@@ -3818,7 +3831,7 @@
           <w:ilvl w:val="0"/>
           <w:numId w:val="3"/>
         </w:numPr>
-        <w:spacing w:after="60"/>
+        <w:spacing w:after="80"/>
       </w:pPr>
       <w:r>
         <w:rPr>
@@ -3836,7 +3849,7 @@
           <w:ilvl w:val="0"/>
           <w:numId w:val="3"/>
         </w:numPr>
-        <w:spacing w:after="60"/>
+        <w:spacing w:after="80"/>
       </w:pPr>
       <w:r>
         <w:rPr>
@@ -3854,7 +3867,7 @@
           <w:ilvl w:val="0"/>
           <w:numId w:val="3"/>
         </w:numPr>
-        <w:spacing w:after="60"/>
+        <w:spacing w:after="80"/>
       </w:pPr>
       <w:r>
         <w:rPr>
@@ -3872,7 +3885,7 @@
           <w:ilvl w:val="0"/>
           <w:numId w:val="3"/>
         </w:numPr>
-        <w:spacing w:after="60"/>
+        <w:spacing w:after="80"/>
       </w:pPr>
       <w:r>
         <w:rPr>
@@ -3890,7 +3903,7 @@
           <w:ilvl w:val="0"/>
           <w:numId w:val="3"/>
         </w:numPr>
-        <w:spacing w:after="60"/>
+        <w:spacing w:after="80"/>
       </w:pPr>
       <w:r>
         <w:rPr>
@@ -3908,7 +3921,7 @@
           <w:ilvl w:val="0"/>
           <w:numId w:val="3"/>
         </w:numPr>
-        <w:spacing w:after="60"/>
+        <w:spacing w:after="80"/>
       </w:pPr>
       <w:r>
         <w:rPr>
@@ -3956,17 +3969,17 @@
           <w:tcPr>
             <w:tcW w:type="dxa" w:w="9360"/>
             <w:tcBorders>
-              <w:top w:val="single" w:color="0071E3" w:sz="3"/>
-              <w:left w:val="single" w:color="0071E3" w:sz="3"/>
-              <w:bottom w:val="single" w:color="0071E3" w:sz="3"/>
-              <w:right w:val="single" w:color="0071E3" w:sz="3"/>
+              <w:top w:val="single" w:color="0071E3" w:sz="2"/>
+              <w:left w:val="single" w:color="0071E3" w:sz="8"/>
+              <w:bottom w:val="single" w:color="0071E3" w:sz="2"/>
+              <w:right w:val="single" w:color="0071E3" w:sz="2"/>
             </w:tcBorders>
             <w:shd w:fill="E8F0FF" w:val="clear"/>
             <w:tcMar>
-              <w:top w:type="dxa" w:w="120"/>
-              <w:left w:type="dxa" w:w="160"/>
-              <w:bottom w:type="dxa" w:w="120"/>
-              <w:right w:type="dxa" w:w="160"/>
+              <w:top w:type="dxa" w:w="160"/>
+              <w:left w:type="dxa" w:w="240"/>
+              <w:bottom w:type="dxa" w:w="160"/>
+              <w:right w:type="dxa" w:w="200"/>
             </w:tcMar>
           </w:tcPr>
           <w:p>
@@ -3986,7 +3999,7 @@
             </w:r>
           </w:p>
           <w:p>
-            <w:hyperlink w:history="1" r:id="rId3lry14ntwbuly5eyfvnn4">
+            <w:hyperlink w:history="1" r:id="rIduswesptac1d0swxyz1let">
               <w:r>
                 <w:rPr>
                   <w:rStyle w:val="Hyperlink"/>
@@ -4008,7 +4021,7 @@
     </w:p>
     <w:p>
       <w:pPr>
-        <w:spacing w:after="120"/>
+        <w:spacing w:after="160"/>
       </w:pPr>
       <w:r>
         <w:rPr>
@@ -4034,7 +4047,7 @@
     </w:p>
     <w:p>
       <w:pPr>
-        <w:spacing w:after="120"/>
+        <w:spacing w:after="160"/>
       </w:pPr>
       <w:r>
         <w:rPr>
@@ -4075,10 +4088,10 @@
             </w:tcBorders>
             <w:shd w:fill="E8F0FF" w:val="clear"/>
             <w:tcMar>
-              <w:top w:type="dxa" w:w="80"/>
-              <w:left w:type="dxa" w:w="120"/>
-              <w:bottom w:type="dxa" w:w="80"/>
-              <w:right w:type="dxa" w:w="120"/>
+              <w:top w:type="dxa" w:w="100"/>
+              <w:left w:type="dxa" w:w="160"/>
+              <w:bottom w:type="dxa" w:w="100"/>
+              <w:right w:type="dxa" w:w="160"/>
             </w:tcMar>
           </w:tcPr>
           <w:p>
@@ -4109,10 +4122,10 @@
             </w:tcBorders>
             <w:shd w:fill="E8F0FF" w:val="clear"/>
             <w:tcMar>
-              <w:top w:type="dxa" w:w="80"/>
-              <w:left w:type="dxa" w:w="120"/>
-              <w:bottom w:type="dxa" w:w="80"/>
-              <w:right w:type="dxa" w:w="120"/>
+              <w:top w:type="dxa" w:w="100"/>
+              <w:left w:type="dxa" w:w="160"/>
+              <w:bottom w:type="dxa" w:w="100"/>
+              <w:right w:type="dxa" w:w="160"/>
             </w:tcMar>
           </w:tcPr>
           <w:p>
@@ -4143,10 +4156,10 @@
             </w:tcBorders>
             <w:shd w:fill="E8F0FF" w:val="clear"/>
             <w:tcMar>
-              <w:top w:type="dxa" w:w="80"/>
-              <w:left w:type="dxa" w:w="120"/>
-              <w:bottom w:type="dxa" w:w="80"/>
-              <w:right w:type="dxa" w:w="120"/>
+              <w:top w:type="dxa" w:w="100"/>
+              <w:left w:type="dxa" w:w="160"/>
+              <w:bottom w:type="dxa" w:w="100"/>
+              <w:right w:type="dxa" w:w="160"/>
             </w:tcMar>
           </w:tcPr>
           <w:p>
@@ -4178,10 +4191,10 @@
               <w:right w:val="single" w:color="D2D2D7" w:sz="1"/>
             </w:tcBorders>
             <w:tcMar>
-              <w:top w:type="dxa" w:w="80"/>
-              <w:left w:type="dxa" w:w="120"/>
-              <w:bottom w:type="dxa" w:w="80"/>
-              <w:right w:type="dxa" w:w="120"/>
+              <w:top w:type="dxa" w:w="100"/>
+              <w:left w:type="dxa" w:w="160"/>
+              <w:bottom w:type="dxa" w:w="100"/>
+              <w:right w:type="dxa" w:w="160"/>
             </w:tcMar>
           </w:tcPr>
           <w:p>
@@ -4211,10 +4224,10 @@
               <w:right w:val="single" w:color="D2D2D7" w:sz="1"/>
             </w:tcBorders>
             <w:tcMar>
-              <w:top w:type="dxa" w:w="80"/>
-              <w:left w:type="dxa" w:w="120"/>
-              <w:bottom w:type="dxa" w:w="80"/>
-              <w:right w:type="dxa" w:w="120"/>
+              <w:top w:type="dxa" w:w="100"/>
+              <w:left w:type="dxa" w:w="160"/>
+              <w:bottom w:type="dxa" w:w="100"/>
+              <w:right w:type="dxa" w:w="160"/>
             </w:tcMar>
           </w:tcPr>
           <w:p>
@@ -4244,10 +4257,10 @@
               <w:right w:val="single" w:color="D2D2D7" w:sz="1"/>
             </w:tcBorders>
             <w:tcMar>
-              <w:top w:type="dxa" w:w="80"/>
-              <w:left w:type="dxa" w:w="120"/>
-              <w:bottom w:type="dxa" w:w="80"/>
-              <w:right w:type="dxa" w:w="120"/>
+              <w:top w:type="dxa" w:w="100"/>
+              <w:left w:type="dxa" w:w="160"/>
+              <w:bottom w:type="dxa" w:w="100"/>
+              <w:right w:type="dxa" w:w="160"/>
             </w:tcMar>
           </w:tcPr>
           <w:p>
@@ -4279,10 +4292,10 @@
               <w:right w:val="single" w:color="D2D2D7" w:sz="1"/>
             </w:tcBorders>
             <w:tcMar>
-              <w:top w:type="dxa" w:w="80"/>
-              <w:left w:type="dxa" w:w="120"/>
-              <w:bottom w:type="dxa" w:w="80"/>
-              <w:right w:type="dxa" w:w="120"/>
+              <w:top w:type="dxa" w:w="100"/>
+              <w:left w:type="dxa" w:w="160"/>
+              <w:bottom w:type="dxa" w:w="100"/>
+              <w:right w:type="dxa" w:w="160"/>
             </w:tcMar>
           </w:tcPr>
           <w:p>
@@ -4312,10 +4325,10 @@
               <w:right w:val="single" w:color="D2D2D7" w:sz="1"/>
             </w:tcBorders>
             <w:tcMar>
-              <w:top w:type="dxa" w:w="80"/>
-              <w:left w:type="dxa" w:w="120"/>
-              <w:bottom w:type="dxa" w:w="80"/>
-              <w:right w:type="dxa" w:w="120"/>
+              <w:top w:type="dxa" w:w="100"/>
+              <w:left w:type="dxa" w:w="160"/>
+              <w:bottom w:type="dxa" w:w="100"/>
+              <w:right w:type="dxa" w:w="160"/>
             </w:tcMar>
           </w:tcPr>
           <w:p>
@@ -4345,10 +4358,10 @@
               <w:right w:val="single" w:color="D2D2D7" w:sz="1"/>
             </w:tcBorders>
             <w:tcMar>
-              <w:top w:type="dxa" w:w="80"/>
-              <w:left w:type="dxa" w:w="120"/>
-              <w:bottom w:type="dxa" w:w="80"/>
-              <w:right w:type="dxa" w:w="120"/>
+              <w:top w:type="dxa" w:w="100"/>
+              <w:left w:type="dxa" w:w="160"/>
+              <w:bottom w:type="dxa" w:w="100"/>
+              <w:right w:type="dxa" w:w="160"/>
             </w:tcMar>
           </w:tcPr>
           <w:p>
@@ -4380,10 +4393,10 @@
               <w:right w:val="single" w:color="D2D2D7" w:sz="1"/>
             </w:tcBorders>
             <w:tcMar>
-              <w:top w:type="dxa" w:w="80"/>
-              <w:left w:type="dxa" w:w="120"/>
-              <w:bottom w:type="dxa" w:w="80"/>
-              <w:right w:type="dxa" w:w="120"/>
+              <w:top w:type="dxa" w:w="100"/>
+              <w:left w:type="dxa" w:w="160"/>
+              <w:bottom w:type="dxa" w:w="100"/>
+              <w:right w:type="dxa" w:w="160"/>
             </w:tcMar>
           </w:tcPr>
           <w:p>
@@ -4413,10 +4426,10 @@
               <w:right w:val="single" w:color="D2D2D7" w:sz="1"/>
             </w:tcBorders>
             <w:tcMar>
-              <w:top w:type="dxa" w:w="80"/>
-              <w:left w:type="dxa" w:w="120"/>
-              <w:bottom w:type="dxa" w:w="80"/>
-              <w:right w:type="dxa" w:w="120"/>
+              <w:top w:type="dxa" w:w="100"/>
+              <w:left w:type="dxa" w:w="160"/>
+              <w:bottom w:type="dxa" w:w="100"/>
+              <w:right w:type="dxa" w:w="160"/>
             </w:tcMar>
           </w:tcPr>
           <w:p>
@@ -4446,10 +4459,10 @@
               <w:right w:val="single" w:color="D2D2D7" w:sz="1"/>
             </w:tcBorders>
             <w:tcMar>
-              <w:top w:type="dxa" w:w="80"/>
-              <w:left w:type="dxa" w:w="120"/>
-              <w:bottom w:type="dxa" w:w="80"/>
-              <w:right w:type="dxa" w:w="120"/>
+              <w:top w:type="dxa" w:w="100"/>
+              <w:left w:type="dxa" w:w="160"/>
+              <w:bottom w:type="dxa" w:w="100"/>
+              <w:right w:type="dxa" w:w="160"/>
             </w:tcMar>
           </w:tcPr>
           <w:p>
@@ -4481,10 +4494,10 @@
               <w:right w:val="single" w:color="D2D2D7" w:sz="1"/>
             </w:tcBorders>
             <w:tcMar>
-              <w:top w:type="dxa" w:w="80"/>
-              <w:left w:type="dxa" w:w="120"/>
-              <w:bottom w:type="dxa" w:w="80"/>
-              <w:right w:type="dxa" w:w="120"/>
+              <w:top w:type="dxa" w:w="100"/>
+              <w:left w:type="dxa" w:w="160"/>
+              <w:bottom w:type="dxa" w:w="100"/>
+              <w:right w:type="dxa" w:w="160"/>
             </w:tcMar>
           </w:tcPr>
           <w:p>
@@ -4514,10 +4527,10 @@
               <w:right w:val="single" w:color="D2D2D7" w:sz="1"/>
             </w:tcBorders>
             <w:tcMar>
-              <w:top w:type="dxa" w:w="80"/>
-              <w:left w:type="dxa" w:w="120"/>
-              <w:bottom w:type="dxa" w:w="80"/>
-              <w:right w:type="dxa" w:w="120"/>
+              <w:top w:type="dxa" w:w="100"/>
+              <w:left w:type="dxa" w:w="160"/>
+              <w:bottom w:type="dxa" w:w="100"/>
+              <w:right w:type="dxa" w:w="160"/>
             </w:tcMar>
           </w:tcPr>
           <w:p>
@@ -4547,10 +4560,10 @@
               <w:right w:val="single" w:color="D2D2D7" w:sz="1"/>
             </w:tcBorders>
             <w:tcMar>
-              <w:top w:type="dxa" w:w="80"/>
-              <w:left w:type="dxa" w:w="120"/>
-              <w:bottom w:type="dxa" w:w="80"/>
-              <w:right w:type="dxa" w:w="120"/>
+              <w:top w:type="dxa" w:w="100"/>
+              <w:left w:type="dxa" w:w="160"/>
+              <w:bottom w:type="dxa" w:w="100"/>
+              <w:right w:type="dxa" w:w="160"/>
             </w:tcMar>
           </w:tcPr>
           <w:p>
@@ -4596,7 +4609,7 @@
           <w:ilvl w:val="0"/>
           <w:numId w:val="3"/>
         </w:numPr>
-        <w:spacing w:after="60"/>
+        <w:spacing w:after="80"/>
       </w:pPr>
       <w:r>
         <w:rPr>
@@ -4614,7 +4627,7 @@
           <w:ilvl w:val="0"/>
           <w:numId w:val="3"/>
         </w:numPr>
-        <w:spacing w:after="60"/>
+        <w:spacing w:after="80"/>
       </w:pPr>
       <w:r>
         <w:rPr>
@@ -4632,7 +4645,7 @@
           <w:ilvl w:val="0"/>
           <w:numId w:val="3"/>
         </w:numPr>
-        <w:spacing w:after="60"/>
+        <w:spacing w:after="80"/>
       </w:pPr>
       <w:r>
         <w:rPr>
@@ -4650,7 +4663,7 @@
           <w:ilvl w:val="0"/>
           <w:numId w:val="3"/>
         </w:numPr>
-        <w:spacing w:after="60"/>
+        <w:spacing w:after="80"/>
       </w:pPr>
       <w:r>
         <w:rPr>
@@ -4681,16 +4694,16 @@
           <w:tcPr>
             <w:tcW w:type="dxa" w:w="9360"/>
             <w:tcBorders>
-              <w:top w:val="single" w:color="D2D2D7" w:sz="2"/>
-              <w:left w:val="single" w:color="D2D2D7" w:sz="2"/>
-              <w:bottom w:val="single" w:color="D2D2D7" w:sz="2"/>
-              <w:right w:val="single" w:color="D2D2D7" w:sz="2"/>
-            </w:tcBorders>
-            <w:tcMar>
-              <w:top w:type="dxa" w:w="80"/>
-              <w:left w:type="dxa" w:w="80"/>
-              <w:bottom w:type="dxa" w:w="80"/>
-              <w:right w:type="dxa" w:w="80"/>
+              <w:top w:val="single" w:color="D2D2D7" w:sz="1"/>
+              <w:left w:val="single" w:color="D2D2D7" w:sz="1"/>
+              <w:bottom w:val="single" w:color="D2D2D7" w:sz="1"/>
+              <w:right w:val="single" w:color="D2D2D7" w:sz="1"/>
+            </w:tcBorders>
+            <w:tcMar>
+              <w:top w:type="dxa" w:w="100"/>
+              <w:left w:type="dxa" w:w="100"/>
+              <w:bottom w:type="dxa" w:w="100"/>
+              <w:right w:type="dxa" w:w="100"/>
             </w:tcMar>
           </w:tcPr>
           <w:p>
@@ -4743,7 +4756,7 @@
     </w:tbl>
     <w:p>
       <w:pPr>
-        <w:spacing w:after="200" w:before="40"/>
+        <w:spacing w:after="240" w:before="60"/>
         <w:jc w:val="center"/>
       </w:pPr>
       <w:r>
@@ -4777,7 +4790,7 @@
           <w:ilvl w:val="0"/>
           <w:numId w:val="3"/>
         </w:numPr>
-        <w:spacing w:after="60"/>
+        <w:spacing w:after="80"/>
       </w:pPr>
       <w:r>
         <w:rPr>
@@ -4795,7 +4808,7 @@
           <w:ilvl w:val="0"/>
           <w:numId w:val="3"/>
         </w:numPr>
-        <w:spacing w:after="60"/>
+        <w:spacing w:after="80"/>
       </w:pPr>
       <w:r>
         <w:rPr>
@@ -4813,7 +4826,7 @@
           <w:ilvl w:val="0"/>
           <w:numId w:val="3"/>
         </w:numPr>
-        <w:spacing w:after="60"/>
+        <w:spacing w:after="80"/>
       </w:pPr>
       <w:r>
         <w:rPr>
@@ -4844,16 +4857,16 @@
           <w:tcPr>
             <w:tcW w:type="dxa" w:w="9360"/>
             <w:tcBorders>
-              <w:top w:val="single" w:color="D2D2D7" w:sz="2"/>
-              <w:left w:val="single" w:color="D2D2D7" w:sz="2"/>
-              <w:bottom w:val="single" w:color="D2D2D7" w:sz="2"/>
-              <w:right w:val="single" w:color="D2D2D7" w:sz="2"/>
-            </w:tcBorders>
-            <w:tcMar>
-              <w:top w:type="dxa" w:w="80"/>
-              <w:left w:type="dxa" w:w="80"/>
-              <w:bottom w:type="dxa" w:w="80"/>
-              <w:right w:type="dxa" w:w="80"/>
+              <w:top w:val="single" w:color="D2D2D7" w:sz="1"/>
+              <w:left w:val="single" w:color="D2D2D7" w:sz="1"/>
+              <w:bottom w:val="single" w:color="D2D2D7" w:sz="1"/>
+              <w:right w:val="single" w:color="D2D2D7" w:sz="1"/>
+            </w:tcBorders>
+            <w:tcMar>
+              <w:top w:type="dxa" w:w="100"/>
+              <w:left w:type="dxa" w:w="100"/>
+              <w:bottom w:type="dxa" w:w="100"/>
+              <w:right w:type="dxa" w:w="100"/>
             </w:tcMar>
           </w:tcPr>
           <w:p>
@@ -4906,7 +4919,7 @@
     </w:tbl>
     <w:p>
       <w:pPr>
-        <w:spacing w:after="200" w:before="40"/>
+        <w:spacing w:after="240" w:before="60"/>
         <w:jc w:val="center"/>
       </w:pPr>
       <w:r>
@@ -4940,7 +4953,7 @@
     </w:p>
     <w:p>
       <w:pPr>
-        <w:spacing w:after="120"/>
+        <w:spacing w:after="160"/>
       </w:pPr>
       <w:r>
         <w:rPr>
@@ -5192,7 +5205,7 @@
     </w:p>
     <w:p>
       <w:pPr>
-        <w:spacing w:after="120"/>
+        <w:spacing w:after="160"/>
       </w:pPr>
       <w:r>
         <w:rPr>
@@ -5206,7 +5219,7 @@
     </w:p>
     <w:p>
       <w:pPr>
-        <w:spacing w:after="120"/>
+        <w:spacing w:after="160"/>
       </w:pPr>
       <w:r>
         <w:rPr>
@@ -5221,9 +5234,9 @@
     <w:p>
       <w:pPr>
         <w:pBdr>
-          <w:bottom w:val="single" w:color="0071E3" w:sz="6" w:space="1"/>
+          <w:bottom w:val="single" w:color="0071E3" w:sz="12" w:space="1"/>
         </w:pBdr>
-        <w:spacing w:after="200" w:before="200"/>
+        <w:spacing w:after="280" w:before="280"/>
       </w:pPr>
     </w:p>
     <w:p>
@@ -5266,10 +5279,10 @@
             </w:tcBorders>
             <w:shd w:fill="E8F0FF" w:val="clear"/>
             <w:tcMar>
-              <w:top w:type="dxa" w:w="80"/>
-              <w:left w:type="dxa" w:w="120"/>
-              <w:bottom w:type="dxa" w:w="80"/>
-              <w:right w:type="dxa" w:w="120"/>
+              <w:top w:type="dxa" w:w="100"/>
+              <w:left w:type="dxa" w:w="160"/>
+              <w:bottom w:type="dxa" w:w="100"/>
+              <w:right w:type="dxa" w:w="160"/>
             </w:tcMar>
           </w:tcPr>
           <w:p>
@@ -5300,10 +5313,10 @@
             </w:tcBorders>
             <w:shd w:fill="E8F0FF" w:val="clear"/>
             <w:tcMar>
-              <w:top w:type="dxa" w:w="80"/>
-              <w:left w:type="dxa" w:w="120"/>
-              <w:bottom w:type="dxa" w:w="80"/>
-              <w:right w:type="dxa" w:w="120"/>
+              <w:top w:type="dxa" w:w="100"/>
+              <w:left w:type="dxa" w:w="160"/>
+              <w:bottom w:type="dxa" w:w="100"/>
+              <w:right w:type="dxa" w:w="160"/>
             </w:tcMar>
           </w:tcPr>
           <w:p>
@@ -5335,10 +5348,10 @@
               <w:right w:val="single" w:color="D2D2D7" w:sz="1"/>
             </w:tcBorders>
             <w:tcMar>
-              <w:top w:type="dxa" w:w="80"/>
-              <w:left w:type="dxa" w:w="120"/>
-              <w:bottom w:type="dxa" w:w="80"/>
-              <w:right w:type="dxa" w:w="120"/>
+              <w:top w:type="dxa" w:w="100"/>
+              <w:left w:type="dxa" w:w="160"/>
+              <w:bottom w:type="dxa" w:w="100"/>
+              <w:right w:type="dxa" w:w="160"/>
             </w:tcMar>
           </w:tcPr>
           <w:p>
@@ -5368,10 +5381,10 @@
               <w:right w:val="single" w:color="D2D2D7" w:sz="1"/>
             </w:tcBorders>
             <w:tcMar>
-              <w:top w:type="dxa" w:w="80"/>
-              <w:left w:type="dxa" w:w="120"/>
-              <w:bottom w:type="dxa" w:w="80"/>
-              <w:right w:type="dxa" w:w="120"/>
+              <w:top w:type="dxa" w:w="100"/>
+              <w:left w:type="dxa" w:w="160"/>
+              <w:bottom w:type="dxa" w:w="100"/>
+              <w:right w:type="dxa" w:w="160"/>
             </w:tcMar>
           </w:tcPr>
           <w:p>
@@ -5403,10 +5416,10 @@
               <w:right w:val="single" w:color="D2D2D7" w:sz="1"/>
             </w:tcBorders>
             <w:tcMar>
-              <w:top w:type="dxa" w:w="80"/>
-              <w:left w:type="dxa" w:w="120"/>
-              <w:bottom w:type="dxa" w:w="80"/>
-              <w:right w:type="dxa" w:w="120"/>
+              <w:top w:type="dxa" w:w="100"/>
+              <w:left w:type="dxa" w:w="160"/>
+              <w:bottom w:type="dxa" w:w="100"/>
+              <w:right w:type="dxa" w:w="160"/>
             </w:tcMar>
           </w:tcPr>
           <w:p>
@@ -5436,10 +5449,10 @@
               <w:right w:val="single" w:color="D2D2D7" w:sz="1"/>
             </w:tcBorders>
             <w:tcMar>
-              <w:top w:type="dxa" w:w="80"/>
-              <w:left w:type="dxa" w:w="120"/>
-              <w:bottom w:type="dxa" w:w="80"/>
-              <w:right w:type="dxa" w:w="120"/>
+              <w:top w:type="dxa" w:w="100"/>
+              <w:left w:type="dxa" w:w="160"/>
+              <w:bottom w:type="dxa" w:w="100"/>
+              <w:right w:type="dxa" w:w="160"/>
             </w:tcMar>
           </w:tcPr>
           <w:p>
@@ -5471,10 +5484,10 @@
               <w:right w:val="single" w:color="D2D2D7" w:sz="1"/>
             </w:tcBorders>
             <w:tcMar>
-              <w:top w:type="dxa" w:w="80"/>
-              <w:left w:type="dxa" w:w="120"/>
-              <w:bottom w:type="dxa" w:w="80"/>
-              <w:right w:type="dxa" w:w="120"/>
+              <w:top w:type="dxa" w:w="100"/>
+              <w:left w:type="dxa" w:w="160"/>
+              <w:bottom w:type="dxa" w:w="100"/>
+              <w:right w:type="dxa" w:w="160"/>
             </w:tcMar>
           </w:tcPr>
           <w:p>
@@ -5504,10 +5517,10 @@
               <w:right w:val="single" w:color="D2D2D7" w:sz="1"/>
             </w:tcBorders>
             <w:tcMar>
-              <w:top w:type="dxa" w:w="80"/>
-              <w:left w:type="dxa" w:w="120"/>
-              <w:bottom w:type="dxa" w:w="80"/>
-              <w:right w:type="dxa" w:w="120"/>
+              <w:top w:type="dxa" w:w="100"/>
+              <w:left w:type="dxa" w:w="160"/>
+              <w:bottom w:type="dxa" w:w="100"/>
+              <w:right w:type="dxa" w:w="160"/>
             </w:tcMar>
           </w:tcPr>
           <w:p>
@@ -5539,10 +5552,10 @@
               <w:right w:val="single" w:color="D2D2D7" w:sz="1"/>
             </w:tcBorders>
             <w:tcMar>
-              <w:top w:type="dxa" w:w="80"/>
-              <w:left w:type="dxa" w:w="120"/>
-              <w:bottom w:type="dxa" w:w="80"/>
-              <w:right w:type="dxa" w:w="120"/>
+              <w:top w:type="dxa" w:w="100"/>
+              <w:left w:type="dxa" w:w="160"/>
+              <w:bottom w:type="dxa" w:w="100"/>
+              <w:right w:type="dxa" w:w="160"/>
             </w:tcMar>
           </w:tcPr>
           <w:p>
@@ -5572,10 +5585,10 @@
               <w:right w:val="single" w:color="D2D2D7" w:sz="1"/>
             </w:tcBorders>
             <w:tcMar>
-              <w:top w:type="dxa" w:w="80"/>
-              <w:left w:type="dxa" w:w="120"/>
-              <w:bottom w:type="dxa" w:w="80"/>
-              <w:right w:type="dxa" w:w="120"/>
+              <w:top w:type="dxa" w:w="100"/>
+              <w:left w:type="dxa" w:w="160"/>
+              <w:bottom w:type="dxa" w:w="100"/>
+              <w:right w:type="dxa" w:w="160"/>
             </w:tcMar>
           </w:tcPr>
           <w:p>
@@ -5607,10 +5620,10 @@
               <w:right w:val="single" w:color="D2D2D7" w:sz="1"/>
             </w:tcBorders>
             <w:tcMar>
-              <w:top w:type="dxa" w:w="80"/>
-              <w:left w:type="dxa" w:w="120"/>
-              <w:bottom w:type="dxa" w:w="80"/>
-              <w:right w:type="dxa" w:w="120"/>
+              <w:top w:type="dxa" w:w="100"/>
+              <w:left w:type="dxa" w:w="160"/>
+              <w:bottom w:type="dxa" w:w="100"/>
+              <w:right w:type="dxa" w:w="160"/>
             </w:tcMar>
           </w:tcPr>
           <w:p>
@@ -5640,10 +5653,10 @@
               <w:right w:val="single" w:color="D2D2D7" w:sz="1"/>
             </w:tcBorders>
             <w:tcMar>
-              <w:top w:type="dxa" w:w="80"/>
-              <w:left w:type="dxa" w:w="120"/>
-              <w:bottom w:type="dxa" w:w="80"/>
-              <w:right w:type="dxa" w:w="120"/>
+              <w:top w:type="dxa" w:w="100"/>
+              <w:left w:type="dxa" w:w="160"/>
+              <w:bottom w:type="dxa" w:w="100"/>
+              <w:right w:type="dxa" w:w="160"/>
             </w:tcMar>
           </w:tcPr>
           <w:p>
@@ -5675,10 +5688,10 @@
               <w:right w:val="single" w:color="D2D2D7" w:sz="1"/>
             </w:tcBorders>
             <w:tcMar>
-              <w:top w:type="dxa" w:w="80"/>
-              <w:left w:type="dxa" w:w="120"/>
-              <w:bottom w:type="dxa" w:w="80"/>
-              <w:right w:type="dxa" w:w="120"/>
+              <w:top w:type="dxa" w:w="100"/>
+              <w:left w:type="dxa" w:w="160"/>
+              <w:bottom w:type="dxa" w:w="100"/>
+              <w:right w:type="dxa" w:w="160"/>
             </w:tcMar>
           </w:tcPr>
           <w:p>
@@ -5708,10 +5721,10 @@
               <w:right w:val="single" w:color="D2D2D7" w:sz="1"/>
             </w:tcBorders>
             <w:tcMar>
-              <w:top w:type="dxa" w:w="80"/>
-              <w:left w:type="dxa" w:w="120"/>
-              <w:bottom w:type="dxa" w:w="80"/>
-              <w:right w:type="dxa" w:w="120"/>
+              <w:top w:type="dxa" w:w="100"/>
+              <w:left w:type="dxa" w:w="160"/>
+              <w:bottom w:type="dxa" w:w="100"/>
+              <w:right w:type="dxa" w:w="160"/>
             </w:tcMar>
           </w:tcPr>
           <w:p>
@@ -5743,10 +5756,10 @@
               <w:right w:val="single" w:color="D2D2D7" w:sz="1"/>
             </w:tcBorders>
             <w:tcMar>
-              <w:top w:type="dxa" w:w="80"/>
-              <w:left w:type="dxa" w:w="120"/>
-              <w:bottom w:type="dxa" w:w="80"/>
-              <w:right w:type="dxa" w:w="120"/>
+              <w:top w:type="dxa" w:w="100"/>
+              <w:left w:type="dxa" w:w="160"/>
+              <w:bottom w:type="dxa" w:w="100"/>
+              <w:right w:type="dxa" w:w="160"/>
             </w:tcMar>
           </w:tcPr>
           <w:p>
@@ -5776,10 +5789,10 @@
               <w:right w:val="single" w:color="D2D2D7" w:sz="1"/>
             </w:tcBorders>
             <w:tcMar>
-              <w:top w:type="dxa" w:w="80"/>
-              <w:left w:type="dxa" w:w="120"/>
-              <w:bottom w:type="dxa" w:w="80"/>
-              <w:right w:type="dxa" w:w="120"/>
+              <w:top w:type="dxa" w:w="100"/>
+              <w:left w:type="dxa" w:w="160"/>
+              <w:bottom w:type="dxa" w:w="100"/>
+              <w:right w:type="dxa" w:w="160"/>
             </w:tcMar>
           </w:tcPr>
           <w:p>
@@ -5811,10 +5824,10 @@
               <w:right w:val="single" w:color="D2D2D7" w:sz="1"/>
             </w:tcBorders>
             <w:tcMar>
-              <w:top w:type="dxa" w:w="80"/>
-              <w:left w:type="dxa" w:w="120"/>
-              <w:bottom w:type="dxa" w:w="80"/>
-              <w:right w:type="dxa" w:w="120"/>
+              <w:top w:type="dxa" w:w="100"/>
+              <w:left w:type="dxa" w:w="160"/>
+              <w:bottom w:type="dxa" w:w="100"/>
+              <w:right w:type="dxa" w:w="160"/>
             </w:tcMar>
           </w:tcPr>
           <w:p>
@@ -5844,10 +5857,10 @@
               <w:right w:val="single" w:color="D2D2D7" w:sz="1"/>
             </w:tcBorders>
             <w:tcMar>
-              <w:top w:type="dxa" w:w="80"/>
-              <w:left w:type="dxa" w:w="120"/>
-              <w:bottom w:type="dxa" w:w="80"/>
-              <w:right w:type="dxa" w:w="120"/>
+              <w:top w:type="dxa" w:w="100"/>
+              <w:left w:type="dxa" w:w="160"/>
+              <w:bottom w:type="dxa" w:w="100"/>
+              <w:right w:type="dxa" w:w="160"/>
             </w:tcMar>
           </w:tcPr>
           <w:p>
@@ -5879,10 +5892,10 @@
               <w:right w:val="single" w:color="D2D2D7" w:sz="1"/>
             </w:tcBorders>
             <w:tcMar>
-              <w:top w:type="dxa" w:w="80"/>
-              <w:left w:type="dxa" w:w="120"/>
-              <w:bottom w:type="dxa" w:w="80"/>
-              <w:right w:type="dxa" w:w="120"/>
+              <w:top w:type="dxa" w:w="100"/>
+              <w:left w:type="dxa" w:w="160"/>
+              <w:bottom w:type="dxa" w:w="100"/>
+              <w:right w:type="dxa" w:w="160"/>
             </w:tcMar>
           </w:tcPr>
           <w:p>
@@ -5912,10 +5925,10 @@
               <w:right w:val="single" w:color="D2D2D7" w:sz="1"/>
             </w:tcBorders>
             <w:tcMar>
-              <w:top w:type="dxa" w:w="80"/>
-              <w:left w:type="dxa" w:w="120"/>
-              <w:bottom w:type="dxa" w:w="80"/>
-              <w:right w:type="dxa" w:w="120"/>
+              <w:top w:type="dxa" w:w="100"/>
+              <w:left w:type="dxa" w:w="160"/>
+              <w:bottom w:type="dxa" w:w="100"/>
+              <w:right w:type="dxa" w:w="160"/>
             </w:tcMar>
           </w:tcPr>
           <w:p>
@@ -5947,10 +5960,10 @@
               <w:right w:val="single" w:color="D2D2D7" w:sz="1"/>
             </w:tcBorders>
             <w:tcMar>
-              <w:top w:type="dxa" w:w="80"/>
-              <w:left w:type="dxa" w:w="120"/>
-              <w:bottom w:type="dxa" w:w="80"/>
-              <w:right w:type="dxa" w:w="120"/>
+              <w:top w:type="dxa" w:w="100"/>
+              <w:left w:type="dxa" w:w="160"/>
+              <w:bottom w:type="dxa" w:w="100"/>
+              <w:right w:type="dxa" w:w="160"/>
             </w:tcMar>
           </w:tcPr>
           <w:p>
@@ -5980,10 +5993,10 @@
               <w:right w:val="single" w:color="D2D2D7" w:sz="1"/>
             </w:tcBorders>
             <w:tcMar>
-              <w:top w:type="dxa" w:w="80"/>
-              <w:left w:type="dxa" w:w="120"/>
-              <w:bottom w:type="dxa" w:w="80"/>
-              <w:right w:type="dxa" w:w="120"/>
+              <w:top w:type="dxa" w:w="100"/>
+              <w:left w:type="dxa" w:w="160"/>
+              <w:bottom w:type="dxa" w:w="100"/>
+              <w:right w:type="dxa" w:w="160"/>
             </w:tcMar>
           </w:tcPr>
           <w:p>
@@ -6008,9 +6021,9 @@
     <w:p>
       <w:pPr>
         <w:pBdr>
-          <w:bottom w:val="single" w:color="0071E3" w:sz="6" w:space="1"/>
+          <w:bottom w:val="single" w:color="0071E3" w:sz="12" w:space="1"/>
         </w:pBdr>
-        <w:spacing w:after="200" w:before="200"/>
+        <w:spacing w:after="280" w:before="280"/>
       </w:pPr>
     </w:p>
     <w:p>
@@ -6027,7 +6040,7 @@
     </w:p>
     <w:p>
       <w:pPr>
-        <w:spacing w:after="120"/>
+        <w:spacing w:after="160"/>
       </w:pPr>
       <w:r>
         <w:rPr>
@@ -6073,10 +6086,10 @@
             </w:tcBorders>
             <w:shd w:fill="E8F0FF" w:val="clear"/>
             <w:tcMar>
-              <w:top w:type="dxa" w:w="80"/>
-              <w:left w:type="dxa" w:w="120"/>
-              <w:bottom w:type="dxa" w:w="80"/>
-              <w:right w:type="dxa" w:w="120"/>
+              <w:top w:type="dxa" w:w="100"/>
+              <w:left w:type="dxa" w:w="160"/>
+              <w:bottom w:type="dxa" w:w="100"/>
+              <w:right w:type="dxa" w:w="160"/>
             </w:tcMar>
           </w:tcPr>
           <w:p>
@@ -6107,10 +6120,10 @@
             </w:tcBorders>
             <w:shd w:fill="E8F0FF" w:val="clear"/>
             <w:tcMar>
-              <w:top w:type="dxa" w:w="80"/>
-              <w:left w:type="dxa" w:w="120"/>
-              <w:bottom w:type="dxa" w:w="80"/>
-              <w:right w:type="dxa" w:w="120"/>
+              <w:top w:type="dxa" w:w="100"/>
+              <w:left w:type="dxa" w:w="160"/>
+              <w:bottom w:type="dxa" w:w="100"/>
+              <w:right w:type="dxa" w:w="160"/>
             </w:tcMar>
           </w:tcPr>
           <w:p>
@@ -6141,10 +6154,10 @@
             </w:tcBorders>
             <w:shd w:fill="E8F0FF" w:val="clear"/>
             <w:tcMar>
-              <w:top w:type="dxa" w:w="80"/>
-              <w:left w:type="dxa" w:w="120"/>
-              <w:bottom w:type="dxa" w:w="80"/>
-              <w:right w:type="dxa" w:w="120"/>
+              <w:top w:type="dxa" w:w="100"/>
+              <w:left w:type="dxa" w:w="160"/>
+              <w:bottom w:type="dxa" w:w="100"/>
+              <w:right w:type="dxa" w:w="160"/>
             </w:tcMar>
           </w:tcPr>
           <w:p>
@@ -6176,10 +6189,10 @@
               <w:right w:val="single" w:color="D2D2D7" w:sz="1"/>
             </w:tcBorders>
             <w:tcMar>
-              <w:top w:type="dxa" w:w="80"/>
-              <w:left w:type="dxa" w:w="120"/>
-              <w:bottom w:type="dxa" w:w="80"/>
-              <w:right w:type="dxa" w:w="120"/>
+              <w:top w:type="dxa" w:w="100"/>
+              <w:left w:type="dxa" w:w="160"/>
+              <w:bottom w:type="dxa" w:w="100"/>
+              <w:right w:type="dxa" w:w="160"/>
             </w:tcMar>
           </w:tcPr>
           <w:p>
@@ -6209,10 +6222,10 @@
               <w:right w:val="single" w:color="D2D2D7" w:sz="1"/>
             </w:tcBorders>
             <w:tcMar>
-              <w:top w:type="dxa" w:w="80"/>
-              <w:left w:type="dxa" w:w="120"/>
-              <w:bottom w:type="dxa" w:w="80"/>
-              <w:right w:type="dxa" w:w="120"/>
+              <w:top w:type="dxa" w:w="100"/>
+              <w:left w:type="dxa" w:w="160"/>
+              <w:bottom w:type="dxa" w:w="100"/>
+              <w:right w:type="dxa" w:w="160"/>
             </w:tcMar>
           </w:tcPr>
           <w:p>
@@ -6242,10 +6255,10 @@
               <w:right w:val="single" w:color="D2D2D7" w:sz="1"/>
             </w:tcBorders>
             <w:tcMar>
-              <w:top w:type="dxa" w:w="80"/>
-              <w:left w:type="dxa" w:w="120"/>
-              <w:bottom w:type="dxa" w:w="80"/>
-              <w:right w:type="dxa" w:w="120"/>
+              <w:top w:type="dxa" w:w="100"/>
+              <w:left w:type="dxa" w:w="160"/>
+              <w:bottom w:type="dxa" w:w="100"/>
+              <w:right w:type="dxa" w:w="160"/>
             </w:tcMar>
           </w:tcPr>
           <w:p>
@@ -6277,10 +6290,10 @@
               <w:right w:val="single" w:color="D2D2D7" w:sz="1"/>
             </w:tcBorders>
             <w:tcMar>
-              <w:top w:type="dxa" w:w="80"/>
-              <w:left w:type="dxa" w:w="120"/>
-              <w:bottom w:type="dxa" w:w="80"/>
-              <w:right w:type="dxa" w:w="120"/>
+              <w:top w:type="dxa" w:w="100"/>
+              <w:left w:type="dxa" w:w="160"/>
+              <w:bottom w:type="dxa" w:w="100"/>
+              <w:right w:type="dxa" w:w="160"/>
             </w:tcMar>
           </w:tcPr>
           <w:p>
@@ -6310,10 +6323,10 @@
               <w:right w:val="single" w:color="D2D2D7" w:sz="1"/>
             </w:tcBorders>
             <w:tcMar>
-              <w:top w:type="dxa" w:w="80"/>
-              <w:left w:type="dxa" w:w="120"/>
-              <w:bottom w:type="dxa" w:w="80"/>
-              <w:right w:type="dxa" w:w="120"/>
+              <w:top w:type="dxa" w:w="100"/>
+              <w:left w:type="dxa" w:w="160"/>
+              <w:bottom w:type="dxa" w:w="100"/>
+              <w:right w:type="dxa" w:w="160"/>
             </w:tcMar>
           </w:tcPr>
           <w:p>
@@ -6343,10 +6356,10 @@
               <w:right w:val="single" w:color="D2D2D7" w:sz="1"/>
             </w:tcBorders>
             <w:tcMar>
-              <w:top w:type="dxa" w:w="80"/>
-              <w:left w:type="dxa" w:w="120"/>
-              <w:bottom w:type="dxa" w:w="80"/>
-              <w:right w:type="dxa" w:w="120"/>
+              <w:top w:type="dxa" w:w="100"/>
+              <w:left w:type="dxa" w:w="160"/>
+              <w:bottom w:type="dxa" w:w="100"/>
+              <w:right w:type="dxa" w:w="160"/>
             </w:tcMar>
           </w:tcPr>
           <w:p>
@@ -6378,10 +6391,10 @@
               <w:right w:val="single" w:color="D2D2D7" w:sz="1"/>
             </w:tcBorders>
             <w:tcMar>
-              <w:top w:type="dxa" w:w="80"/>
-              <w:left w:type="dxa" w:w="120"/>
-              <w:bottom w:type="dxa" w:w="80"/>
-              <w:right w:type="dxa" w:w="120"/>
+              <w:top w:type="dxa" w:w="100"/>
+              <w:left w:type="dxa" w:w="160"/>
+              <w:bottom w:type="dxa" w:w="100"/>
+              <w:right w:type="dxa" w:w="160"/>
             </w:tcMar>
           </w:tcPr>
           <w:p>
@@ -6411,10 +6424,10 @@
               <w:right w:val="single" w:color="D2D2D7" w:sz="1"/>
             </w:tcBorders>
             <w:tcMar>
-              <w:top w:type="dxa" w:w="80"/>
-              <w:left w:type="dxa" w:w="120"/>
-              <w:bottom w:type="dxa" w:w="80"/>
-              <w:right w:type="dxa" w:w="120"/>
+              <w:top w:type="dxa" w:w="100"/>
+              <w:left w:type="dxa" w:w="160"/>
+              <w:bottom w:type="dxa" w:w="100"/>
+              <w:right w:type="dxa" w:w="160"/>
             </w:tcMar>
           </w:tcPr>
           <w:p>
@@ -6444,10 +6457,10 @@
               <w:right w:val="single" w:color="D2D2D7" w:sz="1"/>
             </w:tcBorders>
             <w:tcMar>
-              <w:top w:type="dxa" w:w="80"/>
-              <w:left w:type="dxa" w:w="120"/>
-              <w:bottom w:type="dxa" w:w="80"/>
-              <w:right w:type="dxa" w:w="120"/>
+              <w:top w:type="dxa" w:w="100"/>
+              <w:left w:type="dxa" w:w="160"/>
+              <w:bottom w:type="dxa" w:w="100"/>
+              <w:right w:type="dxa" w:w="160"/>
             </w:tcMar>
           </w:tcPr>
           <w:p>
@@ -6479,10 +6492,10 @@
               <w:right w:val="single" w:color="D2D2D7" w:sz="1"/>
             </w:tcBorders>
             <w:tcMar>
-              <w:top w:type="dxa" w:w="80"/>
-              <w:left w:type="dxa" w:w="120"/>
-              <w:bottom w:type="dxa" w:w="80"/>
-              <w:right w:type="dxa" w:w="120"/>
+              <w:top w:type="dxa" w:w="100"/>
+              <w:left w:type="dxa" w:w="160"/>
+              <w:bottom w:type="dxa" w:w="100"/>
+              <w:right w:type="dxa" w:w="160"/>
             </w:tcMar>
           </w:tcPr>
           <w:p>
@@ -6512,10 +6525,10 @@
               <w:right w:val="single" w:color="D2D2D7" w:sz="1"/>
             </w:tcBorders>
             <w:tcMar>
-              <w:top w:type="dxa" w:w="80"/>
-              <w:left w:type="dxa" w:w="120"/>
-              <w:bottom w:type="dxa" w:w="80"/>
-              <w:right w:type="dxa" w:w="120"/>
+              <w:top w:type="dxa" w:w="100"/>
+              <w:left w:type="dxa" w:w="160"/>
+              <w:bottom w:type="dxa" w:w="100"/>
+              <w:right w:type="dxa" w:w="160"/>
             </w:tcMar>
           </w:tcPr>
           <w:p>
@@ -6545,10 +6558,10 @@
               <w:right w:val="single" w:color="D2D2D7" w:sz="1"/>
             </w:tcBorders>
             <w:tcMar>
-              <w:top w:type="dxa" w:w="80"/>
-              <w:left w:type="dxa" w:w="120"/>
-              <w:bottom w:type="dxa" w:w="80"/>
-              <w:right w:type="dxa" w:w="120"/>
+              <w:top w:type="dxa" w:w="100"/>
+              <w:left w:type="dxa" w:w="160"/>
+              <w:bottom w:type="dxa" w:w="100"/>
+              <w:right w:type="dxa" w:w="160"/>
             </w:tcMar>
           </w:tcPr>
           <w:p>
@@ -6573,9 +6586,9 @@
     <w:p>
       <w:pPr>
         <w:pBdr>
-          <w:bottom w:val="single" w:color="0071E3" w:sz="6" w:space="1"/>
+          <w:bottom w:val="single" w:color="0071E3" w:sz="12" w:space="1"/>
         </w:pBdr>
-        <w:spacing w:after="200" w:before="200"/>
+        <w:spacing w:after="280" w:before="280"/>
       </w:pPr>
     </w:p>
     <w:p>
@@ -6609,7 +6622,7 @@
           <w:ilvl w:val="0"/>
           <w:numId w:val="3"/>
         </w:numPr>
-        <w:spacing w:after="60"/>
+        <w:spacing w:after="80"/>
       </w:pPr>
       <w:r>
         <w:rPr>
@@ -6627,7 +6640,7 @@
           <w:ilvl w:val="0"/>
           <w:numId w:val="3"/>
         </w:numPr>
-        <w:spacing w:after="60"/>
+        <w:spacing w:after="80"/>
       </w:pPr>
       <w:r>
         <w:rPr>
@@ -6645,7 +6658,7 @@
           <w:ilvl w:val="0"/>
           <w:numId w:val="3"/>
         </w:numPr>
-        <w:spacing w:after="60"/>
+        <w:spacing w:after="80"/>
       </w:pPr>
       <w:r>
         <w:rPr>
@@ -6663,7 +6676,7 @@
           <w:ilvl w:val="0"/>
           <w:numId w:val="3"/>
         </w:numPr>
-        <w:spacing w:after="60"/>
+        <w:spacing w:after="80"/>
       </w:pPr>
       <w:r>
         <w:rPr>
@@ -6698,7 +6711,7 @@
           <w:ilvl w:val="0"/>
           <w:numId w:val="2"/>
         </w:numPr>
-        <w:spacing w:after="80"/>
+        <w:spacing w:after="100"/>
       </w:pPr>
       <w:r>
         <w:rPr>
@@ -6716,7 +6729,7 @@
           <w:ilvl w:val="0"/>
           <w:numId w:val="2"/>
         </w:numPr>
-        <w:spacing w:after="80"/>
+        <w:spacing w:after="100"/>
       </w:pPr>
       <w:r>
         <w:rPr>
@@ -6734,7 +6747,7 @@
           <w:ilvl w:val="0"/>
           <w:numId w:val="2"/>
         </w:numPr>
-        <w:spacing w:after="80"/>
+        <w:spacing w:after="100"/>
       </w:pPr>
       <w:r>
         <w:rPr>
@@ -6752,7 +6765,7 @@
           <w:ilvl w:val="0"/>
           <w:numId w:val="2"/>
         </w:numPr>
-        <w:spacing w:after="80"/>
+        <w:spacing w:after="100"/>
       </w:pPr>
       <w:r>
         <w:rPr>
@@ -6770,7 +6783,7 @@
           <w:ilvl w:val="0"/>
           <w:numId w:val="2"/>
         </w:numPr>
-        <w:spacing w:after="80"/>
+        <w:spacing w:after="100"/>
       </w:pPr>
       <w:r>
         <w:rPr>
@@ -6788,7 +6801,7 @@
     </w:p>
     <w:p>
       <w:pPr>
-        <w:spacing w:after="120"/>
+        <w:spacing w:after="160"/>
       </w:pPr>
       <w:r>
         <w:rPr>
@@ -7093,8 +7106,8 @@
     <w:rPrDefault>
       <w:rPr>
         <w:rFonts w:ascii="Arial" w:cs="Arial" w:eastAsia="Arial" w:hAnsi="Arial"/>
-        <w:sz w:val="24"/>
-        <w:szCs w:val="24"/>
+        <w:sz w:val="22"/>
+        <w:szCs w:val="22"/>
       </w:rPr>
     </w:rPrDefault>
     <w:pPrDefault/>
@@ -7276,15 +7289,15 @@
     <w:next w:val="Normal"/>
     <w:qFormat/>
     <w:pPr>
-      <w:spacing w:after="200" w:before="360"/>
+      <w:spacing w:after="280" w:before="480"/>
     </w:pPr>
     <w:rPr>
       <w:rFonts w:ascii="Arial" w:cs="Arial" w:eastAsia="Arial" w:hAnsi="Arial"/>
       <w:b/>
       <w:bCs/>
       <w:color w:val="1D1D1F"/>
-      <w:sz w:val="36"/>
-      <w:szCs w:val="36"/>
+      <w:sz w:val="44"/>
+      <w:szCs w:val="44"/>
     </w:rPr>
   </w:style>
   <w:style w:type="paragraph" w:styleId="Heading2">
@@ -7293,15 +7306,15 @@
     <w:next w:val="Normal"/>
     <w:qFormat/>
     <w:pPr>
-      <w:spacing w:after="160" w:before="280"/>
+      <w:spacing w:after="200" w:before="360"/>
     </w:pPr>
     <w:rPr>
       <w:rFonts w:ascii="Arial" w:cs="Arial" w:eastAsia="Arial" w:hAnsi="Arial"/>
       <w:b/>
       <w:bCs/>
       <w:color w:val="0071E3"/>
-      <w:sz w:val="28"/>
-      <w:szCs w:val="28"/>
+      <w:sz w:val="32"/>
+      <w:szCs w:val="32"/>
     </w:rPr>
   </w:style>
   <w:style w:type="paragraph" w:styleId="Heading3">
@@ -7310,15 +7323,15 @@
     <w:next w:val="Normal"/>
     <w:qFormat/>
     <w:pPr>
-      <w:spacing w:after="120" w:before="200"/>
+      <w:spacing w:after="120" w:before="240"/>
     </w:pPr>
     <w:rPr>
       <w:rFonts w:ascii="Arial" w:cs="Arial" w:eastAsia="Arial" w:hAnsi="Arial"/>
       <w:b/>
       <w:bCs/>
       <w:color w:val="1D1D1F"/>
-      <w:sz w:val="24"/>
-      <w:szCs w:val="24"/>
+      <w:sz w:val="26"/>
+      <w:szCs w:val="26"/>
     </w:rPr>
   </w:style>
 </w:styles>

</xml_diff>